<commit_message>
Agrega el registro provisorio, el nombre del paquete y la consulta de causas en IURE.
Una causa puede cargarse sin expediente y completarse después. El zip lleva número, año, nombre y apellido, y EV. IURE aporta las dependencias del usuario y el expediente de la dependencia habilitada.

Co-authored-by: Cursor <cursoragent@cursor.com>
</commit_message>
<xml_diff>
--- a/docs/Manual-de-uso-SIGEVED.docx
+++ b/docs/Manual-de-uso-SIGEVED.docx
@@ -1191,44 +1191,6 @@
       </w:pPr>
       <w:r>
         <w:rPr/>
-        <w:drawing>
-          <wp:inline distT="0" distB="0" distL="0" distR="0">
-            <wp:extent cx="5358130" cy="3524885"/>
-            <wp:effectExtent l="0" t="0" r="0" b="0"/>
-            <wp:docPr id="13" name="Imagen13"/>
-            <wp:cNvGraphicFramePr>
-              <a:graphicFrameLocks xmlns:a="http://schemas.openxmlformats.org/drawingml/2006/main" noChangeAspect="1"/>
-            </wp:cNvGraphicFramePr>
-            <a:graphic xmlns:a="http://schemas.openxmlformats.org/drawingml/2006/main">
-              <a:graphicData uri="http://schemas.openxmlformats.org/drawingml/2006/picture">
-                <pic:pic xmlns:pic="http://schemas.openxmlformats.org/drawingml/2006/picture">
-                  <pic:nvPicPr>
-                    <pic:cNvPr id="13" name="Imagen13"/>
-                    <pic:cNvPicPr>
-                      <a:picLocks noChangeAspect="1" noChangeArrowheads="1"/>
-                    </pic:cNvPicPr>
-                  </pic:nvPicPr>
-                  <pic:blipFill>
-                    <a:blip r:embed="rId14"/>
-                    <a:stretch>
-                      <a:fillRect/>
-                    </a:stretch>
-                  </pic:blipFill>
-                  <pic:spPr bwMode="auto">
-                    <a:xfrm>
-                      <a:off x="0" y="0"/>
-                      <a:ext cx="5358130" cy="3524885"/>
-                    </a:xfrm>
-                    <a:prstGeom prst="rect">
-                      <a:avLst/>
-                    </a:prstGeom>
-                    <a:noFill/>
-                  </pic:spPr>
-                </pic:pic>
-              </a:graphicData>
-            </a:graphic>
-          </wp:inline>
-        </w:drawing>
       </w:r>
     </w:p>
     <w:p>
@@ -1277,139 +1239,8 @@
       </w:pPr>
       <w:r>
         <w:rPr/>
-      </w:r>
-    </w:p>
-    <w:p>
-      <w:pPr>
-        <w:pStyle w:val="Normal"/>
-        <w:rPr>
-          <w:highlight w:val="none"/>
-        </w:rPr>
-      </w:pPr>
-      <w:r>
-        <w:rPr/>
-      </w:r>
-    </w:p>
-    <w:p>
-      <w:pPr>
-        <w:pStyle w:val="Normal"/>
-        <w:rPr>
-          <w:highlight w:val="none"/>
-        </w:rPr>
-      </w:pPr>
-      <w:r>
-        <w:rPr/>
-      </w:r>
-    </w:p>
-    <w:p>
-      <w:pPr>
-        <w:pStyle w:val="Normal"/>
-        <w:rPr>
-          <w:highlight w:val="none"/>
-        </w:rPr>
-      </w:pPr>
-      <w:r>
-        <w:rPr/>
-      </w:r>
-    </w:p>
-    <w:p>
-      <w:pPr>
-        <w:pStyle w:val="Normal"/>
-        <w:rPr>
-          <w:sz w:val="18"/>
-          <w:szCs w:val="18"/>
-          <w:highlight w:val="none"/>
-        </w:rPr>
-      </w:pPr>
-      <w:r>
-        <w:rPr>
-          <w:sz w:val="18"/>
-          <w:szCs w:val="18"/>
-          <w:lang w:val="es-AR"/>
-        </w:rPr>
-        <w:t>Modelo de acta de consentimiento del aportante.</w:t>
-      </w:r>
-    </w:p>
-    <w:p>
-      <w:pPr>
-        <w:pStyle w:val="Normal"/>
-        <w:rPr>
-          <w:highlight w:val="none"/>
-        </w:rPr>
-      </w:pPr>
-      <w:r>
-        <w:rPr/>
-      </w:r>
-    </w:p>
-    <w:p>
-      <w:pPr>
-        <w:pStyle w:val="Normal"/>
-        <w:rPr>
-          <w:sz w:val="22"/>
-          <w:szCs w:val="22"/>
-          <w:highlight w:val="none"/>
-          <w:lang w:val="es-AR"/>
-        </w:rPr>
-      </w:pPr>
-      <w:r>
-        <w:rPr>
-          <w:sz w:val="22"/>
-          <w:szCs w:val="22"/>
-          <w:lang w:val="es-AR"/>
-        </w:rPr>
-        <w:t>Una vez finalizada la carga y firma del acta de consentimiento, pasamos al procedimiento de extracción propiamente dicho.</w:t>
-      </w:r>
-    </w:p>
-    <w:p>
-      <w:pPr>
-        <w:pStyle w:val="Normal"/>
-        <w:rPr>
-          <w:highlight w:val="none"/>
-          <w:lang w:val="es-AR"/>
-        </w:rPr>
-      </w:pPr>
-      <w:r>
-        <w:rPr>
-          <w:lang w:val="es-AR"/>
-        </w:rPr>
-        <w:t>Continuando con el procedimiento, vemos la sección donde observamos los datos del dispositivo conectado. Antes de continuar, vamos a explicar como se debe activar el modo “Desarrollador”, y la “Depuración USB”, que permite la lectura fisica del dispositivo desde el sistema instalado en la PC operadora.</w:t>
-      </w:r>
-    </w:p>
-    <w:p>
-      <w:pPr>
-        <w:pStyle w:val="Normal"/>
-        <w:rPr>
-          <w:color w:val="auto"/>
-          <w:highlight w:val="none"/>
-        </w:rPr>
-      </w:pPr>
-      <w:r>
-        <w:rPr>
-          <w:color w:val="auto"/>
-        </w:rPr>
-      </w:r>
-    </w:p>
-    <w:p>
-      <w:pPr>
-        <w:pStyle w:val="Normal"/>
-        <w:rPr>
-          <w:color w:val="auto"/>
-          <w:sz w:val="24"/>
-          <w:szCs w:val="24"/>
-          <w:highlight w:val="none"/>
-        </w:rPr>
-      </w:pPr>
-      <w:r>
-        <w:rPr>
-          <w:b/>
-          <w:bCs/>
-          <w:color w:val="auto"/>
-          <w:sz w:val="24"/>
-          <w:szCs w:val="24"/>
-          <w:lang w:val="es-AR"/>
-        </w:rPr>
         <w:drawing>
-          <wp:anchor distT="0" distB="0" distL="0" distR="0" simplePos="0" relativeHeight="61" behindDoc="0" locked="0" layoutInCell="0" allowOverlap="1">
+          <wp:anchor distT="0" distB="0" distL="0" distR="0" simplePos="0" relativeHeight="60" behindDoc="0" locked="0" layoutInCell="0" allowOverlap="1">
             <wp:simplePos x="0" y="0"/>
             <wp:positionH relativeFrom="column">
               <wp:posOffset>0</wp:posOffset>
@@ -1420,7 +1251,7 @@
             <wp:extent cx="5940425" cy="6301105"/>
             <wp:effectExtent l="0" t="0" r="0" b="0"/>
             <wp:wrapSquare wrapText="largest"/>
-            <wp:docPr id="14" name="Imagen14"/>
+            <wp:docPr id="13" name="Imagen14"/>
             <wp:cNvGraphicFramePr>
               <a:graphicFrameLocks xmlns:a="http://schemas.openxmlformats.org/drawingml/2006/main" noChangeAspect="1"/>
             </wp:cNvGraphicFramePr>
@@ -1428,13 +1259,13 @@
               <a:graphicData uri="http://schemas.openxmlformats.org/drawingml/2006/picture">
                 <pic:pic xmlns:pic="http://schemas.openxmlformats.org/drawingml/2006/picture">
                   <pic:nvPicPr>
-                    <pic:cNvPr id="14" name="Imagen14"/>
+                    <pic:cNvPr id="13" name="Imagen14"/>
                     <pic:cNvPicPr>
                       <a:picLocks noChangeAspect="1" noChangeArrowheads="1"/>
                     </pic:cNvPicPr>
                   </pic:nvPicPr>
                   <pic:blipFill>
-                    <a:blip r:embed="rId15"/>
+                    <a:blip r:embed="rId14"/>
                     <a:stretch>
                       <a:fillRect/>
                     </a:stretch>
@@ -1460,6 +1291,85 @@
       <w:pPr>
         <w:pStyle w:val="Normal"/>
         <w:rPr>
+          <w:sz w:val="18"/>
+          <w:szCs w:val="18"/>
+          <w:highlight w:val="none"/>
+        </w:rPr>
+      </w:pPr>
+      <w:r>
+        <w:rPr>
+          <w:sz w:val="18"/>
+          <w:szCs w:val="18"/>
+          <w:lang w:val="es-AR"/>
+        </w:rPr>
+        <w:t>Modelo de acta de consentimiento del aportante.</w:t>
+      </w:r>
+    </w:p>
+    <w:p>
+      <w:pPr>
+        <w:pStyle w:val="Normal"/>
+        <w:rPr>
+          <w:sz w:val="18"/>
+          <w:szCs w:val="18"/>
+          <w:highlight w:val="none"/>
+        </w:rPr>
+      </w:pPr>
+      <w:r>
+        <w:rPr/>
+      </w:r>
+    </w:p>
+    <w:p>
+      <w:pPr>
+        <w:pStyle w:val="Normal"/>
+        <w:rPr>
+          <w:sz w:val="22"/>
+          <w:szCs w:val="22"/>
+          <w:highlight w:val="none"/>
+          <w:lang w:val="es-AR"/>
+        </w:rPr>
+      </w:pPr>
+      <w:r>
+        <w:rPr>
+          <w:sz w:val="22"/>
+          <w:szCs w:val="22"/>
+          <w:lang w:val="es-AR"/>
+        </w:rPr>
+        <w:t>Una vez finalizada la carga y firma del acta de consentimiento, pasamos al procedimiento de extracción propiamente dicho.</w:t>
+      </w:r>
+    </w:p>
+    <w:p>
+      <w:pPr>
+        <w:pStyle w:val="Normal"/>
+        <w:rPr>
+          <w:highlight w:val="none"/>
+          <w:lang w:val="es-AR"/>
+        </w:rPr>
+      </w:pPr>
+      <w:r>
+        <w:rPr>
+          <w:lang w:val="es-AR"/>
+        </w:rPr>
+        <w:t>Continuando con el procedimiento, vemos la sección donde observamos los datos del dispositivo conectado. Antes de continuar, vamos a explicar como se debe activar el modo “Desarrollador”, y la “Depuración USB”, que permite la lectura fisica del dispositivo desde el sistema instalado en la PC operadora.</w:t>
+      </w:r>
+    </w:p>
+    <w:p>
+      <w:pPr>
+        <w:pStyle w:val="Normal"/>
+        <w:rPr>
+          <w:color w:val="auto"/>
+          <w:highlight w:val="none"/>
+        </w:rPr>
+      </w:pPr>
+      <w:r>
+        <w:rPr>
+          <w:color w:val="auto"/>
+        </w:rPr>
+      </w:r>
+    </w:p>
+    <w:p>
+      <w:pPr>
+        <w:pStyle w:val="Normal"/>
+        <w:rPr>
           <w:color w:val="auto"/>
           <w:sz w:val="24"/>
           <w:szCs w:val="24"/>
@@ -1541,7 +1451,7 @@
           <wp:inline distT="0" distB="0" distL="0" distR="0">
             <wp:extent cx="2976245" cy="6624955"/>
             <wp:effectExtent l="0" t="0" r="0" b="0"/>
-            <wp:docPr id="15" name="Imagen15"/>
+            <wp:docPr id="14" name="Imagen15"/>
             <wp:cNvGraphicFramePr>
               <a:graphicFrameLocks xmlns:a="http://schemas.openxmlformats.org/drawingml/2006/main" noChangeAspect="1"/>
             </wp:cNvGraphicFramePr>
@@ -1549,13 +1459,13 @@
               <a:graphicData uri="http://schemas.openxmlformats.org/drawingml/2006/picture">
                 <pic:pic xmlns:pic="http://schemas.openxmlformats.org/drawingml/2006/picture">
                   <pic:nvPicPr>
-                    <pic:cNvPr id="15" name="Imagen15"/>
+                    <pic:cNvPr id="14" name="Imagen15"/>
                     <pic:cNvPicPr>
                       <a:picLocks noChangeAspect="1" noChangeArrowheads="1"/>
                     </pic:cNvPicPr>
                   </pic:nvPicPr>
                   <pic:blipFill>
-                    <a:blip r:embed="rId16"/>
+                    <a:blip r:embed="rId15"/>
                     <a:stretch>
                       <a:fillRect/>
                     </a:stretch>
@@ -1623,7 +1533,7 @@
           <wp:inline distT="0" distB="0" distL="0" distR="0">
             <wp:extent cx="3357245" cy="7473315"/>
             <wp:effectExtent l="0" t="0" r="0" b="0"/>
-            <wp:docPr id="16" name="Imagen16"/>
+            <wp:docPr id="15" name="Imagen16"/>
             <wp:cNvGraphicFramePr>
               <a:graphicFrameLocks xmlns:a="http://schemas.openxmlformats.org/drawingml/2006/main" noChangeAspect="1"/>
             </wp:cNvGraphicFramePr>
@@ -1631,13 +1541,13 @@
               <a:graphicData uri="http://schemas.openxmlformats.org/drawingml/2006/picture">
                 <pic:pic xmlns:pic="http://schemas.openxmlformats.org/drawingml/2006/picture">
                   <pic:nvPicPr>
-                    <pic:cNvPr id="16" name="Imagen16"/>
+                    <pic:cNvPr id="15" name="Imagen16"/>
                     <pic:cNvPicPr>
                       <a:picLocks noChangeAspect="1" noChangeArrowheads="1"/>
                     </pic:cNvPicPr>
                   </pic:nvPicPr>
                   <pic:blipFill>
-                    <a:blip r:embed="rId17"/>
+                    <a:blip r:embed="rId16"/>
                     <a:stretch>
                       <a:fillRect/>
                     </a:stretch>
@@ -1732,7 +1642,7 @@
           <wp:inline distT="0" distB="0" distL="0" distR="0">
             <wp:extent cx="2981325" cy="6636385"/>
             <wp:effectExtent l="0" t="0" r="0" b="0"/>
-            <wp:docPr id="17" name="Imagen17"/>
+            <wp:docPr id="16" name="Imagen17"/>
             <wp:cNvGraphicFramePr>
               <a:graphicFrameLocks xmlns:a="http://schemas.openxmlformats.org/drawingml/2006/main" noChangeAspect="1"/>
             </wp:cNvGraphicFramePr>
@@ -1740,13 +1650,13 @@
               <a:graphicData uri="http://schemas.openxmlformats.org/drawingml/2006/picture">
                 <pic:pic xmlns:pic="http://schemas.openxmlformats.org/drawingml/2006/picture">
                   <pic:nvPicPr>
-                    <pic:cNvPr id="17" name="Imagen17"/>
+                    <pic:cNvPr id="16" name="Imagen17"/>
                     <pic:cNvPicPr>
                       <a:picLocks noChangeAspect="1" noChangeArrowheads="1"/>
                     </pic:cNvPicPr>
                   </pic:nvPicPr>
                   <pic:blipFill>
-                    <a:blip r:embed="rId18"/>
+                    <a:blip r:embed="rId17"/>
                     <a:stretch>
                       <a:fillRect/>
                     </a:stretch>
@@ -1814,7 +1724,7 @@
           <wp:inline distT="0" distB="0" distL="0" distR="0">
             <wp:extent cx="3205480" cy="7135495"/>
             <wp:effectExtent l="0" t="0" r="0" b="0"/>
-            <wp:docPr id="18" name="Imagen18"/>
+            <wp:docPr id="17" name="Imagen18"/>
             <wp:cNvGraphicFramePr>
               <a:graphicFrameLocks xmlns:a="http://schemas.openxmlformats.org/drawingml/2006/main" noChangeAspect="1"/>
             </wp:cNvGraphicFramePr>
@@ -1822,13 +1732,13 @@
               <a:graphicData uri="http://schemas.openxmlformats.org/drawingml/2006/picture">
                 <pic:pic xmlns:pic="http://schemas.openxmlformats.org/drawingml/2006/picture">
                   <pic:nvPicPr>
-                    <pic:cNvPr id="18" name="Imagen18"/>
+                    <pic:cNvPr id="17" name="Imagen18"/>
                     <pic:cNvPicPr>
                       <a:picLocks noChangeAspect="1" noChangeArrowheads="1"/>
                     </pic:cNvPicPr>
                   </pic:nvPicPr>
                   <pic:blipFill>
-                    <a:blip r:embed="rId19"/>
+                    <a:blip r:embed="rId18"/>
                     <a:stretch>
                       <a:fillRect/>
                     </a:stretch>
@@ -1896,7 +1806,7 @@
           <wp:inline distT="0" distB="0" distL="0" distR="0">
             <wp:extent cx="3778885" cy="8412480"/>
             <wp:effectExtent l="0" t="0" r="0" b="0"/>
-            <wp:docPr id="19" name="Imagen19"/>
+            <wp:docPr id="18" name="Imagen19"/>
             <wp:cNvGraphicFramePr>
               <a:graphicFrameLocks xmlns:a="http://schemas.openxmlformats.org/drawingml/2006/main" noChangeAspect="1"/>
             </wp:cNvGraphicFramePr>
@@ -1904,13 +1814,13 @@
               <a:graphicData uri="http://schemas.openxmlformats.org/drawingml/2006/picture">
                 <pic:pic xmlns:pic="http://schemas.openxmlformats.org/drawingml/2006/picture">
                   <pic:nvPicPr>
-                    <pic:cNvPr id="19" name="Imagen19"/>
+                    <pic:cNvPr id="18" name="Imagen19"/>
                     <pic:cNvPicPr>
                       <a:picLocks noChangeAspect="1" noChangeArrowheads="1"/>
                     </pic:cNvPicPr>
                   </pic:nvPicPr>
                   <pic:blipFill>
-                    <a:blip r:embed="rId20"/>
+                    <a:blip r:embed="rId19"/>
                     <a:stretch>
                       <a:fillRect/>
                     </a:stretch>
@@ -1978,7 +1888,7 @@
           <wp:inline distT="0" distB="0" distL="0" distR="0">
             <wp:extent cx="3632835" cy="8087995"/>
             <wp:effectExtent l="0" t="0" r="0" b="0"/>
-            <wp:docPr id="20" name="Imagen20"/>
+            <wp:docPr id="19" name="Imagen20"/>
             <wp:cNvGraphicFramePr>
               <a:graphicFrameLocks xmlns:a="http://schemas.openxmlformats.org/drawingml/2006/main" noChangeAspect="1"/>
             </wp:cNvGraphicFramePr>
@@ -1986,13 +1896,13 @@
               <a:graphicData uri="http://schemas.openxmlformats.org/drawingml/2006/picture">
                 <pic:pic xmlns:pic="http://schemas.openxmlformats.org/drawingml/2006/picture">
                   <pic:nvPicPr>
-                    <pic:cNvPr id="20" name="Imagen20"/>
+                    <pic:cNvPr id="19" name="Imagen20"/>
                     <pic:cNvPicPr>
                       <a:picLocks noChangeAspect="1" noChangeArrowheads="1"/>
                     </pic:cNvPicPr>
                   </pic:nvPicPr>
                   <pic:blipFill>
-                    <a:blip r:embed="rId21"/>
+                    <a:blip r:embed="rId20"/>
                     <a:stretch>
                       <a:fillRect/>
                     </a:stretch>
@@ -2060,7 +1970,7 @@
           <wp:inline distT="0" distB="0" distL="0" distR="0">
             <wp:extent cx="3493135" cy="7776210"/>
             <wp:effectExtent l="0" t="0" r="0" b="0"/>
-            <wp:docPr id="21" name="Imagen21"/>
+            <wp:docPr id="20" name="Imagen21"/>
             <wp:cNvGraphicFramePr>
               <a:graphicFrameLocks xmlns:a="http://schemas.openxmlformats.org/drawingml/2006/main" noChangeAspect="1"/>
             </wp:cNvGraphicFramePr>
@@ -2068,13 +1978,13 @@
               <a:graphicData uri="http://schemas.openxmlformats.org/drawingml/2006/picture">
                 <pic:pic xmlns:pic="http://schemas.openxmlformats.org/drawingml/2006/picture">
                   <pic:nvPicPr>
-                    <pic:cNvPr id="21" name="Imagen21"/>
+                    <pic:cNvPr id="20" name="Imagen21"/>
                     <pic:cNvPicPr>
                       <a:picLocks noChangeAspect="1" noChangeArrowheads="1"/>
                     </pic:cNvPicPr>
                   </pic:nvPicPr>
                   <pic:blipFill>
-                    <a:blip r:embed="rId22"/>
+                    <a:blip r:embed="rId21"/>
                     <a:stretch>
                       <a:fillRect/>
                     </a:stretch>
@@ -2142,7 +2052,7 @@
           <wp:inline distT="0" distB="0" distL="0" distR="0">
             <wp:extent cx="3316605" cy="7372350"/>
             <wp:effectExtent l="0" t="0" r="0" b="0"/>
-            <wp:docPr id="22" name="Imagen22"/>
+            <wp:docPr id="21" name="Imagen22"/>
             <wp:cNvGraphicFramePr>
               <a:graphicFrameLocks xmlns:a="http://schemas.openxmlformats.org/drawingml/2006/main" noChangeAspect="1"/>
             </wp:cNvGraphicFramePr>
@@ -2150,13 +2060,13 @@
               <a:graphicData uri="http://schemas.openxmlformats.org/drawingml/2006/picture">
                 <pic:pic xmlns:pic="http://schemas.openxmlformats.org/drawingml/2006/picture">
                   <pic:nvPicPr>
-                    <pic:cNvPr id="22" name="Imagen22"/>
+                    <pic:cNvPr id="21" name="Imagen22"/>
                     <pic:cNvPicPr>
                       <a:picLocks noChangeAspect="1" noChangeArrowheads="1"/>
                     </pic:cNvPicPr>
                   </pic:nvPicPr>
                   <pic:blipFill>
-                    <a:blip r:embed="rId23"/>
+                    <a:blip r:embed="rId22"/>
                     <a:stretch>
                       <a:fillRect/>
                     </a:stretch>
@@ -2252,7 +2162,7 @@
           <wp:inline distT="0" distB="0" distL="0" distR="0">
             <wp:extent cx="5940425" cy="1232535"/>
             <wp:effectExtent l="0" t="0" r="0" b="0"/>
-            <wp:docPr id="23" name="Imagen23"/>
+            <wp:docPr id="22" name="Imagen23"/>
             <wp:cNvGraphicFramePr>
               <a:graphicFrameLocks xmlns:a="http://schemas.openxmlformats.org/drawingml/2006/main" noChangeAspect="1"/>
             </wp:cNvGraphicFramePr>
@@ -2260,13 +2170,13 @@
               <a:graphicData uri="http://schemas.openxmlformats.org/drawingml/2006/picture">
                 <pic:pic xmlns:pic="http://schemas.openxmlformats.org/drawingml/2006/picture">
                   <pic:nvPicPr>
-                    <pic:cNvPr id="23" name="Imagen23"/>
+                    <pic:cNvPr id="22" name="Imagen23"/>
                     <pic:cNvPicPr>
                       <a:picLocks noChangeAspect="1" noChangeArrowheads="1"/>
                     </pic:cNvPicPr>
                   </pic:nvPicPr>
                   <pic:blipFill>
-                    <a:blip r:embed="rId24"/>
+                    <a:blip r:embed="rId23"/>
                     <a:stretch>
                       <a:fillRect/>
                     </a:stretch>
@@ -2324,7 +2234,7 @@
           <wp:inline distT="0" distB="0" distL="0" distR="0">
             <wp:extent cx="5562600" cy="762000"/>
             <wp:effectExtent l="0" t="0" r="0" b="0"/>
-            <wp:docPr id="24" name="Imagen24"/>
+            <wp:docPr id="23" name="Imagen24"/>
             <wp:cNvGraphicFramePr>
               <a:graphicFrameLocks xmlns:a="http://schemas.openxmlformats.org/drawingml/2006/main" noChangeAspect="1"/>
             </wp:cNvGraphicFramePr>
@@ -2332,13 +2242,13 @@
               <a:graphicData uri="http://schemas.openxmlformats.org/drawingml/2006/picture">
                 <pic:pic xmlns:pic="http://schemas.openxmlformats.org/drawingml/2006/picture">
                   <pic:nvPicPr>
-                    <pic:cNvPr id="24" name="Imagen24"/>
+                    <pic:cNvPr id="23" name="Imagen24"/>
                     <pic:cNvPicPr>
                       <a:picLocks noChangeAspect="1" noChangeArrowheads="1"/>
                     </pic:cNvPicPr>
                   </pic:nvPicPr>
                   <pic:blipFill>
-                    <a:blip r:embed="rId25"/>
+                    <a:blip r:embed="rId24"/>
                     <a:stretch>
                       <a:fillRect/>
                     </a:stretch>
@@ -2396,7 +2306,7 @@
           <wp:inline distT="0" distB="0" distL="0" distR="0">
             <wp:extent cx="5848350" cy="2447925"/>
             <wp:effectExtent l="0" t="0" r="0" b="0"/>
-            <wp:docPr id="25" name="Imagen25"/>
+            <wp:docPr id="24" name="Imagen25"/>
             <wp:cNvGraphicFramePr>
               <a:graphicFrameLocks xmlns:a="http://schemas.openxmlformats.org/drawingml/2006/main" noChangeAspect="1"/>
             </wp:cNvGraphicFramePr>
@@ -2404,13 +2314,13 @@
               <a:graphicData uri="http://schemas.openxmlformats.org/drawingml/2006/picture">
                 <pic:pic xmlns:pic="http://schemas.openxmlformats.org/drawingml/2006/picture">
                   <pic:nvPicPr>
-                    <pic:cNvPr id="25" name="Imagen25"/>
+                    <pic:cNvPr id="24" name="Imagen25"/>
                     <pic:cNvPicPr>
                       <a:picLocks noChangeAspect="1" noChangeArrowheads="1"/>
                     </pic:cNvPicPr>
                   </pic:nvPicPr>
                   <pic:blipFill>
-                    <a:blip r:embed="rId26"/>
+                    <a:blip r:embed="rId25"/>
                     <a:stretch>
                       <a:fillRect/>
                     </a:stretch>
@@ -2461,7 +2371,7 @@
           <wp:inline distT="0" distB="0" distL="0" distR="0">
             <wp:extent cx="2438400" cy="2057400"/>
             <wp:effectExtent l="0" t="0" r="0" b="0"/>
-            <wp:docPr id="26" name="Imagen26"/>
+            <wp:docPr id="25" name="Imagen26"/>
             <wp:cNvGraphicFramePr>
               <a:graphicFrameLocks xmlns:a="http://schemas.openxmlformats.org/drawingml/2006/main" noChangeAspect="1"/>
             </wp:cNvGraphicFramePr>
@@ -2469,13 +2379,13 @@
               <a:graphicData uri="http://schemas.openxmlformats.org/drawingml/2006/picture">
                 <pic:pic xmlns:pic="http://schemas.openxmlformats.org/drawingml/2006/picture">
                   <pic:nvPicPr>
-                    <pic:cNvPr id="26" name="Imagen26"/>
+                    <pic:cNvPr id="25" name="Imagen26"/>
                     <pic:cNvPicPr>
                       <a:picLocks noChangeAspect="1" noChangeArrowheads="1"/>
                     </pic:cNvPicPr>
                   </pic:nvPicPr>
                   <pic:blipFill>
-                    <a:blip r:embed="rId27"/>
+                    <a:blip r:embed="rId26"/>
                     <a:stretch>
                       <a:fillRect/>
                     </a:stretch>
@@ -2525,7 +2435,7 @@
           <wp:inline distT="0" distB="0" distL="0" distR="0">
             <wp:extent cx="5940425" cy="666750"/>
             <wp:effectExtent l="0" t="0" r="0" b="0"/>
-            <wp:docPr id="27" name="Imagen27"/>
+            <wp:docPr id="26" name="Imagen27"/>
             <wp:cNvGraphicFramePr>
               <a:graphicFrameLocks xmlns:a="http://schemas.openxmlformats.org/drawingml/2006/main" noChangeAspect="1"/>
             </wp:cNvGraphicFramePr>
@@ -2533,13 +2443,13 @@
               <a:graphicData uri="http://schemas.openxmlformats.org/drawingml/2006/picture">
                 <pic:pic xmlns:pic="http://schemas.openxmlformats.org/drawingml/2006/picture">
                   <pic:nvPicPr>
-                    <pic:cNvPr id="27" name="Imagen27"/>
+                    <pic:cNvPr id="26" name="Imagen27"/>
                     <pic:cNvPicPr>
                       <a:picLocks noChangeAspect="1" noChangeArrowheads="1"/>
                     </pic:cNvPicPr>
                   </pic:nvPicPr>
                   <pic:blipFill>
-                    <a:blip r:embed="rId28"/>
+                    <a:blip r:embed="rId27"/>
                     <a:stretch>
                       <a:fillRect/>
                     </a:stretch>
@@ -2589,7 +2499,7 @@
           <wp:inline distT="0" distB="0" distL="0" distR="0">
             <wp:extent cx="5940425" cy="431165"/>
             <wp:effectExtent l="0" t="0" r="0" b="0"/>
-            <wp:docPr id="28" name="Imagen28"/>
+            <wp:docPr id="27" name="Imagen28"/>
             <wp:cNvGraphicFramePr>
               <a:graphicFrameLocks xmlns:a="http://schemas.openxmlformats.org/drawingml/2006/main" noChangeAspect="1"/>
             </wp:cNvGraphicFramePr>
@@ -2597,13 +2507,13 @@
               <a:graphicData uri="http://schemas.openxmlformats.org/drawingml/2006/picture">
                 <pic:pic xmlns:pic="http://schemas.openxmlformats.org/drawingml/2006/picture">
                   <pic:nvPicPr>
-                    <pic:cNvPr id="28" name="Imagen28"/>
+                    <pic:cNvPr id="27" name="Imagen28"/>
                     <pic:cNvPicPr>
                       <a:picLocks noChangeAspect="1" noChangeArrowheads="1"/>
                     </pic:cNvPicPr>
                   </pic:nvPicPr>
                   <pic:blipFill>
-                    <a:blip r:embed="rId29"/>
+                    <a:blip r:embed="rId28"/>
                     <a:stretch>
                       <a:fillRect/>
                     </a:stretch>
@@ -2738,7 +2648,7 @@
           <wp:inline distT="0" distB="0" distL="0" distR="0">
             <wp:extent cx="5940425" cy="751205"/>
             <wp:effectExtent l="0" t="0" r="0" b="0"/>
-            <wp:docPr id="29" name="Imagen29"/>
+            <wp:docPr id="28" name="Imagen29"/>
             <wp:cNvGraphicFramePr>
               <a:graphicFrameLocks xmlns:a="http://schemas.openxmlformats.org/drawingml/2006/main" noChangeAspect="1"/>
             </wp:cNvGraphicFramePr>
@@ -2746,13 +2656,13 @@
               <a:graphicData uri="http://schemas.openxmlformats.org/drawingml/2006/picture">
                 <pic:pic xmlns:pic="http://schemas.openxmlformats.org/drawingml/2006/picture">
                   <pic:nvPicPr>
-                    <pic:cNvPr id="29" name="Imagen29"/>
+                    <pic:cNvPr id="28" name="Imagen29"/>
                     <pic:cNvPicPr>
                       <a:picLocks noChangeAspect="1" noChangeArrowheads="1"/>
                     </pic:cNvPicPr>
                   </pic:nvPicPr>
                   <pic:blipFill>
-                    <a:blip r:embed="rId30"/>
+                    <a:blip r:embed="rId29"/>
                     <a:stretch>
                       <a:fillRect/>
                     </a:stretch>
@@ -2802,7 +2712,7 @@
           <wp:inline distT="0" distB="0" distL="0" distR="0">
             <wp:extent cx="5940425" cy="1558290"/>
             <wp:effectExtent l="0" t="0" r="0" b="0"/>
-            <wp:docPr id="30" name="Imagen30"/>
+            <wp:docPr id="29" name="Imagen30"/>
             <wp:cNvGraphicFramePr>
               <a:graphicFrameLocks xmlns:a="http://schemas.openxmlformats.org/drawingml/2006/main" noChangeAspect="1"/>
             </wp:cNvGraphicFramePr>
@@ -2810,13 +2720,13 @@
               <a:graphicData uri="http://schemas.openxmlformats.org/drawingml/2006/picture">
                 <pic:pic xmlns:pic="http://schemas.openxmlformats.org/drawingml/2006/picture">
                   <pic:nvPicPr>
-                    <pic:cNvPr id="30" name="Imagen30"/>
+                    <pic:cNvPr id="29" name="Imagen30"/>
                     <pic:cNvPicPr>
                       <a:picLocks noChangeAspect="1" noChangeArrowheads="1"/>
                     </pic:cNvPicPr>
                   </pic:nvPicPr>
                   <pic:blipFill>
-                    <a:blip r:embed="rId31"/>
+                    <a:blip r:embed="rId30"/>
                     <a:stretch>
                       <a:fillRect/>
                     </a:stretch>
@@ -2867,7 +2777,7 @@
           <wp:inline distT="0" distB="0" distL="0" distR="0">
             <wp:extent cx="4933950" cy="4229100"/>
             <wp:effectExtent l="0" t="0" r="0" b="0"/>
-            <wp:docPr id="31" name="Imagen31"/>
+            <wp:docPr id="30" name="Imagen31"/>
             <wp:cNvGraphicFramePr>
               <a:graphicFrameLocks xmlns:a="http://schemas.openxmlformats.org/drawingml/2006/main" noChangeAspect="1"/>
             </wp:cNvGraphicFramePr>
@@ -2875,13 +2785,13 @@
               <a:graphicData uri="http://schemas.openxmlformats.org/drawingml/2006/picture">
                 <pic:pic xmlns:pic="http://schemas.openxmlformats.org/drawingml/2006/picture">
                   <pic:nvPicPr>
-                    <pic:cNvPr id="31" name="Imagen31"/>
+                    <pic:cNvPr id="30" name="Imagen31"/>
                     <pic:cNvPicPr>
                       <a:picLocks noChangeAspect="1" noChangeArrowheads="1"/>
                     </pic:cNvPicPr>
                   </pic:nvPicPr>
                   <pic:blipFill>
-                    <a:blip r:embed="rId32"/>
+                    <a:blip r:embed="rId31"/>
                     <a:stretch>
                       <a:fillRect/>
                     </a:stretch>
@@ -2931,7 +2841,7 @@
           <wp:inline distT="0" distB="0" distL="0" distR="0">
             <wp:extent cx="1809750" cy="1876425"/>
             <wp:effectExtent l="0" t="0" r="0" b="0"/>
-            <wp:docPr id="32" name="Imagen32"/>
+            <wp:docPr id="31" name="Imagen32"/>
             <wp:cNvGraphicFramePr>
               <a:graphicFrameLocks xmlns:a="http://schemas.openxmlformats.org/drawingml/2006/main" noChangeAspect="1"/>
             </wp:cNvGraphicFramePr>
@@ -2939,13 +2849,13 @@
               <a:graphicData uri="http://schemas.openxmlformats.org/drawingml/2006/picture">
                 <pic:pic xmlns:pic="http://schemas.openxmlformats.org/drawingml/2006/picture">
                   <pic:nvPicPr>
-                    <pic:cNvPr id="32" name="Imagen32"/>
+                    <pic:cNvPr id="31" name="Imagen32"/>
                     <pic:cNvPicPr>
                       <a:picLocks noChangeAspect="1" noChangeArrowheads="1"/>
                     </pic:cNvPicPr>
                   </pic:nvPicPr>
                   <pic:blipFill>
-                    <a:blip r:embed="rId33"/>
+                    <a:blip r:embed="rId32"/>
                     <a:stretch>
                       <a:fillRect/>
                     </a:stretch>
@@ -2995,7 +2905,7 @@
           <wp:inline distT="0" distB="0" distL="0" distR="0">
             <wp:extent cx="5940425" cy="1513205"/>
             <wp:effectExtent l="0" t="0" r="0" b="0"/>
-            <wp:docPr id="33" name="Imagen33"/>
+            <wp:docPr id="32" name="Imagen33"/>
             <wp:cNvGraphicFramePr>
               <a:graphicFrameLocks xmlns:a="http://schemas.openxmlformats.org/drawingml/2006/main" noChangeAspect="1"/>
             </wp:cNvGraphicFramePr>
@@ -3003,13 +2913,13 @@
               <a:graphicData uri="http://schemas.openxmlformats.org/drawingml/2006/picture">
                 <pic:pic xmlns:pic="http://schemas.openxmlformats.org/drawingml/2006/picture">
                   <pic:nvPicPr>
-                    <pic:cNvPr id="33" name="Imagen33"/>
+                    <pic:cNvPr id="32" name="Imagen33"/>
                     <pic:cNvPicPr>
                       <a:picLocks noChangeAspect="1" noChangeArrowheads="1"/>
                     </pic:cNvPicPr>
                   </pic:nvPicPr>
                   <pic:blipFill>
-                    <a:blip r:embed="rId34"/>
+                    <a:blip r:embed="rId33"/>
                     <a:stretch>
                       <a:fillRect/>
                     </a:stretch>
@@ -3045,7 +2955,7 @@
           <wp:inline distT="0" distB="0" distL="0" distR="0">
             <wp:extent cx="4438650" cy="657225"/>
             <wp:effectExtent l="0" t="0" r="0" b="0"/>
-            <wp:docPr id="34" name="Imagen34"/>
+            <wp:docPr id="33" name="Imagen34"/>
             <wp:cNvGraphicFramePr>
               <a:graphicFrameLocks xmlns:a="http://schemas.openxmlformats.org/drawingml/2006/main" noChangeAspect="1"/>
             </wp:cNvGraphicFramePr>
@@ -3053,13 +2963,13 @@
               <a:graphicData uri="http://schemas.openxmlformats.org/drawingml/2006/picture">
                 <pic:pic xmlns:pic="http://schemas.openxmlformats.org/drawingml/2006/picture">
                   <pic:nvPicPr>
-                    <pic:cNvPr id="34" name="Imagen34"/>
+                    <pic:cNvPr id="33" name="Imagen34"/>
                     <pic:cNvPicPr>
                       <a:picLocks noChangeAspect="1" noChangeArrowheads="1"/>
                     </pic:cNvPicPr>
                   </pic:nvPicPr>
                   <pic:blipFill>
-                    <a:blip r:embed="rId35"/>
+                    <a:blip r:embed="rId34"/>
                     <a:stretch>
                       <a:fillRect/>
                     </a:stretch>
@@ -3171,7 +3081,7 @@
           <wp:inline distT="0" distB="0" distL="0" distR="0">
             <wp:extent cx="5940425" cy="1103630"/>
             <wp:effectExtent l="0" t="0" r="0" b="0"/>
-            <wp:docPr id="35" name="Imagen35"/>
+            <wp:docPr id="34" name="Imagen35"/>
             <wp:cNvGraphicFramePr>
               <a:graphicFrameLocks xmlns:a="http://schemas.openxmlformats.org/drawingml/2006/main" noChangeAspect="1"/>
             </wp:cNvGraphicFramePr>
@@ -3179,13 +3089,13 @@
               <a:graphicData uri="http://schemas.openxmlformats.org/drawingml/2006/picture">
                 <pic:pic xmlns:pic="http://schemas.openxmlformats.org/drawingml/2006/picture">
                   <pic:nvPicPr>
-                    <pic:cNvPr id="35" name="Imagen35"/>
+                    <pic:cNvPr id="34" name="Imagen35"/>
                     <pic:cNvPicPr>
                       <a:picLocks noChangeAspect="1" noChangeArrowheads="1"/>
                     </pic:cNvPicPr>
                   </pic:nvPicPr>
                   <pic:blipFill>
-                    <a:blip r:embed="rId36"/>
+                    <a:blip r:embed="rId35"/>
                     <a:stretch>
                       <a:fillRect/>
                     </a:stretch>
@@ -3236,7 +3146,7 @@
           <wp:inline distT="0" distB="0" distL="0" distR="0">
             <wp:extent cx="5940425" cy="1762760"/>
             <wp:effectExtent l="0" t="0" r="0" b="0"/>
-            <wp:docPr id="36" name="Imagen36"/>
+            <wp:docPr id="35" name="Imagen36"/>
             <wp:cNvGraphicFramePr>
               <a:graphicFrameLocks xmlns:a="http://schemas.openxmlformats.org/drawingml/2006/main" noChangeAspect="1"/>
             </wp:cNvGraphicFramePr>
@@ -3244,13 +3154,13 @@
               <a:graphicData uri="http://schemas.openxmlformats.org/drawingml/2006/picture">
                 <pic:pic xmlns:pic="http://schemas.openxmlformats.org/drawingml/2006/picture">
                   <pic:nvPicPr>
-                    <pic:cNvPr id="36" name="Imagen36"/>
+                    <pic:cNvPr id="35" name="Imagen36"/>
                     <pic:cNvPicPr>
                       <a:picLocks noChangeAspect="1" noChangeArrowheads="1"/>
                     </pic:cNvPicPr>
                   </pic:nvPicPr>
                   <pic:blipFill>
-                    <a:blip r:embed="rId37"/>
+                    <a:blip r:embed="rId36"/>
                     <a:stretch>
                       <a:fillRect/>
                     </a:stretch>
@@ -3358,7 +3268,7 @@
           <wp:inline distT="0" distB="0" distL="0" distR="0">
             <wp:extent cx="2291080" cy="5110480"/>
             <wp:effectExtent l="0" t="0" r="0" b="0"/>
-            <wp:docPr id="37" name="Imagen37"/>
+            <wp:docPr id="36" name="Imagen37"/>
             <wp:cNvGraphicFramePr>
               <a:graphicFrameLocks xmlns:a="http://schemas.openxmlformats.org/drawingml/2006/main" noChangeAspect="1"/>
             </wp:cNvGraphicFramePr>
@@ -3366,13 +3276,13 @@
               <a:graphicData uri="http://schemas.openxmlformats.org/drawingml/2006/picture">
                 <pic:pic xmlns:pic="http://schemas.openxmlformats.org/drawingml/2006/picture">
                   <pic:nvPicPr>
-                    <pic:cNvPr id="37" name="Imagen37"/>
+                    <pic:cNvPr id="36" name="Imagen37"/>
                     <pic:cNvPicPr>
                       <a:picLocks noChangeAspect="1" noChangeArrowheads="1"/>
                     </pic:cNvPicPr>
                   </pic:nvPicPr>
                   <pic:blipFill>
-                    <a:blip r:embed="rId38"/>
+                    <a:blip r:embed="rId37"/>
                     <a:stretch>
                       <a:fillRect/>
                     </a:stretch>
@@ -3422,7 +3332,7 @@
           <wp:inline distT="0" distB="0" distL="0" distR="0">
             <wp:extent cx="3429000" cy="752475"/>
             <wp:effectExtent l="0" t="0" r="0" b="0"/>
-            <wp:docPr id="38" name="Imagen38"/>
+            <wp:docPr id="37" name="Imagen38"/>
             <wp:cNvGraphicFramePr>
               <a:graphicFrameLocks xmlns:a="http://schemas.openxmlformats.org/drawingml/2006/main" noChangeAspect="1"/>
             </wp:cNvGraphicFramePr>
@@ -3430,13 +3340,13 @@
               <a:graphicData uri="http://schemas.openxmlformats.org/drawingml/2006/picture">
                 <pic:pic xmlns:pic="http://schemas.openxmlformats.org/drawingml/2006/picture">
                   <pic:nvPicPr>
-                    <pic:cNvPr id="38" name="Imagen38"/>
+                    <pic:cNvPr id="37" name="Imagen38"/>
                     <pic:cNvPicPr>
                       <a:picLocks noChangeAspect="1" noChangeArrowheads="1"/>
                     </pic:cNvPicPr>
                   </pic:nvPicPr>
                   <pic:blipFill>
-                    <a:blip r:embed="rId39"/>
+                    <a:blip r:embed="rId38"/>
                     <a:stretch>
                       <a:fillRect/>
                     </a:stretch>
@@ -3534,7 +3444,7 @@
           <wp:inline distT="0" distB="0" distL="0" distR="0">
             <wp:extent cx="3114675" cy="857250"/>
             <wp:effectExtent l="0" t="0" r="0" b="0"/>
-            <wp:docPr id="39" name="Imagen39"/>
+            <wp:docPr id="38" name="Imagen39"/>
             <wp:cNvGraphicFramePr>
               <a:graphicFrameLocks xmlns:a="http://schemas.openxmlformats.org/drawingml/2006/main" noChangeAspect="1"/>
             </wp:cNvGraphicFramePr>
@@ -3542,13 +3452,13 @@
               <a:graphicData uri="http://schemas.openxmlformats.org/drawingml/2006/picture">
                 <pic:pic xmlns:pic="http://schemas.openxmlformats.org/drawingml/2006/picture">
                   <pic:nvPicPr>
-                    <pic:cNvPr id="39" name="Imagen39"/>
+                    <pic:cNvPr id="38" name="Imagen39"/>
                     <pic:cNvPicPr>
                       <a:picLocks noChangeAspect="1" noChangeArrowheads="1"/>
                     </pic:cNvPicPr>
                   </pic:nvPicPr>
                   <pic:blipFill>
-                    <a:blip r:embed="rId40"/>
+                    <a:blip r:embed="rId39"/>
                     <a:stretch>
                       <a:fillRect/>
                     </a:stretch>
@@ -3663,7 +3573,7 @@
           <wp:inline distT="0" distB="0" distL="0" distR="0">
             <wp:extent cx="5940425" cy="3081655"/>
             <wp:effectExtent l="0" t="0" r="0" b="0"/>
-            <wp:docPr id="40" name="Imagen40"/>
+            <wp:docPr id="39" name="Imagen40"/>
             <wp:cNvGraphicFramePr>
               <a:graphicFrameLocks xmlns:a="http://schemas.openxmlformats.org/drawingml/2006/main" noChangeAspect="1"/>
             </wp:cNvGraphicFramePr>
@@ -3671,13 +3581,13 @@
               <a:graphicData uri="http://schemas.openxmlformats.org/drawingml/2006/picture">
                 <pic:pic xmlns:pic="http://schemas.openxmlformats.org/drawingml/2006/picture">
                   <pic:nvPicPr>
-                    <pic:cNvPr id="40" name="Imagen40"/>
+                    <pic:cNvPr id="39" name="Imagen40"/>
                     <pic:cNvPicPr>
                       <a:picLocks noChangeAspect="1" noChangeArrowheads="1"/>
                     </pic:cNvPicPr>
                   </pic:nvPicPr>
                   <pic:blipFill>
-                    <a:blip r:embed="rId41"/>
+                    <a:blip r:embed="rId40"/>
                     <a:stretch>
                       <a:fillRect/>
                     </a:stretch>
@@ -3801,7 +3711,7 @@
           <wp:inline distT="0" distB="0" distL="0" distR="0">
             <wp:extent cx="5940425" cy="2182495"/>
             <wp:effectExtent l="0" t="0" r="0" b="0"/>
-            <wp:docPr id="41" name="Imagen41"/>
+            <wp:docPr id="40" name="Imagen41"/>
             <wp:cNvGraphicFramePr>
               <a:graphicFrameLocks xmlns:a="http://schemas.openxmlformats.org/drawingml/2006/main" noChangeAspect="1"/>
             </wp:cNvGraphicFramePr>
@@ -3809,13 +3719,13 @@
               <a:graphicData uri="http://schemas.openxmlformats.org/drawingml/2006/picture">
                 <pic:pic xmlns:pic="http://schemas.openxmlformats.org/drawingml/2006/picture">
                   <pic:nvPicPr>
-                    <pic:cNvPr id="41" name="Imagen41"/>
+                    <pic:cNvPr id="40" name="Imagen41"/>
                     <pic:cNvPicPr>
                       <a:picLocks noChangeAspect="1" noChangeArrowheads="1"/>
                     </pic:cNvPicPr>
                   </pic:nvPicPr>
                   <pic:blipFill>
-                    <a:blip r:embed="rId42"/>
+                    <a:blip r:embed="rId41"/>
                     <a:stretch>
                       <a:fillRect/>
                     </a:stretch>
@@ -3871,7 +3781,7 @@
           <wp:inline distT="0" distB="0" distL="0" distR="0">
             <wp:extent cx="5940425" cy="1213485"/>
             <wp:effectExtent l="0" t="0" r="0" b="0"/>
-            <wp:docPr id="42" name="Imagen42"/>
+            <wp:docPr id="41" name="Imagen42"/>
             <wp:cNvGraphicFramePr>
               <a:graphicFrameLocks xmlns:a="http://schemas.openxmlformats.org/drawingml/2006/main" noChangeAspect="1"/>
             </wp:cNvGraphicFramePr>
@@ -3879,13 +3789,13 @@
               <a:graphicData uri="http://schemas.openxmlformats.org/drawingml/2006/picture">
                 <pic:pic xmlns:pic="http://schemas.openxmlformats.org/drawingml/2006/picture">
                   <pic:nvPicPr>
-                    <pic:cNvPr id="42" name="Imagen42"/>
+                    <pic:cNvPr id="41" name="Imagen42"/>
                     <pic:cNvPicPr>
                       <a:picLocks noChangeAspect="1" noChangeArrowheads="1"/>
                     </pic:cNvPicPr>
                   </pic:nvPicPr>
                   <pic:blipFill>
-                    <a:blip r:embed="rId43"/>
+                    <a:blip r:embed="rId42"/>
                     <a:stretch>
                       <a:fillRect/>
                     </a:stretch>
@@ -3938,7 +3848,7 @@
           <wp:inline distT="0" distB="0" distL="0" distR="0">
             <wp:extent cx="5940425" cy="1494155"/>
             <wp:effectExtent l="0" t="0" r="0" b="0"/>
-            <wp:docPr id="43" name="Imagen43"/>
+            <wp:docPr id="42" name="Imagen43"/>
             <wp:cNvGraphicFramePr>
               <a:graphicFrameLocks xmlns:a="http://schemas.openxmlformats.org/drawingml/2006/main" noChangeAspect="1"/>
             </wp:cNvGraphicFramePr>
@@ -3946,13 +3856,13 @@
               <a:graphicData uri="http://schemas.openxmlformats.org/drawingml/2006/picture">
                 <pic:pic xmlns:pic="http://schemas.openxmlformats.org/drawingml/2006/picture">
                   <pic:nvPicPr>
-                    <pic:cNvPr id="43" name="Imagen43"/>
+                    <pic:cNvPr id="42" name="Imagen43"/>
                     <pic:cNvPicPr>
                       <a:picLocks noChangeAspect="1" noChangeArrowheads="1"/>
                     </pic:cNvPicPr>
                   </pic:nvPicPr>
                   <pic:blipFill>
-                    <a:blip r:embed="rId44"/>
+                    <a:blip r:embed="rId43"/>
                     <a:stretch>
                       <a:fillRect/>
                     </a:stretch>
@@ -4075,7 +3985,7 @@
           <wp:inline distT="0" distB="0" distL="0" distR="0">
             <wp:extent cx="3429000" cy="1019175"/>
             <wp:effectExtent l="0" t="0" r="0" b="0"/>
-            <wp:docPr id="44" name="Imagen44"/>
+            <wp:docPr id="43" name="Imagen44"/>
             <wp:cNvGraphicFramePr>
               <a:graphicFrameLocks xmlns:a="http://schemas.openxmlformats.org/drawingml/2006/main" noChangeAspect="1"/>
             </wp:cNvGraphicFramePr>
@@ -4083,13 +3993,13 @@
               <a:graphicData uri="http://schemas.openxmlformats.org/drawingml/2006/picture">
                 <pic:pic xmlns:pic="http://schemas.openxmlformats.org/drawingml/2006/picture">
                   <pic:nvPicPr>
-                    <pic:cNvPr id="44" name="Imagen44"/>
+                    <pic:cNvPr id="43" name="Imagen44"/>
                     <pic:cNvPicPr>
                       <a:picLocks noChangeAspect="1" noChangeArrowheads="1"/>
                     </pic:cNvPicPr>
                   </pic:nvPicPr>
                   <pic:blipFill>
-                    <a:blip r:embed="rId45"/>
+                    <a:blip r:embed="rId44"/>
                     <a:stretch>
                       <a:fillRect/>
                     </a:stretch>
@@ -4178,7 +4088,7 @@
           <wp:inline distT="0" distB="0" distL="0" distR="0">
             <wp:extent cx="4191000" cy="1323975"/>
             <wp:effectExtent l="0" t="0" r="0" b="0"/>
-            <wp:docPr id="45" name="Imagen45"/>
+            <wp:docPr id="44" name="Imagen45"/>
             <wp:cNvGraphicFramePr>
               <a:graphicFrameLocks xmlns:a="http://schemas.openxmlformats.org/drawingml/2006/main" noChangeAspect="1"/>
             </wp:cNvGraphicFramePr>
@@ -4186,13 +4096,13 @@
               <a:graphicData uri="http://schemas.openxmlformats.org/drawingml/2006/picture">
                 <pic:pic xmlns:pic="http://schemas.openxmlformats.org/drawingml/2006/picture">
                   <pic:nvPicPr>
-                    <pic:cNvPr id="45" name="Imagen45"/>
+                    <pic:cNvPr id="44" name="Imagen45"/>
                     <pic:cNvPicPr>
                       <a:picLocks noChangeAspect="1" noChangeArrowheads="1"/>
                     </pic:cNvPicPr>
                   </pic:nvPicPr>
                   <pic:blipFill>
-                    <a:blip r:embed="rId46"/>
+                    <a:blip r:embed="rId45"/>
                     <a:stretch>
                       <a:fillRect/>
                     </a:stretch>
@@ -4403,7 +4313,7 @@
           <wp:inline distT="0" distB="0" distL="0" distR="0">
             <wp:extent cx="2790825" cy="2494915"/>
             <wp:effectExtent l="0" t="0" r="0" b="0"/>
-            <wp:docPr id="46" name="Imagen46"/>
+            <wp:docPr id="45" name="Imagen46"/>
             <wp:cNvGraphicFramePr>
               <a:graphicFrameLocks xmlns:a="http://schemas.openxmlformats.org/drawingml/2006/main" noChangeAspect="1"/>
             </wp:cNvGraphicFramePr>
@@ -4411,13 +4321,13 @@
               <a:graphicData uri="http://schemas.openxmlformats.org/drawingml/2006/picture">
                 <pic:pic xmlns:pic="http://schemas.openxmlformats.org/drawingml/2006/picture">
                   <pic:nvPicPr>
-                    <pic:cNvPr id="46" name="Imagen46"/>
+                    <pic:cNvPr id="45" name="Imagen46"/>
                     <pic:cNvPicPr>
                       <a:picLocks noChangeAspect="1" noChangeArrowheads="1"/>
                     </pic:cNvPicPr>
                   </pic:nvPicPr>
                   <pic:blipFill>
-                    <a:blip r:embed="rId47"/>
+                    <a:blip r:embed="rId46"/>
                     <a:stretch>
                       <a:fillRect/>
                     </a:stretch>
@@ -4444,7 +4354,7 @@
           <wp:inline distT="0" distB="0" distL="0" distR="0">
             <wp:extent cx="2924175" cy="2231390"/>
             <wp:effectExtent l="0" t="0" r="0" b="0"/>
-            <wp:docPr id="47" name="Imagen47"/>
+            <wp:docPr id="46" name="Imagen47"/>
             <wp:cNvGraphicFramePr>
               <a:graphicFrameLocks xmlns:a="http://schemas.openxmlformats.org/drawingml/2006/main" noChangeAspect="1"/>
             </wp:cNvGraphicFramePr>
@@ -4452,13 +4362,13 @@
               <a:graphicData uri="http://schemas.openxmlformats.org/drawingml/2006/picture">
                 <pic:pic xmlns:pic="http://schemas.openxmlformats.org/drawingml/2006/picture">
                   <pic:nvPicPr>
-                    <pic:cNvPr id="47" name="Imagen47"/>
+                    <pic:cNvPr id="46" name="Imagen47"/>
                     <pic:cNvPicPr>
                       <a:picLocks noChangeAspect="1" noChangeArrowheads="1"/>
                     </pic:cNvPicPr>
                   </pic:nvPicPr>
                   <pic:blipFill>
-                    <a:blip r:embed="rId48"/>
+                    <a:blip r:embed="rId47"/>
                     <a:stretch>
                       <a:fillRect/>
                     </a:stretch>
@@ -4554,7 +4464,7 @@
           <wp:inline distT="0" distB="0" distL="0" distR="0">
             <wp:extent cx="5940425" cy="6378575"/>
             <wp:effectExtent l="0" t="0" r="0" b="0"/>
-            <wp:docPr id="48" name="Imagen48"/>
+            <wp:docPr id="47" name="Imagen48"/>
             <wp:cNvGraphicFramePr>
               <a:graphicFrameLocks xmlns:a="http://schemas.openxmlformats.org/drawingml/2006/main" noChangeAspect="1"/>
             </wp:cNvGraphicFramePr>
@@ -4562,13 +4472,13 @@
               <a:graphicData uri="http://schemas.openxmlformats.org/drawingml/2006/picture">
                 <pic:pic xmlns:pic="http://schemas.openxmlformats.org/drawingml/2006/picture">
                   <pic:nvPicPr>
-                    <pic:cNvPr id="48" name="Imagen48"/>
+                    <pic:cNvPr id="47" name="Imagen48"/>
                     <pic:cNvPicPr>
                       <a:picLocks noChangeAspect="1" noChangeArrowheads="1"/>
                     </pic:cNvPicPr>
                   </pic:nvPicPr>
                   <pic:blipFill>
-                    <a:blip r:embed="rId49"/>
+                    <a:blip r:embed="rId48"/>
                     <a:stretch>
                       <a:fillRect/>
                     </a:stretch>
@@ -4656,7 +4566,7 @@
           <wp:inline distT="0" distB="0" distL="0" distR="0">
             <wp:extent cx="5940425" cy="5986145"/>
             <wp:effectExtent l="0" t="0" r="0" b="0"/>
-            <wp:docPr id="49" name="Imagen49"/>
+            <wp:docPr id="48" name="Imagen49"/>
             <wp:cNvGraphicFramePr>
               <a:graphicFrameLocks xmlns:a="http://schemas.openxmlformats.org/drawingml/2006/main" noChangeAspect="1"/>
             </wp:cNvGraphicFramePr>
@@ -4664,13 +4574,13 @@
               <a:graphicData uri="http://schemas.openxmlformats.org/drawingml/2006/picture">
                 <pic:pic xmlns:pic="http://schemas.openxmlformats.org/drawingml/2006/picture">
                   <pic:nvPicPr>
-                    <pic:cNvPr id="49" name="Imagen49"/>
+                    <pic:cNvPr id="48" name="Imagen49"/>
                     <pic:cNvPicPr>
                       <a:picLocks noChangeAspect="1" noChangeArrowheads="1"/>
                     </pic:cNvPicPr>
                   </pic:nvPicPr>
                   <pic:blipFill>
-                    <a:blip r:embed="rId50"/>
+                    <a:blip r:embed="rId49"/>
                     <a:stretch>
                       <a:fillRect/>
                     </a:stretch>
@@ -4706,7 +4616,7 @@
           <wp:inline distT="0" distB="0" distL="0" distR="0">
             <wp:extent cx="5940425" cy="4947285"/>
             <wp:effectExtent l="0" t="0" r="0" b="0"/>
-            <wp:docPr id="50" name="Imagen50"/>
+            <wp:docPr id="49" name="Imagen50"/>
             <wp:cNvGraphicFramePr>
               <a:graphicFrameLocks xmlns:a="http://schemas.openxmlformats.org/drawingml/2006/main" noChangeAspect="1"/>
             </wp:cNvGraphicFramePr>
@@ -4714,13 +4624,13 @@
               <a:graphicData uri="http://schemas.openxmlformats.org/drawingml/2006/picture">
                 <pic:pic xmlns:pic="http://schemas.openxmlformats.org/drawingml/2006/picture">
                   <pic:nvPicPr>
-                    <pic:cNvPr id="50" name="Imagen50"/>
+                    <pic:cNvPr id="49" name="Imagen50"/>
                     <pic:cNvPicPr>
                       <a:picLocks noChangeAspect="1" noChangeArrowheads="1"/>
                     </pic:cNvPicPr>
                   </pic:nvPicPr>
                   <pic:blipFill>
-                    <a:blip r:embed="rId51"/>
+                    <a:blip r:embed="rId50"/>
                     <a:stretch>
                       <a:fillRect/>
                     </a:stretch>
@@ -4768,7 +4678,7 @@
           <wp:inline distT="0" distB="0" distL="0" distR="0">
             <wp:extent cx="5940425" cy="5809615"/>
             <wp:effectExtent l="0" t="0" r="0" b="0"/>
-            <wp:docPr id="51" name="Imagen51"/>
+            <wp:docPr id="50" name="Imagen51"/>
             <wp:cNvGraphicFramePr>
               <a:graphicFrameLocks xmlns:a="http://schemas.openxmlformats.org/drawingml/2006/main" noChangeAspect="1"/>
             </wp:cNvGraphicFramePr>
@@ -4776,13 +4686,13 @@
               <a:graphicData uri="http://schemas.openxmlformats.org/drawingml/2006/picture">
                 <pic:pic xmlns:pic="http://schemas.openxmlformats.org/drawingml/2006/picture">
                   <pic:nvPicPr>
-                    <pic:cNvPr id="51" name="Imagen51"/>
+                    <pic:cNvPr id="50" name="Imagen51"/>
                     <pic:cNvPicPr>
                       <a:picLocks noChangeAspect="1" noChangeArrowheads="1"/>
                     </pic:cNvPicPr>
                   </pic:nvPicPr>
                   <pic:blipFill>
-                    <a:blip r:embed="rId52"/>
+                    <a:blip r:embed="rId51"/>
                     <a:stretch>
                       <a:fillRect/>
                     </a:stretch>
@@ -4868,7 +4778,7 @@
           <wp:inline distT="0" distB="0" distL="0" distR="0">
             <wp:extent cx="5940425" cy="4757420"/>
             <wp:effectExtent l="0" t="0" r="0" b="0"/>
-            <wp:docPr id="52" name="Imagen52"/>
+            <wp:docPr id="51" name="Imagen52"/>
             <wp:cNvGraphicFramePr>
               <a:graphicFrameLocks xmlns:a="http://schemas.openxmlformats.org/drawingml/2006/main" noChangeAspect="1"/>
             </wp:cNvGraphicFramePr>
@@ -4876,13 +4786,13 @@
               <a:graphicData uri="http://schemas.openxmlformats.org/drawingml/2006/picture">
                 <pic:pic xmlns:pic="http://schemas.openxmlformats.org/drawingml/2006/picture">
                   <pic:nvPicPr>
-                    <pic:cNvPr id="52" name="Imagen52"/>
+                    <pic:cNvPr id="51" name="Imagen52"/>
                     <pic:cNvPicPr>
                       <a:picLocks noChangeAspect="1" noChangeArrowheads="1"/>
                     </pic:cNvPicPr>
                   </pic:nvPicPr>
                   <pic:blipFill>
-                    <a:blip r:embed="rId53"/>
+                    <a:blip r:embed="rId52"/>
                     <a:stretch>
                       <a:fillRect/>
                     </a:stretch>
@@ -4959,7 +4869,7 @@
           <wp:inline distT="0" distB="0" distL="0" distR="0">
             <wp:extent cx="5940425" cy="2241550"/>
             <wp:effectExtent l="0" t="0" r="0" b="0"/>
-            <wp:docPr id="53" name="Imagen53"/>
+            <wp:docPr id="52" name="Imagen53"/>
             <wp:cNvGraphicFramePr>
               <a:graphicFrameLocks xmlns:a="http://schemas.openxmlformats.org/drawingml/2006/main" noChangeAspect="1"/>
             </wp:cNvGraphicFramePr>
@@ -4967,13 +4877,13 @@
               <a:graphicData uri="http://schemas.openxmlformats.org/drawingml/2006/picture">
                 <pic:pic xmlns:pic="http://schemas.openxmlformats.org/drawingml/2006/picture">
                   <pic:nvPicPr>
-                    <pic:cNvPr id="53" name="Imagen53"/>
+                    <pic:cNvPr id="52" name="Imagen53"/>
                     <pic:cNvPicPr>
                       <a:picLocks noChangeAspect="1" noChangeArrowheads="1"/>
                     </pic:cNvPicPr>
                   </pic:nvPicPr>
                   <pic:blipFill>
-                    <a:blip r:embed="rId54"/>
+                    <a:blip r:embed="rId53"/>
                     <a:stretch>
                       <a:fillRect/>
                     </a:stretch>
@@ -5095,7 +5005,7 @@
           <wp:inline distT="0" distB="0" distL="0" distR="0">
             <wp:extent cx="5940425" cy="1259205"/>
             <wp:effectExtent l="0" t="0" r="0" b="0"/>
-            <wp:docPr id="54" name="Imagen54"/>
+            <wp:docPr id="53" name="Imagen54"/>
             <wp:cNvGraphicFramePr>
               <a:graphicFrameLocks xmlns:a="http://schemas.openxmlformats.org/drawingml/2006/main" noChangeAspect="1"/>
             </wp:cNvGraphicFramePr>
@@ -5103,13 +5013,13 @@
               <a:graphicData uri="http://schemas.openxmlformats.org/drawingml/2006/picture">
                 <pic:pic xmlns:pic="http://schemas.openxmlformats.org/drawingml/2006/picture">
                   <pic:nvPicPr>
-                    <pic:cNvPr id="54" name="Imagen54"/>
+                    <pic:cNvPr id="53" name="Imagen54"/>
                     <pic:cNvPicPr>
                       <a:picLocks noChangeAspect="1" noChangeArrowheads="1"/>
                     </pic:cNvPicPr>
                   </pic:nvPicPr>
                   <pic:blipFill>
-                    <a:blip r:embed="rId55"/>
+                    <a:blip r:embed="rId54"/>
                     <a:stretch>
                       <a:fillRect/>
                     </a:stretch>
@@ -5189,7 +5099,7 @@
           <wp:inline distT="0" distB="0" distL="0" distR="0">
             <wp:extent cx="5219700" cy="2409825"/>
             <wp:effectExtent l="0" t="0" r="0" b="0"/>
-            <wp:docPr id="55" name="Imagen55"/>
+            <wp:docPr id="54" name="Imagen55"/>
             <wp:cNvGraphicFramePr>
               <a:graphicFrameLocks xmlns:a="http://schemas.openxmlformats.org/drawingml/2006/main" noChangeAspect="1"/>
             </wp:cNvGraphicFramePr>
@@ -5197,13 +5107,13 @@
               <a:graphicData uri="http://schemas.openxmlformats.org/drawingml/2006/picture">
                 <pic:pic xmlns:pic="http://schemas.openxmlformats.org/drawingml/2006/picture">
                   <pic:nvPicPr>
-                    <pic:cNvPr id="55" name="Imagen55"/>
+                    <pic:cNvPr id="54" name="Imagen55"/>
                     <pic:cNvPicPr>
                       <a:picLocks noChangeAspect="1" noChangeArrowheads="1"/>
                     </pic:cNvPicPr>
                   </pic:nvPicPr>
                   <pic:blipFill>
-                    <a:blip r:embed="rId56"/>
+                    <a:blip r:embed="rId55"/>
                     <a:stretch>
                       <a:fillRect/>
                     </a:stretch>
@@ -5266,7 +5176,7 @@
           <wp:inline distT="0" distB="0" distL="0" distR="0">
             <wp:extent cx="5940425" cy="1922780"/>
             <wp:effectExtent l="0" t="0" r="0" b="0"/>
-            <wp:docPr id="56" name="Imagen56"/>
+            <wp:docPr id="55" name="Imagen56"/>
             <wp:cNvGraphicFramePr>
               <a:graphicFrameLocks xmlns:a="http://schemas.openxmlformats.org/drawingml/2006/main" noChangeAspect="1"/>
             </wp:cNvGraphicFramePr>
@@ -5274,13 +5184,13 @@
               <a:graphicData uri="http://schemas.openxmlformats.org/drawingml/2006/picture">
                 <pic:pic xmlns:pic="http://schemas.openxmlformats.org/drawingml/2006/picture">
                   <pic:nvPicPr>
-                    <pic:cNvPr id="56" name="Imagen56"/>
+                    <pic:cNvPr id="55" name="Imagen56"/>
                     <pic:cNvPicPr>
                       <a:picLocks noChangeAspect="1" noChangeArrowheads="1"/>
                     </pic:cNvPicPr>
                   </pic:nvPicPr>
                   <pic:blipFill>
-                    <a:blip r:embed="rId57"/>
+                    <a:blip r:embed="rId56"/>
                     <a:stretch>
                       <a:fillRect/>
                     </a:stretch>
@@ -5332,7 +5242,7 @@
           <wp:inline distT="0" distB="0" distL="0" distR="0">
             <wp:extent cx="2750185" cy="6112510"/>
             <wp:effectExtent l="0" t="0" r="0" b="0"/>
-            <wp:docPr id="57" name="Imagen57"/>
+            <wp:docPr id="56" name="Imagen57"/>
             <wp:cNvGraphicFramePr>
               <a:graphicFrameLocks xmlns:a="http://schemas.openxmlformats.org/drawingml/2006/main" noChangeAspect="1"/>
             </wp:cNvGraphicFramePr>
@@ -5340,13 +5250,13 @@
               <a:graphicData uri="http://schemas.openxmlformats.org/drawingml/2006/picture">
                 <pic:pic xmlns:pic="http://schemas.openxmlformats.org/drawingml/2006/picture">
                   <pic:nvPicPr>
-                    <pic:cNvPr id="57" name="Imagen57"/>
+                    <pic:cNvPr id="56" name="Imagen57"/>
                     <pic:cNvPicPr>
                       <a:picLocks noChangeAspect="1" noChangeArrowheads="1"/>
                     </pic:cNvPicPr>
                   </pic:nvPicPr>
                   <pic:blipFill>
-                    <a:blip r:embed="rId58"/>
+                    <a:blip r:embed="rId57"/>
                     <a:stretch>
                       <a:fillRect/>
                     </a:stretch>
@@ -5409,7 +5319,7 @@
           <wp:inline distT="0" distB="0" distL="0" distR="0">
             <wp:extent cx="2708275" cy="6028690"/>
             <wp:effectExtent l="0" t="0" r="0" b="0"/>
-            <wp:docPr id="58" name="Imagen58"/>
+            <wp:docPr id="57" name="Imagen58"/>
             <wp:cNvGraphicFramePr>
               <a:graphicFrameLocks xmlns:a="http://schemas.openxmlformats.org/drawingml/2006/main" noChangeAspect="1"/>
             </wp:cNvGraphicFramePr>
@@ -5417,13 +5327,13 @@
               <a:graphicData uri="http://schemas.openxmlformats.org/drawingml/2006/picture">
                 <pic:pic xmlns:pic="http://schemas.openxmlformats.org/drawingml/2006/picture">
                   <pic:nvPicPr>
-                    <pic:cNvPr id="58" name="Imagen58"/>
+                    <pic:cNvPr id="57" name="Imagen58"/>
                     <pic:cNvPicPr>
                       <a:picLocks noChangeAspect="1" noChangeArrowheads="1"/>
                     </pic:cNvPicPr>
                   </pic:nvPicPr>
                   <pic:blipFill>
-                    <a:blip r:embed="rId59"/>
+                    <a:blip r:embed="rId58"/>
                     <a:stretch>
                       <a:fillRect/>
                     </a:stretch>
@@ -5475,7 +5385,7 @@
           <wp:inline distT="0" distB="0" distL="0" distR="0">
             <wp:extent cx="2580005" cy="5743575"/>
             <wp:effectExtent l="0" t="0" r="0" b="0"/>
-            <wp:docPr id="59" name="Imagen59"/>
+            <wp:docPr id="58" name="Imagen59"/>
             <wp:cNvGraphicFramePr>
               <a:graphicFrameLocks xmlns:a="http://schemas.openxmlformats.org/drawingml/2006/main" noChangeAspect="1"/>
             </wp:cNvGraphicFramePr>
@@ -5483,13 +5393,13 @@
               <a:graphicData uri="http://schemas.openxmlformats.org/drawingml/2006/picture">
                 <pic:pic xmlns:pic="http://schemas.openxmlformats.org/drawingml/2006/picture">
                   <pic:nvPicPr>
-                    <pic:cNvPr id="59" name="Imagen59"/>
+                    <pic:cNvPr id="58" name="Imagen59"/>
                     <pic:cNvPicPr>
                       <a:picLocks noChangeAspect="1" noChangeArrowheads="1"/>
                     </pic:cNvPicPr>
                   </pic:nvPicPr>
                   <pic:blipFill>
-                    <a:blip r:embed="rId60"/>
+                    <a:blip r:embed="rId59"/>
                     <a:stretch>
                       <a:fillRect/>
                     </a:stretch>
@@ -5542,7 +5452,7 @@
           <wp:inline distT="0" distB="0" distL="0" distR="0">
             <wp:extent cx="3303270" cy="7353935"/>
             <wp:effectExtent l="0" t="0" r="0" b="0"/>
-            <wp:docPr id="60" name="Imagen60"/>
+            <wp:docPr id="59" name="Imagen60"/>
             <wp:cNvGraphicFramePr>
               <a:graphicFrameLocks xmlns:a="http://schemas.openxmlformats.org/drawingml/2006/main" noChangeAspect="1"/>
             </wp:cNvGraphicFramePr>
@@ -5550,13 +5460,13 @@
               <a:graphicData uri="http://schemas.openxmlformats.org/drawingml/2006/picture">
                 <pic:pic xmlns:pic="http://schemas.openxmlformats.org/drawingml/2006/picture">
                   <pic:nvPicPr>
-                    <pic:cNvPr id="60" name="Imagen60"/>
+                    <pic:cNvPr id="59" name="Imagen60"/>
                     <pic:cNvPicPr>
                       <a:picLocks noChangeAspect="1" noChangeArrowheads="1"/>
                     </pic:cNvPicPr>
                   </pic:nvPicPr>
                   <pic:blipFill>
-                    <a:blip r:embed="rId61"/>
+                    <a:blip r:embed="rId60"/>
                     <a:stretch>
                       <a:fillRect/>
                     </a:stretch>
@@ -5595,12 +5505,12 @@
       </w:r>
     </w:p>
     <w:sectPr>
-      <w:headerReference w:type="even" r:id="rId62"/>
-      <w:headerReference w:type="default" r:id="rId63"/>
-      <w:headerReference w:type="first" r:id="rId64"/>
-      <w:footerReference w:type="even" r:id="rId65"/>
-      <w:footerReference w:type="default" r:id="rId66"/>
-      <w:footerReference w:type="first" r:id="rId67"/>
+      <w:headerReference w:type="even" r:id="rId61"/>
+      <w:headerReference w:type="default" r:id="rId62"/>
+      <w:headerReference w:type="first" r:id="rId63"/>
+      <w:footerReference w:type="even" r:id="rId64"/>
+      <w:footerReference w:type="default" r:id="rId65"/>
+      <w:footerReference w:type="first" r:id="rId66"/>
       <w:type w:val="nextPage"/>
       <w:pgSz w:w="11906" w:h="16838"/>
       <w:pgMar w:left="1701" w:right="850" w:gutter="0" w:header="709" w:top="1134" w:footer="709" w:bottom="822"/>
@@ -5717,7 +5627,7 @@
     </w:r>
     <w:r>
       <w:rPr/>
-      <w:t>38</w:t>
+      <w:t>37</w:t>
     </w:r>
     <w:r>
       <w:rPr/>
@@ -6935,9 +6845,8 @@
       <w:szCs w:val="20"/>
     </w:rPr>
   </w:style>
-  <w:style w:type="character" w:styleId="Caracteresdenotaalpieuser">
-    <w:name w:val="Caracteres de nota al pie (user)"/>
-    <w:basedOn w:val="DefaultParagraphFont"/>
+  <w:style w:type="character" w:styleId="Caracteresdenotaalpie">
+    <w:name w:val="Caracteres de nota al pie"/>
     <w:uiPriority w:val="99"/>
     <w:semiHidden/>
     <w:unhideWhenUsed/>
@@ -6946,8 +6855,8 @@
       <w:vertAlign w:val="superscript"/>
     </w:rPr>
   </w:style>
-  <w:style w:type="character" w:styleId="Caracteresdenotaalpie">
-    <w:name w:val="Caracteres de nota al pie"/>
+  <w:style w:type="character" w:styleId="Caracteresdenotaalpieuser">
+    <w:name w:val="Caracteres de nota al pie (user)"/>
     <w:qFormat/>
     <w:rPr>
       <w:vertAlign w:val="superscript"/>
@@ -6970,9 +6879,8 @@
       <w:szCs w:val="20"/>
     </w:rPr>
   </w:style>
-  <w:style w:type="character" w:styleId="Caracteresdenotafinaluser">
-    <w:name w:val="Caracteres de nota final (user)"/>
-    <w:basedOn w:val="DefaultParagraphFont"/>
+  <w:style w:type="character" w:styleId="Caracteresdenotafinal">
+    <w:name w:val="Caracteres de nota final"/>
     <w:uiPriority w:val="99"/>
     <w:semiHidden/>
     <w:unhideWhenUsed/>
@@ -6981,8 +6889,8 @@
       <w:vertAlign w:val="superscript"/>
     </w:rPr>
   </w:style>
-  <w:style w:type="character" w:styleId="Caracteresdenotafinal">
-    <w:name w:val="Caracteres de nota final"/>
+  <w:style w:type="character" w:styleId="Caracteresdenotafinaluser">
+    <w:name w:val="Caracteres de nota final (user)"/>
     <w:qFormat/>
     <w:rPr>
       <w:vertAlign w:val="superscript"/>
@@ -7183,15 +7091,15 @@
       <w:color w:themeColor="accent1" w:themeShade="bf" w:val="0F4761"/>
     </w:rPr>
   </w:style>
-  <w:style w:type="paragraph" w:styleId="Cabeceraypieuser">
-    <w:name w:val="Cabecera y pie (user)"/>
+  <w:style w:type="paragraph" w:styleId="Cabeceraypie">
+    <w:name w:val="Cabecera y pie"/>
     <w:basedOn w:val="Normal"/>
     <w:qFormat/>
     <w:pPr/>
     <w:rPr/>
   </w:style>
-  <w:style w:type="paragraph" w:styleId="Cabeceraypie">
-    <w:name w:val="Cabecera y pie"/>
+  <w:style w:type="paragraph" w:styleId="Cabeceraypieuser">
+    <w:name w:val="Cabecera y pie (user)"/>
     <w:basedOn w:val="Normal"/>
     <w:qFormat/>
     <w:pPr/>
@@ -7368,7 +7276,7 @@
   </w:style>
   <w:style w:type="paragraph" w:styleId="IndexHeading">
     <w:name w:val="index heading"/>
-    <w:basedOn w:val="Ttulouser"/>
+    <w:basedOn w:val="Ttulo"/>
     <w:pPr/>
     <w:rPr/>
   </w:style>
@@ -7426,8 +7334,8 @@
     </w:pPr>
     <w:rPr/>
   </w:style>
-  <w:style w:type="numbering" w:styleId="Ningunalistauser" w:default="1">
-    <w:name w:val="Ninguna lista (user)"/>
+  <w:style w:type="numbering" w:styleId="Ningunalista" w:default="1">
+    <w:name w:val="Ninguna lista"/>
     <w:uiPriority w:val="99"/>
     <w:semiHidden/>
     <w:unhideWhenUsed/>

</xml_diff>

<commit_message>
Ajusta el acta y el consentimiento a los modelos del fuero para documentar la extracción según el carácter del aportante.
Permite reservar su identidad, continuar sin la foto del DNI y describir en texto qué se está capturando.

Co-authored-by: Cursor <cursoragent@cursor.com>
</commit_message>
<xml_diff>
--- a/docs/Manual-de-uso-SIGEVED.docx
+++ b/docs/Manual-de-uso-SIGEVED.docx
@@ -258,7 +258,19 @@
         <w:rPr>
           <w:lang w:val="es-AR" w:bidi="es-AR"/>
         </w:rPr>
-        <w:t>Dicho sistema se instala localmente en cada PC que se designe por dependencia, la cual establecerá una comunicación mediante servicios a los sistemas de gestión de expedientes judiciales. Esto hace que no exista error en la cargar, permitiendo al operador del sistema extraer evidencia únicamente en los expedientes y las dependencias hadilitadas.</w:t>
+        <w:t>Dicho sistema se instala localmente en cada PC que se designe por dependencia, la cual establecerá una comunicación mediante servicios a los sistemas de gestión de expedientes judiciales. Esto hace que no exista error en la cargar, permitiendo al operador del sistema extraer evidencia únicamente en los expedientes y las dependencias ha</w:t>
+      </w:r>
+      <w:r>
+        <w:rPr>
+          <w:lang w:val="es-AR" w:bidi="es-AR"/>
+        </w:rPr>
+        <w:t>b</w:t>
+      </w:r>
+      <w:r>
+        <w:rPr>
+          <w:lang w:val="es-AR" w:bidi="es-AR"/>
+        </w:rPr>
+        <w:t>ilitadas.</w:t>
       </w:r>
     </w:p>
     <w:p>
@@ -275,7 +287,24 @@
         <w:rPr>
           <w:lang w:val="es-AR" w:bidi="es-AR"/>
         </w:rPr>
-        <w:t>Además posee un cifrado de punta a punta de los elementos extraidos, guardando así la confiabilidad, fidelidad y cadena de custodia de la evidencia a ser utilizada en las causas.</w:t>
+        <w:t>Además posee un cifrado de punta a punta de los elementos extraídos, guardando así la confiabilidad, fidelidad y cadena de custodia de la evidencia a ser utilizada en las causas.</w:t>
+      </w:r>
+    </w:p>
+    <w:p>
+      <w:pPr>
+        <w:pStyle w:val="Normal"/>
+        <w:shd w:val="nil" w:color="000000"/>
+        <w:jc w:val="both"/>
+        <w:rPr>
+          <w:highlight w:val="none"/>
+          <w:lang w:val="es-AR" w:bidi="es-AR"/>
+        </w:rPr>
+      </w:pPr>
+      <w:r>
+        <w:rPr>
+          <w:lang w:val="es-AR" w:bidi="es-AR"/>
+        </w:rPr>
+        <w:t>La garantía de trazabilidad, custodia y de no alteración se brinda solo desde el momento de obtención de la evidencia en adelante, no así de cómo se obtuvo originalmente; lo cual lógicamente puede ser objetado para verificar.</w:t>
       </w:r>
     </w:p>
     <w:p>
@@ -354,7 +383,7 @@
           <w:color w:val="C00000"/>
           <w:lang w:val="es-AR" w:bidi="es-AR"/>
         </w:rPr>
-        <w:t xml:space="preserve"> El dispositivo desde donde se obtendrán las evidencias digitales, debe estar conectado a la PC operadora en todo momento, desde el inicio hasta el final del procedimiento, no debe cortarse por ningun motivo dicha comunicación. Esto debe ser explicado al aportante, dado que no podrá hacer uso del mismo durante el procedimiento. Además, el dispositivo deberá estar en modo Desarrollador, permitir Depuración USB y transferencia de datos por USB. Esta activación en dispositivos Android se explica más adelante.</w:t>
+        <w:t xml:space="preserve"> El dispositivo desde donde se obtendrán las evidencias digitales, debe estar conectado a la PC operadora en todo momento, desde el inicio hasta el final del procedimiento, no debe cortarse por ningún motivo dicha comunicación. Esto debe ser explicado al aportante, dado que no podrá hacer uso del mismo durante el procedimiento. Además, el dispositivo deberá estar en modo Desarrollador, permitir Depuración USB y transferencia de datos por USB. Esta activación en dispositivos Android se explica más adelante.</w:t>
       </w:r>
     </w:p>
     <w:p>
@@ -439,7 +468,43 @@
         <w:rPr>
           <w:lang w:val="es-AR"/>
         </w:rPr>
-        <w:t>Luego se observan las dependencias habilitadas por el sistema, en este caso, al ser una causa penal, el Sistema Integral de Gestión e Información -SIGI-  es el que habilitará las dependencias. Una vez habilitadas dichas dependencias, si son más de una, estarán en una lista desplegable, la cual el operador deberá seleccionar para comenzar a trabajar en ella.</w:t>
+        <w:t xml:space="preserve">Luego se observan las dependencias habilitadas por </w:t>
+      </w:r>
+      <w:r>
+        <w:rPr>
+          <w:lang w:val="es-AR"/>
+        </w:rPr>
+        <w:t>los</w:t>
+      </w:r>
+      <w:r>
+        <w:rPr>
+          <w:lang w:val="es-AR"/>
+        </w:rPr>
+        <w:t xml:space="preserve"> </w:t>
+      </w:r>
+      <w:r>
+        <w:rPr>
+          <w:lang w:val="es-AR"/>
+        </w:rPr>
+        <w:t>S</w:t>
+      </w:r>
+      <w:r>
+        <w:rPr>
+          <w:lang w:val="es-AR"/>
+        </w:rPr>
+        <w:t>istema</w:t>
+      </w:r>
+      <w:r>
+        <w:rPr>
+          <w:lang w:val="es-AR"/>
+        </w:rPr>
+        <w:t>s de Gestión de Expedientes Digitales (SIGI / IURE)</w:t>
+      </w:r>
+      <w:r>
+        <w:rPr>
+          <w:lang w:val="es-AR"/>
+        </w:rPr>
+        <w:t>, en este caso, al ser una causa penal, el Sistema Integral de Gestión e Información -SIGI-  es el que habilitará las dependencias. Una vez habilitadas dichas dependencias, si son más de una, estarán en una lista desplegable, la cual el operador deberá seleccionar para comenzar a trabajar en ella.</w:t>
       </w:r>
     </w:p>
     <w:p>
@@ -588,7 +653,6 @@
         <w:rPr>
           <w:lang w:val="es-AR"/>
         </w:rPr>
-        <w:t>Una vez presionado ese botón (“Nueva Causa”) se abre un panel con los datos de la causa nueva:</w:t>
       </w:r>
     </w:p>
     <w:p>
@@ -598,15 +662,43 @@
         <w:jc w:val="both"/>
         <w:rPr>
           <w:highlight w:val="none"/>
-        </w:rPr>
-      </w:pPr>
-      <w:r>
-        <w:rPr/>
+          <w:lang w:val="es-AR"/>
+        </w:rPr>
+      </w:pPr>
+      <w:r>
+        <w:rPr>
+          <w:lang w:val="es-AR"/>
+        </w:rPr>
+        <w:t>Las causas se pueden iniciar con un registro definitivo, teniendo el número de expediente otorgado por el sistema de gestión de expedientes digitales, o continuar con un registro provisorio, dado que aun no se cuenta con dicho número (casos de excepción o premura en la carga de la evidencia digital):</w:t>
+      </w:r>
+    </w:p>
+    <w:p>
+      <w:pPr>
+        <w:pStyle w:val="Normal"/>
+        <w:shd w:val="nil" w:color="000000"/>
+        <w:jc w:val="both"/>
+        <w:rPr>
+          <w:highlight w:val="none"/>
+          <w:lang w:val="es-AR"/>
+        </w:rPr>
+      </w:pPr>
+      <w:r>
+        <w:rPr>
+          <w:lang w:val="es-AR"/>
+        </w:rPr>
         <w:drawing>
-          <wp:inline distT="0" distB="0" distL="0" distR="0">
-            <wp:extent cx="5940425" cy="1886585"/>
+          <wp:anchor distT="0" distB="0" distL="0" distR="0" simplePos="0" relativeHeight="59" behindDoc="0" locked="0" layoutInCell="0" allowOverlap="1">
+            <wp:simplePos x="0" y="0"/>
+            <wp:positionH relativeFrom="column">
+              <wp:align>center</wp:align>
+            </wp:positionH>
+            <wp:positionV relativeFrom="paragraph">
+              <wp:posOffset>635</wp:posOffset>
+            </wp:positionV>
+            <wp:extent cx="5940425" cy="528955"/>
             <wp:effectExtent l="0" t="0" r="0" b="0"/>
-            <wp:docPr id="5" name="Imagen5"/>
+            <wp:wrapSquare wrapText="largest"/>
+            <wp:docPr id="5" name="Imagen13"/>
             <wp:cNvGraphicFramePr>
               <a:graphicFrameLocks xmlns:a="http://schemas.openxmlformats.org/drawingml/2006/main" noChangeAspect="1"/>
             </wp:cNvGraphicFramePr>
@@ -614,13 +706,234 @@
               <a:graphicData uri="http://schemas.openxmlformats.org/drawingml/2006/picture">
                 <pic:pic xmlns:pic="http://schemas.openxmlformats.org/drawingml/2006/picture">
                   <pic:nvPicPr>
-                    <pic:cNvPr id="5" name="Imagen5"/>
+                    <pic:cNvPr id="5" name="Imagen13"/>
                     <pic:cNvPicPr>
                       <a:picLocks noChangeAspect="1" noChangeArrowheads="1"/>
                     </pic:cNvPicPr>
                   </pic:nvPicPr>
                   <pic:blipFill>
                     <a:blip r:embed="rId6"/>
+                    <a:stretch>
+                      <a:fillRect/>
+                    </a:stretch>
+                  </pic:blipFill>
+                  <pic:spPr bwMode="auto">
+                    <a:xfrm>
+                      <a:off x="0" y="0"/>
+                      <a:ext cx="5940425" cy="528955"/>
+                    </a:xfrm>
+                    <a:prstGeom prst="rect">
+                      <a:avLst/>
+                    </a:prstGeom>
+                    <a:noFill/>
+                  </pic:spPr>
+                </pic:pic>
+              </a:graphicData>
+            </a:graphic>
+          </wp:anchor>
+        </w:drawing>
+      </w:r>
+    </w:p>
+    <w:p>
+      <w:pPr>
+        <w:pStyle w:val="Normal"/>
+        <w:shd w:val="nil" w:color="000000"/>
+        <w:jc w:val="both"/>
+        <w:rPr>
+          <w:highlight w:val="none"/>
+          <w:lang w:val="es-AR"/>
+        </w:rPr>
+      </w:pPr>
+      <w:r>
+        <w:rPr>
+          <w:b/>
+          <w:bCs/>
+          <w:lang w:val="es-AR"/>
+        </w:rPr>
+        <w:t>Registro Provisorio:</w:t>
+      </w:r>
+    </w:p>
+    <w:p>
+      <w:pPr>
+        <w:pStyle w:val="Normal"/>
+        <w:shd w:val="nil" w:color="000000"/>
+        <w:jc w:val="both"/>
+        <w:rPr>
+          <w:b w:val="false"/>
+          <w:bCs w:val="false"/>
+          <w:lang w:val="es-AR"/>
+        </w:rPr>
+      </w:pPr>
+      <w:r>
+        <w:rPr>
+          <w:b w:val="false"/>
+          <w:bCs w:val="false"/>
+          <w:lang w:val="es-AR"/>
+        </w:rPr>
+        <w:t>En esta opción se habilita una caja de texto, donde se deberá colocar una descripción que sea representativa de la causa, hasta poder obtener el número de la causa, donde posteriormente se realizará el registro definitivo.</w:t>
+      </w:r>
+    </w:p>
+    <w:p>
+      <w:pPr>
+        <w:pStyle w:val="Normal"/>
+        <w:shd w:val="nil" w:color="000000"/>
+        <w:jc w:val="both"/>
+        <w:rPr>
+          <w:b w:val="false"/>
+          <w:bCs w:val="false"/>
+          <w:lang w:val="es-AR"/>
+        </w:rPr>
+      </w:pPr>
+      <w:r>
+        <w:rPr>
+          <w:b w:val="false"/>
+          <w:bCs w:val="false"/>
+          <w:lang w:val="es-AR"/>
+        </w:rPr>
+        <w:drawing>
+          <wp:anchor distT="0" distB="0" distL="0" distR="0" simplePos="0" relativeHeight="60" behindDoc="0" locked="0" layoutInCell="0" allowOverlap="1">
+            <wp:simplePos x="0" y="0"/>
+            <wp:positionH relativeFrom="column">
+              <wp:align>center</wp:align>
+            </wp:positionH>
+            <wp:positionV relativeFrom="paragraph">
+              <wp:posOffset>635</wp:posOffset>
+            </wp:positionV>
+            <wp:extent cx="5940425" cy="1056005"/>
+            <wp:effectExtent l="0" t="0" r="0" b="0"/>
+            <wp:wrapSquare wrapText="largest"/>
+            <wp:docPr id="6" name="Imagen61"/>
+            <wp:cNvGraphicFramePr>
+              <a:graphicFrameLocks xmlns:a="http://schemas.openxmlformats.org/drawingml/2006/main" noChangeAspect="1"/>
+            </wp:cNvGraphicFramePr>
+            <a:graphic xmlns:a="http://schemas.openxmlformats.org/drawingml/2006/main">
+              <a:graphicData uri="http://schemas.openxmlformats.org/drawingml/2006/picture">
+                <pic:pic xmlns:pic="http://schemas.openxmlformats.org/drawingml/2006/picture">
+                  <pic:nvPicPr>
+                    <pic:cNvPr id="6" name="Imagen61"/>
+                    <pic:cNvPicPr>
+                      <a:picLocks noChangeAspect="1" noChangeArrowheads="1"/>
+                    </pic:cNvPicPr>
+                  </pic:nvPicPr>
+                  <pic:blipFill>
+                    <a:blip r:embed="rId7"/>
+                    <a:stretch>
+                      <a:fillRect/>
+                    </a:stretch>
+                  </pic:blipFill>
+                  <pic:spPr bwMode="auto">
+                    <a:xfrm>
+                      <a:off x="0" y="0"/>
+                      <a:ext cx="5940425" cy="1056005"/>
+                    </a:xfrm>
+                    <a:prstGeom prst="rect">
+                      <a:avLst/>
+                    </a:prstGeom>
+                    <a:noFill/>
+                  </pic:spPr>
+                </pic:pic>
+              </a:graphicData>
+            </a:graphic>
+          </wp:anchor>
+        </w:drawing>
+      </w:r>
+    </w:p>
+    <w:p>
+      <w:pPr>
+        <w:pStyle w:val="Normal"/>
+        <w:shd w:val="nil" w:color="000000"/>
+        <w:jc w:val="both"/>
+        <w:rPr>
+          <w:highlight w:val="none"/>
+          <w:lang w:val="es-AR"/>
+        </w:rPr>
+      </w:pPr>
+      <w:r>
+        <w:rPr>
+          <w:b/>
+          <w:bCs/>
+          <w:lang w:val="es-AR"/>
+        </w:rPr>
+        <w:t>Registro Definitivo</w:t>
+      </w:r>
+      <w:r>
+        <w:rPr>
+          <w:lang w:val="es-AR"/>
+        </w:rPr>
+        <w:t>:</w:t>
+      </w:r>
+    </w:p>
+    <w:p>
+      <w:pPr>
+        <w:pStyle w:val="Normal"/>
+        <w:shd w:val="nil" w:color="000000"/>
+        <w:jc w:val="both"/>
+        <w:rPr>
+          <w:highlight w:val="none"/>
+          <w:lang w:val="es-AR"/>
+        </w:rPr>
+      </w:pPr>
+      <w:r>
+        <w:rPr>
+          <w:lang w:val="es-AR"/>
+        </w:rPr>
+        <w:t>Una vez presionado es</w:t>
+      </w:r>
+      <w:r>
+        <w:rPr>
+          <w:lang w:val="es-AR"/>
+        </w:rPr>
+        <w:t>a</w:t>
+      </w:r>
+      <w:r>
+        <w:rPr>
+          <w:lang w:val="es-AR"/>
+        </w:rPr>
+        <w:t xml:space="preserve"> </w:t>
+      </w:r>
+      <w:r>
+        <w:rPr>
+          <w:lang w:val="es-AR"/>
+        </w:rPr>
+        <w:t xml:space="preserve">opción, </w:t>
+      </w:r>
+      <w:r>
+        <w:rPr>
+          <w:lang w:val="es-AR"/>
+        </w:rPr>
+        <w:t>se abre un panel con los datos de la causa nueva:</w:t>
+      </w:r>
+    </w:p>
+    <w:p>
+      <w:pPr>
+        <w:pStyle w:val="Normal"/>
+        <w:shd w:val="nil" w:color="000000"/>
+        <w:jc w:val="both"/>
+        <w:rPr>
+          <w:highlight w:val="none"/>
+        </w:rPr>
+      </w:pPr>
+      <w:r>
+        <w:rPr/>
+        <w:drawing>
+          <wp:inline distT="0" distB="0" distL="0" distR="0">
+            <wp:extent cx="5940425" cy="1886585"/>
+            <wp:effectExtent l="0" t="0" r="0" b="0"/>
+            <wp:docPr id="7" name="Imagen5"/>
+            <wp:cNvGraphicFramePr>
+              <a:graphicFrameLocks xmlns:a="http://schemas.openxmlformats.org/drawingml/2006/main" noChangeAspect="1"/>
+            </wp:cNvGraphicFramePr>
+            <a:graphic xmlns:a="http://schemas.openxmlformats.org/drawingml/2006/main">
+              <a:graphicData uri="http://schemas.openxmlformats.org/drawingml/2006/picture">
+                <pic:pic xmlns:pic="http://schemas.openxmlformats.org/drawingml/2006/picture">
+                  <pic:nvPicPr>
+                    <pic:cNvPr id="7" name="Imagen5"/>
+                    <pic:cNvPicPr>
+                      <a:picLocks noChangeAspect="1" noChangeArrowheads="1"/>
+                    </pic:cNvPicPr>
+                  </pic:nvPicPr>
+                  <pic:blipFill>
+                    <a:blip r:embed="rId8"/>
                     <a:stretch>
                       <a:fillRect/>
                     </a:stretch>
@@ -707,7 +1020,7 @@
           <wp:inline distT="0" distB="0" distL="0" distR="0">
             <wp:extent cx="5940425" cy="2258060"/>
             <wp:effectExtent l="0" t="0" r="0" b="0"/>
-            <wp:docPr id="6" name="Imagen6"/>
+            <wp:docPr id="8" name="Imagen6"/>
             <wp:cNvGraphicFramePr>
               <a:graphicFrameLocks xmlns:a="http://schemas.openxmlformats.org/drawingml/2006/main" noChangeAspect="1"/>
             </wp:cNvGraphicFramePr>
@@ -715,13 +1028,13 @@
               <a:graphicData uri="http://schemas.openxmlformats.org/drawingml/2006/picture">
                 <pic:pic xmlns:pic="http://schemas.openxmlformats.org/drawingml/2006/picture">
                   <pic:nvPicPr>
-                    <pic:cNvPr id="6" name="Imagen6"/>
+                    <pic:cNvPr id="8" name="Imagen6"/>
                     <pic:cNvPicPr>
                       <a:picLocks noChangeAspect="1" noChangeArrowheads="1"/>
                     </pic:cNvPicPr>
                   </pic:nvPicPr>
                   <pic:blipFill>
-                    <a:blip r:embed="rId7"/>
+                    <a:blip r:embed="rId9"/>
                     <a:stretch>
                       <a:fillRect/>
                     </a:stretch>
@@ -775,7 +1088,7 @@
           <wp:inline distT="0" distB="0" distL="0" distR="0">
             <wp:extent cx="5940425" cy="2029460"/>
             <wp:effectExtent l="0" t="0" r="0" b="0"/>
-            <wp:docPr id="7" name="Imagen7"/>
+            <wp:docPr id="9" name="Imagen7"/>
             <wp:cNvGraphicFramePr>
               <a:graphicFrameLocks xmlns:a="http://schemas.openxmlformats.org/drawingml/2006/main" noChangeAspect="1"/>
             </wp:cNvGraphicFramePr>
@@ -783,13 +1096,13 @@
               <a:graphicData uri="http://schemas.openxmlformats.org/drawingml/2006/picture">
                 <pic:pic xmlns:pic="http://schemas.openxmlformats.org/drawingml/2006/picture">
                   <pic:nvPicPr>
-                    <pic:cNvPr id="7" name="Imagen7"/>
+                    <pic:cNvPr id="9" name="Imagen7"/>
                     <pic:cNvPicPr>
                       <a:picLocks noChangeAspect="1" noChangeArrowheads="1"/>
                     </pic:cNvPicPr>
                   </pic:nvPicPr>
                   <pic:blipFill>
-                    <a:blip r:embed="rId8"/>
+                    <a:blip r:embed="rId10"/>
                     <a:stretch>
                       <a:fillRect/>
                     </a:stretch>
@@ -842,7 +1155,40 @@
         <w:rPr>
           <w:lang w:val="es-AR"/>
         </w:rPr>
-        <w:t>Una vez creada la causa, pasamos a la pantalla donde se cargarán los datos del aportante:</w:t>
+        <w:t>Una vez creada la causa, pasamos a la pantalla donde se cargarán los datos del aportante</w:t>
+      </w:r>
+      <w:r>
+        <w:rPr>
+          <w:lang w:val="es-AR"/>
+        </w:rPr>
+        <w:t xml:space="preserve">. </w:t>
+      </w:r>
+      <w:r>
+        <w:rPr>
+          <w:lang w:val="es-AR"/>
+        </w:rPr>
+        <w:t>Si se hace clic en la opción “</w:t>
+      </w:r>
+      <w:r>
+        <w:rPr>
+          <w:rFonts w:ascii="Segoe UI;sans-serif" w:hAnsi="Segoe UI;sans-serif"/>
+          <w:b/>
+          <w:i w:val="false"/>
+          <w:caps w:val="false"/>
+          <w:smallCaps w:val="false"/>
+          <w:color w:val="12263A"/>
+          <w:spacing w:val="0"/>
+          <w:sz w:val="21"/>
+        </w:rPr>
+        <w:t>Aportante anónimo o de identidad reservada</w:t>
+      </w:r>
+      <w:r>
+        <w:rPr/>
+        <w:t xml:space="preserve">“, </w:t>
+      </w:r>
+      <w:r>
+        <w:rPr/>
+        <w:t>esto permitirá generar actas con datos anonimizados del aportante, en razón de haber éste solicitado expresamente que se traten sus datos personales con privacidad y evitar así su divulgación, quedando los mismos reservados bajo llave en caja fuerte de la dependencia judicial.</w:t>
       </w:r>
     </w:p>
     <w:p>
@@ -856,11 +1202,64 @@
       </w:pPr>
       <w:r>
         <w:rPr/>
+      </w:r>
+    </w:p>
+    <w:p>
+      <w:pPr>
+        <w:pStyle w:val="Normal"/>
+        <w:jc w:val="both"/>
+        <w:rPr>
+          <w:highlight w:val="none"/>
+          <w:lang w:val="es-AR"/>
+        </w:rPr>
+      </w:pPr>
+      <w:r>
+        <w:rPr>
+          <w:lang w:val="es-AR"/>
+        </w:rPr>
+      </w:r>
+    </w:p>
+    <w:p>
+      <w:pPr>
+        <w:pStyle w:val="Normal"/>
+        <w:jc w:val="both"/>
+        <w:rPr>
+          <w:highlight w:val="none"/>
+          <w:lang w:val="es-AR"/>
+        </w:rPr>
+      </w:pPr>
+      <w:r>
+        <w:rPr>
+          <w:lang w:val="es-AR"/>
+        </w:rPr>
+      </w:r>
+    </w:p>
+    <w:p>
+      <w:pPr>
+        <w:pStyle w:val="Normal"/>
+        <w:jc w:val="both"/>
+        <w:rPr>
+          <w:highlight w:val="none"/>
+          <w:lang w:val="es-AR"/>
+        </w:rPr>
+      </w:pPr>
+      <w:r>
+        <w:rPr>
+          <w:lang w:val="es-AR"/>
+        </w:rPr>
         <w:drawing>
-          <wp:inline distT="0" distB="0" distL="0" distR="0">
-            <wp:extent cx="5940425" cy="1225550"/>
+          <wp:anchor distT="0" distB="0" distL="0" distR="0" simplePos="0" relativeHeight="63" behindDoc="0" locked="0" layoutInCell="0" allowOverlap="1">
+            <wp:simplePos x="0" y="0"/>
+            <wp:positionH relativeFrom="column">
+              <wp:posOffset>0</wp:posOffset>
+            </wp:positionH>
+            <wp:positionV relativeFrom="paragraph">
+              <wp:posOffset>126365</wp:posOffset>
+            </wp:positionV>
+            <wp:extent cx="5940425" cy="1725930"/>
             <wp:effectExtent l="0" t="0" r="0" b="0"/>
-            <wp:docPr id="8" name="Imagen8"/>
+            <wp:wrapSquare wrapText="largest"/>
+            <wp:docPr id="10" name="Imagen8"/>
             <wp:cNvGraphicFramePr>
               <a:graphicFrameLocks xmlns:a="http://schemas.openxmlformats.org/drawingml/2006/main" noChangeAspect="1"/>
             </wp:cNvGraphicFramePr>
@@ -868,13 +1267,13 @@
               <a:graphicData uri="http://schemas.openxmlformats.org/drawingml/2006/picture">
                 <pic:pic xmlns:pic="http://schemas.openxmlformats.org/drawingml/2006/picture">
                   <pic:nvPicPr>
-                    <pic:cNvPr id="8" name="Imagen8"/>
+                    <pic:cNvPr id="10" name="Imagen8"/>
                     <pic:cNvPicPr>
                       <a:picLocks noChangeAspect="1" noChangeArrowheads="1"/>
                     </pic:cNvPicPr>
                   </pic:nvPicPr>
                   <pic:blipFill>
-                    <a:blip r:embed="rId9"/>
+                    <a:blip r:embed="rId11"/>
                     <a:stretch>
                       <a:fillRect/>
                     </a:stretch>
@@ -882,7 +1281,7 @@
                   <pic:spPr bwMode="auto">
                     <a:xfrm>
                       <a:off x="0" y="0"/>
-                      <a:ext cx="5940425" cy="1225550"/>
+                      <a:ext cx="5940425" cy="1725930"/>
                     </a:xfrm>
                     <a:prstGeom prst="rect">
                       <a:avLst/>
@@ -892,13 +1291,14 @@
                 </pic:pic>
               </a:graphicData>
             </a:graphic>
-          </wp:inline>
+          </wp:anchor>
         </w:drawing>
       </w:r>
     </w:p>
     <w:p>
       <w:pPr>
         <w:pStyle w:val="Normal"/>
+        <w:jc w:val="both"/>
         <w:rPr>
           <w:highlight w:val="none"/>
           <w:lang w:val="es-AR"/>
@@ -908,12 +1308,80 @@
         <w:rPr>
           <w:lang w:val="es-AR"/>
         </w:rPr>
-        <w:t>Allí todos los datos son obligatorios, nombre y apellido completo, DNI y caracter (testimonial o imputado); luego el sistema prevée la carga de la foto del aportante.</w:t>
-      </w:r>
-    </w:p>
-    <w:p>
-      <w:pPr>
-        <w:pStyle w:val="Normal"/>
+        <w:t xml:space="preserve">Allí </w:t>
+      </w:r>
+      <w:r>
+        <w:rPr>
+          <w:lang w:val="es-AR"/>
+        </w:rPr>
+        <w:t>se deberán cargar</w:t>
+      </w:r>
+      <w:r>
+        <w:rPr>
+          <w:lang w:val="es-AR"/>
+        </w:rPr>
+        <w:t xml:space="preserve"> los datos </w:t>
+      </w:r>
+      <w:r>
+        <w:rPr>
+          <w:lang w:val="es-AR"/>
+        </w:rPr>
+        <w:t>de la persona aportante, solo son obligatorios el</w:t>
+      </w:r>
+      <w:r>
+        <w:rPr>
+          <w:lang w:val="es-AR"/>
+        </w:rPr>
+        <w:t xml:space="preserve"> nombre y apellido completo, </w:t>
+      </w:r>
+      <w:r>
+        <w:rPr>
+          <w:lang w:val="es-AR"/>
+        </w:rPr>
+        <w:t xml:space="preserve">número de </w:t>
+      </w:r>
+      <w:r>
+        <w:rPr>
+          <w:lang w:val="es-AR"/>
+        </w:rPr>
+        <w:t>DNI y carácter (</w:t>
+      </w:r>
+      <w:r>
+        <w:rPr>
+          <w:lang w:val="es-AR"/>
+        </w:rPr>
+        <w:t>aportante-testigo, aportante-imputado, aportante-menor</w:t>
+      </w:r>
+      <w:r>
+        <w:rPr>
+          <w:lang w:val="es-AR"/>
+        </w:rPr>
+        <w:t>).</w:t>
+      </w:r>
+    </w:p>
+    <w:p>
+      <w:pPr>
+        <w:pStyle w:val="Normal"/>
+        <w:jc w:val="both"/>
+        <w:rPr>
+          <w:i/>
+          <w:iCs/>
+          <w:lang w:val="es-AR"/>
+        </w:rPr>
+      </w:pPr>
+      <w:r>
+        <w:rPr>
+          <w:i/>
+          <w:iCs/>
+          <w:lang w:val="es-AR"/>
+        </w:rPr>
+        <w:t>Téngase en cuenta que el carácter del aportante reviste vital importancia, dado que se diferencian el tipo de acta que el sistema genera, dado que la figura de la persona que aporta la evidencia cambia, y las previsiones legales del acto en consecuencia, también lo hacen (por ejemplo: aportante-testigo, acta con previsiones del Art.275 de la Ley 965 N).</w:t>
+      </w:r>
+    </w:p>
+    <w:p>
+      <w:pPr>
+        <w:pStyle w:val="Normal"/>
+        <w:jc w:val="both"/>
         <w:rPr>
           <w:highlight w:val="none"/>
           <w:lang w:val="es-AR"/>
@@ -923,23 +1391,59 @@
         <w:rPr>
           <w:lang w:val="es-AR"/>
         </w:rPr>
-        <w:t>Esto se puede realizar de dos maneras, que en la PC operadora se cuente con la foto del frente del documento nacional de identidad, o en su defecto, al presionar “Sacar foto”, active la cámara del dispositivo móvil conectado a la PC, donde luego de capturar la foto del frente del documento, el cual debe estar bien centrado y nitido, esta es enviada a la aplicación:</w:t>
-      </w:r>
-    </w:p>
-    <w:p>
-      <w:pPr>
-        <w:pStyle w:val="Normal"/>
+        <w:t>L</w:t>
+      </w:r>
+      <w:r>
+        <w:rPr>
+          <w:lang w:val="es-AR"/>
+        </w:rPr>
+        <w:t xml:space="preserve">uego el sistema prevé la carga de la foto del aportante, </w:t>
+      </w:r>
+      <w:r>
+        <w:rPr>
+          <w:lang w:val="es-AR"/>
+        </w:rPr>
+        <w:t>esto es opcional, si se tiene el documento a mano</w:t>
+      </w:r>
+      <w:r>
+        <w:rPr>
+          <w:lang w:val="es-AR"/>
+        </w:rPr>
+        <w:t xml:space="preserve">. </w:t>
+      </w:r>
+      <w:r>
+        <w:rPr>
+          <w:lang w:val="es-AR"/>
+        </w:rPr>
+        <w:t>En caso de que no se tenga el DNI, se debe tildar la opción “Continuar sin la foto del aportante”, se continua con el guardado de los datos del aportante, donde se deberá justificar porque no se tiene el documento consigo (por pérdida, robo, incendio, etc.).</w:t>
+      </w:r>
+    </w:p>
+    <w:p>
+      <w:pPr>
+        <w:pStyle w:val="Normal"/>
+        <w:jc w:val="both"/>
         <w:rPr>
           <w:highlight w:val="none"/>
-        </w:rPr>
-      </w:pPr>
-      <w:r>
-        <w:rPr/>
+          <w:lang w:val="es-AR"/>
+        </w:rPr>
+      </w:pPr>
+      <w:r>
+        <w:rPr>
+          <w:lang w:val="es-AR"/>
+        </w:rPr>
         <w:drawing>
-          <wp:inline distT="0" distB="0" distL="0" distR="0">
-            <wp:extent cx="5940425" cy="1235075"/>
+          <wp:anchor distT="0" distB="0" distL="0" distR="0" simplePos="0" relativeHeight="61" behindDoc="0" locked="0" layoutInCell="0" allowOverlap="1">
+            <wp:simplePos x="0" y="0"/>
+            <wp:positionH relativeFrom="column">
+              <wp:posOffset>29845</wp:posOffset>
+            </wp:positionH>
+            <wp:positionV relativeFrom="paragraph">
+              <wp:posOffset>-27940</wp:posOffset>
+            </wp:positionV>
+            <wp:extent cx="5940425" cy="1058545"/>
             <wp:effectExtent l="0" t="0" r="0" b="0"/>
-            <wp:docPr id="9" name="Imagen9"/>
+            <wp:wrapSquare wrapText="largest"/>
+            <wp:docPr id="11" name="Imagen62"/>
             <wp:cNvGraphicFramePr>
               <a:graphicFrameLocks xmlns:a="http://schemas.openxmlformats.org/drawingml/2006/main" noChangeAspect="1"/>
             </wp:cNvGraphicFramePr>
@@ -947,13 +1451,13 @@
               <a:graphicData uri="http://schemas.openxmlformats.org/drawingml/2006/picture">
                 <pic:pic xmlns:pic="http://schemas.openxmlformats.org/drawingml/2006/picture">
                   <pic:nvPicPr>
-                    <pic:cNvPr id="9" name="Imagen9"/>
+                    <pic:cNvPr id="11" name="Imagen62"/>
                     <pic:cNvPicPr>
                       <a:picLocks noChangeAspect="1" noChangeArrowheads="1"/>
                     </pic:cNvPicPr>
                   </pic:nvPicPr>
                   <pic:blipFill>
-                    <a:blip r:embed="rId10"/>
+                    <a:blip r:embed="rId12"/>
                     <a:stretch>
                       <a:fillRect/>
                     </a:stretch>
@@ -961,7 +1465,7 @@
                   <pic:spPr bwMode="auto">
                     <a:xfrm>
                       <a:off x="0" y="0"/>
-                      <a:ext cx="5940425" cy="1235075"/>
+                      <a:ext cx="5940425" cy="1058545"/>
                     </a:xfrm>
                     <a:prstGeom prst="rect">
                       <a:avLst/>
@@ -971,7 +1475,7 @@
                 </pic:pic>
               </a:graphicData>
             </a:graphic>
-          </wp:inline>
+          </wp:anchor>
         </w:drawing>
       </w:r>
     </w:p>
@@ -987,7 +1491,28 @@
         <w:rPr>
           <w:lang w:val="es-AR"/>
         </w:rPr>
-        <w:t xml:space="preserve">Al presionar el botón “Sacar foto”: </w:t>
+        <w:t>Cuando se tiene el documento a mano, se debe proceder de la siguiente manera:</w:t>
+      </w:r>
+    </w:p>
+    <w:p>
+      <w:pPr>
+        <w:pStyle w:val="Normal"/>
+        <w:rPr>
+          <w:highlight w:val="none"/>
+          <w:lang w:val="es-AR"/>
+        </w:rPr>
+      </w:pPr>
+      <w:r>
+        <w:rPr>
+          <w:lang w:val="es-AR"/>
+        </w:rPr>
+        <w:t>E</w:t>
+      </w:r>
+      <w:r>
+        <w:rPr>
+          <w:lang w:val="es-AR"/>
+        </w:rPr>
+        <w:t>n la PC operadora se cuente con la foto del frente del documento nacional de identidad, o en su defecto, al presionar “Sacar foto”, active la cámara del dispositivo móvil conectado a la PC, donde luego de capturar la foto del frente del documento, el cual debe estar bien centrado y nítido, esta es enviada a la aplicación:</w:t>
       </w:r>
     </w:p>
     <w:p>
@@ -1000,10 +1525,18 @@
       <w:r>
         <w:rPr/>
         <w:drawing>
-          <wp:inline distT="0" distB="0" distL="0" distR="0">
-            <wp:extent cx="4981575" cy="1695450"/>
+          <wp:anchor distT="0" distB="0" distL="0" distR="0" simplePos="0" relativeHeight="62" behindDoc="0" locked="0" layoutInCell="0" allowOverlap="1">
+            <wp:simplePos x="0" y="0"/>
+            <wp:positionH relativeFrom="column">
+              <wp:align>center</wp:align>
+            </wp:positionH>
+            <wp:positionV relativeFrom="paragraph">
+              <wp:posOffset>635</wp:posOffset>
+            </wp:positionV>
+            <wp:extent cx="5940425" cy="1725930"/>
             <wp:effectExtent l="0" t="0" r="0" b="0"/>
-            <wp:docPr id="10" name="Imagen10"/>
+            <wp:wrapSquare wrapText="largest"/>
+            <wp:docPr id="12" name="Imagen9"/>
             <wp:cNvGraphicFramePr>
               <a:graphicFrameLocks xmlns:a="http://schemas.openxmlformats.org/drawingml/2006/main" noChangeAspect="1"/>
             </wp:cNvGraphicFramePr>
@@ -1011,13 +1544,77 @@
               <a:graphicData uri="http://schemas.openxmlformats.org/drawingml/2006/picture">
                 <pic:pic xmlns:pic="http://schemas.openxmlformats.org/drawingml/2006/picture">
                   <pic:nvPicPr>
-                    <pic:cNvPr id="10" name="Imagen10"/>
+                    <pic:cNvPr id="12" name="Imagen9"/>
                     <pic:cNvPicPr>
                       <a:picLocks noChangeAspect="1" noChangeArrowheads="1"/>
                     </pic:cNvPicPr>
                   </pic:nvPicPr>
                   <pic:blipFill>
-                    <a:blip r:embed="rId11"/>
+                    <a:blip r:embed="rId13"/>
+                    <a:stretch>
+                      <a:fillRect/>
+                    </a:stretch>
+                  </pic:blipFill>
+                  <pic:spPr bwMode="auto">
+                    <a:xfrm>
+                      <a:off x="0" y="0"/>
+                      <a:ext cx="5940425" cy="1725930"/>
+                    </a:xfrm>
+                    <a:prstGeom prst="rect">
+                      <a:avLst/>
+                    </a:prstGeom>
+                    <a:noFill/>
+                  </pic:spPr>
+                </pic:pic>
+              </a:graphicData>
+            </a:graphic>
+          </wp:anchor>
+        </w:drawing>
+      </w:r>
+    </w:p>
+    <w:p>
+      <w:pPr>
+        <w:pStyle w:val="Normal"/>
+        <w:rPr>
+          <w:highlight w:val="none"/>
+          <w:lang w:val="es-AR"/>
+        </w:rPr>
+      </w:pPr>
+      <w:r>
+        <w:rPr>
+          <w:lang w:val="es-AR"/>
+        </w:rPr>
+        <w:t xml:space="preserve">Al presionar el botón “Sacar foto”: </w:t>
+      </w:r>
+    </w:p>
+    <w:p>
+      <w:pPr>
+        <w:pStyle w:val="Normal"/>
+        <w:rPr>
+          <w:highlight w:val="none"/>
+        </w:rPr>
+      </w:pPr>
+      <w:r>
+        <w:rPr/>
+        <w:drawing>
+          <wp:inline distT="0" distB="0" distL="0" distR="0">
+            <wp:extent cx="4981575" cy="1695450"/>
+            <wp:effectExtent l="0" t="0" r="0" b="0"/>
+            <wp:docPr id="13" name="Imagen10"/>
+            <wp:cNvGraphicFramePr>
+              <a:graphicFrameLocks xmlns:a="http://schemas.openxmlformats.org/drawingml/2006/main" noChangeAspect="1"/>
+            </wp:cNvGraphicFramePr>
+            <a:graphic xmlns:a="http://schemas.openxmlformats.org/drawingml/2006/main">
+              <a:graphicData uri="http://schemas.openxmlformats.org/drawingml/2006/picture">
+                <pic:pic xmlns:pic="http://schemas.openxmlformats.org/drawingml/2006/picture">
+                  <pic:nvPicPr>
+                    <pic:cNvPr id="13" name="Imagen10"/>
+                    <pic:cNvPicPr>
+                      <a:picLocks noChangeAspect="1" noChangeArrowheads="1"/>
+                    </pic:cNvPicPr>
+                  </pic:nvPicPr>
+                  <pic:blipFill>
+                    <a:blip r:embed="rId14"/>
                     <a:stretch>
                       <a:fillRect/>
                     </a:stretch>
@@ -1067,7 +1664,7 @@
           <wp:inline distT="0" distB="0" distL="0" distR="0">
             <wp:extent cx="5940425" cy="2182495"/>
             <wp:effectExtent l="0" t="0" r="0" b="0"/>
-            <wp:docPr id="11" name="Imagen11"/>
+            <wp:docPr id="14" name="Imagen11"/>
             <wp:cNvGraphicFramePr>
               <a:graphicFrameLocks xmlns:a="http://schemas.openxmlformats.org/drawingml/2006/main" noChangeAspect="1"/>
             </wp:cNvGraphicFramePr>
@@ -1075,13 +1672,13 @@
               <a:graphicData uri="http://schemas.openxmlformats.org/drawingml/2006/picture">
                 <pic:pic xmlns:pic="http://schemas.openxmlformats.org/drawingml/2006/picture">
                   <pic:nvPicPr>
-                    <pic:cNvPr id="11" name="Imagen11"/>
+                    <pic:cNvPr id="14" name="Imagen11"/>
                     <pic:cNvPicPr>
                       <a:picLocks noChangeAspect="1" noChangeArrowheads="1"/>
                     </pic:cNvPicPr>
                   </pic:nvPicPr>
                   <pic:blipFill>
-                    <a:blip r:embed="rId12"/>
+                    <a:blip r:embed="rId15"/>
                     <a:stretch>
                       <a:fillRect/>
                     </a:stretch>
@@ -1131,7 +1728,7 @@
           <wp:inline distT="0" distB="0" distL="0" distR="0">
             <wp:extent cx="5940425" cy="1401445"/>
             <wp:effectExtent l="0" t="0" r="0" b="0"/>
-            <wp:docPr id="12" name="Imagen12"/>
+            <wp:docPr id="15" name="Imagen12"/>
             <wp:cNvGraphicFramePr>
               <a:graphicFrameLocks xmlns:a="http://schemas.openxmlformats.org/drawingml/2006/main" noChangeAspect="1"/>
             </wp:cNvGraphicFramePr>
@@ -1139,13 +1736,13 @@
               <a:graphicData uri="http://schemas.openxmlformats.org/drawingml/2006/picture">
                 <pic:pic xmlns:pic="http://schemas.openxmlformats.org/drawingml/2006/picture">
                   <pic:nvPicPr>
-                    <pic:cNvPr id="12" name="Imagen12"/>
+                    <pic:cNvPr id="15" name="Imagen12"/>
                     <pic:cNvPicPr>
                       <a:picLocks noChangeAspect="1" noChangeArrowheads="1"/>
                     </pic:cNvPicPr>
                   </pic:nvPicPr>
                   <pic:blipFill>
-                    <a:blip r:embed="rId13"/>
+                    <a:blip r:embed="rId16"/>
                     <a:stretch>
                       <a:fillRect/>
                     </a:stretch>
@@ -1179,7 +1776,7 @@
         <w:rPr>
           <w:lang w:val="es-AR"/>
         </w:rPr>
-        <w:t>Téngase en cuenta que el sistema tiene una verificación de la imágen capturada, si la misma no es una foto del frente del DNI, o ésta no esta centrada, o no esta bien capturada, le mostrará una alerta al operador haciéndole saber que deberá repetir el proceso de captura. Esto es los efectos de no adjuntar cualquier imagen/foto, y para que dicha imagen pueda ser clara y nitida, dado que la misma estará tanto en el informe final de la extracción, como en el acta de finalización del proceso.</w:t>
+        <w:t>Téngase en cuenta que el sistema tiene una verificación de la imágen capturada, si la misma no es una foto del frente del DNI, o ésta no esta centrada, o no esta bien capturada, le mostrará una alerta al operador haciéndole saber que deberá repetir el proceso de captura. Esto es los efectos de no adjuntar cualquier imagen/foto, y para que dicha imagen pueda ser clara y nítida, dado que la misma estará tanto en el informe final de la extracción, como en el acta de finalización del proceso.</w:t>
       </w:r>
     </w:p>
     <w:p>
@@ -1191,6 +1788,52 @@
       </w:pPr>
       <w:r>
         <w:rPr/>
+        <w:drawing>
+          <wp:anchor distT="0" distB="0" distL="0" distR="0" simplePos="0" relativeHeight="64" behindDoc="0" locked="0" layoutInCell="0" allowOverlap="1">
+            <wp:simplePos x="0" y="0"/>
+            <wp:positionH relativeFrom="column">
+              <wp:align>center</wp:align>
+            </wp:positionH>
+            <wp:positionV relativeFrom="paragraph">
+              <wp:posOffset>635</wp:posOffset>
+            </wp:positionV>
+            <wp:extent cx="3736975" cy="2949575"/>
+            <wp:effectExtent l="0" t="0" r="0" b="0"/>
+            <wp:wrapSquare wrapText="largest"/>
+            <wp:docPr id="16" name="Imagen63"/>
+            <wp:cNvGraphicFramePr>
+              <a:graphicFrameLocks xmlns:a="http://schemas.openxmlformats.org/drawingml/2006/main" noChangeAspect="1"/>
+            </wp:cNvGraphicFramePr>
+            <a:graphic xmlns:a="http://schemas.openxmlformats.org/drawingml/2006/main">
+              <a:graphicData uri="http://schemas.openxmlformats.org/drawingml/2006/picture">
+                <pic:pic xmlns:pic="http://schemas.openxmlformats.org/drawingml/2006/picture">
+                  <pic:nvPicPr>
+                    <pic:cNvPr id="16" name="Imagen63"/>
+                    <pic:cNvPicPr>
+                      <a:picLocks noChangeAspect="1" noChangeArrowheads="1"/>
+                    </pic:cNvPicPr>
+                  </pic:nvPicPr>
+                  <pic:blipFill>
+                    <a:blip r:embed="rId17"/>
+                    <a:stretch>
+                      <a:fillRect/>
+                    </a:stretch>
+                  </pic:blipFill>
+                  <pic:spPr bwMode="auto">
+                    <a:xfrm>
+                      <a:off x="0" y="0"/>
+                      <a:ext cx="3736975" cy="2949575"/>
+                    </a:xfrm>
+                    <a:prstGeom prst="rect">
+                      <a:avLst/>
+                    </a:prstGeom>
+                    <a:noFill/>
+                  </pic:spPr>
+                </pic:pic>
+              </a:graphicData>
+            </a:graphic>
+          </wp:anchor>
+        </w:drawing>
       </w:r>
     </w:p>
     <w:p>
@@ -1208,6 +1851,176 @@
           <w:szCs w:val="18"/>
           <w:lang w:val="es-AR"/>
         </w:rPr>
+      </w:r>
+    </w:p>
+    <w:p>
+      <w:pPr>
+        <w:pStyle w:val="Normal"/>
+        <w:rPr>
+          <w:sz w:val="18"/>
+          <w:szCs w:val="18"/>
+          <w:highlight w:val="none"/>
+        </w:rPr>
+      </w:pPr>
+      <w:r>
+        <w:rPr>
+          <w:sz w:val="18"/>
+          <w:szCs w:val="18"/>
+          <w:lang w:val="es-AR"/>
+        </w:rPr>
+      </w:r>
+    </w:p>
+    <w:p>
+      <w:pPr>
+        <w:pStyle w:val="Normal"/>
+        <w:rPr>
+          <w:sz w:val="18"/>
+          <w:szCs w:val="18"/>
+          <w:highlight w:val="none"/>
+        </w:rPr>
+      </w:pPr>
+      <w:r>
+        <w:rPr>
+          <w:sz w:val="18"/>
+          <w:szCs w:val="18"/>
+          <w:lang w:val="es-AR"/>
+        </w:rPr>
+      </w:r>
+    </w:p>
+    <w:p>
+      <w:pPr>
+        <w:pStyle w:val="Normal"/>
+        <w:rPr>
+          <w:sz w:val="18"/>
+          <w:szCs w:val="18"/>
+          <w:highlight w:val="none"/>
+        </w:rPr>
+      </w:pPr>
+      <w:r>
+        <w:rPr>
+          <w:sz w:val="18"/>
+          <w:szCs w:val="18"/>
+          <w:lang w:val="es-AR"/>
+        </w:rPr>
+      </w:r>
+    </w:p>
+    <w:p>
+      <w:pPr>
+        <w:pStyle w:val="Normal"/>
+        <w:rPr>
+          <w:sz w:val="18"/>
+          <w:szCs w:val="18"/>
+          <w:highlight w:val="none"/>
+        </w:rPr>
+      </w:pPr>
+      <w:r>
+        <w:rPr>
+          <w:sz w:val="18"/>
+          <w:szCs w:val="18"/>
+          <w:lang w:val="es-AR"/>
+        </w:rPr>
+      </w:r>
+    </w:p>
+    <w:p>
+      <w:pPr>
+        <w:pStyle w:val="Normal"/>
+        <w:rPr>
+          <w:sz w:val="18"/>
+          <w:szCs w:val="18"/>
+          <w:highlight w:val="none"/>
+        </w:rPr>
+      </w:pPr>
+      <w:r>
+        <w:rPr>
+          <w:sz w:val="18"/>
+          <w:szCs w:val="18"/>
+          <w:lang w:val="es-AR"/>
+        </w:rPr>
+      </w:r>
+    </w:p>
+    <w:p>
+      <w:pPr>
+        <w:pStyle w:val="Normal"/>
+        <w:rPr>
+          <w:sz w:val="18"/>
+          <w:szCs w:val="18"/>
+          <w:highlight w:val="none"/>
+        </w:rPr>
+      </w:pPr>
+      <w:r>
+        <w:rPr>
+          <w:sz w:val="18"/>
+          <w:szCs w:val="18"/>
+          <w:lang w:val="es-AR"/>
+        </w:rPr>
+      </w:r>
+    </w:p>
+    <w:p>
+      <w:pPr>
+        <w:pStyle w:val="Normal"/>
+        <w:rPr>
+          <w:sz w:val="18"/>
+          <w:szCs w:val="18"/>
+          <w:highlight w:val="none"/>
+        </w:rPr>
+      </w:pPr>
+      <w:r>
+        <w:rPr>
+          <w:sz w:val="18"/>
+          <w:szCs w:val="18"/>
+          <w:lang w:val="es-AR"/>
+        </w:rPr>
+      </w:r>
+    </w:p>
+    <w:p>
+      <w:pPr>
+        <w:pStyle w:val="Normal"/>
+        <w:rPr>
+          <w:sz w:val="18"/>
+          <w:szCs w:val="18"/>
+          <w:highlight w:val="none"/>
+        </w:rPr>
+      </w:pPr>
+      <w:r>
+        <w:rPr>
+          <w:sz w:val="18"/>
+          <w:szCs w:val="18"/>
+          <w:lang w:val="es-AR"/>
+        </w:rPr>
+      </w:r>
+    </w:p>
+    <w:p>
+      <w:pPr>
+        <w:pStyle w:val="Normal"/>
+        <w:rPr>
+          <w:sz w:val="18"/>
+          <w:szCs w:val="18"/>
+          <w:highlight w:val="none"/>
+        </w:rPr>
+      </w:pPr>
+      <w:r>
+        <w:rPr>
+          <w:sz w:val="18"/>
+          <w:szCs w:val="18"/>
+          <w:lang w:val="es-AR"/>
+        </w:rPr>
+      </w:r>
+    </w:p>
+    <w:p>
+      <w:pPr>
+        <w:pStyle w:val="Normal"/>
+        <w:rPr>
+          <w:sz w:val="18"/>
+          <w:szCs w:val="18"/>
+          <w:highlight w:val="none"/>
+        </w:rPr>
+      </w:pPr>
+      <w:r>
+        <w:rPr>
+          <w:sz w:val="18"/>
+          <w:szCs w:val="18"/>
+          <w:lang w:val="es-AR"/>
+        </w:rPr>
         <w:t>Ejemplo de error en la captura de la foto del aportante.-</w:t>
       </w:r>
     </w:p>
@@ -1240,7 +2053,7 @@
       <w:r>
         <w:rPr/>
         <w:drawing>
-          <wp:anchor distT="0" distB="0" distL="0" distR="0" simplePos="0" relativeHeight="60" behindDoc="0" locked="0" layoutInCell="0" allowOverlap="1">
+          <wp:anchor distT="0" distB="0" distL="0" distR="0" simplePos="0" relativeHeight="58" behindDoc="0" locked="0" layoutInCell="0" allowOverlap="1">
             <wp:simplePos x="0" y="0"/>
             <wp:positionH relativeFrom="column">
               <wp:posOffset>0</wp:posOffset>
@@ -1251,7 +2064,7 @@
             <wp:extent cx="5940425" cy="6301105"/>
             <wp:effectExtent l="0" t="0" r="0" b="0"/>
             <wp:wrapSquare wrapText="largest"/>
-            <wp:docPr id="13" name="Imagen14"/>
+            <wp:docPr id="17" name="Imagen14"/>
             <wp:cNvGraphicFramePr>
               <a:graphicFrameLocks xmlns:a="http://schemas.openxmlformats.org/drawingml/2006/main" noChangeAspect="1"/>
             </wp:cNvGraphicFramePr>
@@ -1259,13 +2072,13 @@
               <a:graphicData uri="http://schemas.openxmlformats.org/drawingml/2006/picture">
                 <pic:pic xmlns:pic="http://schemas.openxmlformats.org/drawingml/2006/picture">
                   <pic:nvPicPr>
-                    <pic:cNvPr id="13" name="Imagen14"/>
+                    <pic:cNvPr id="17" name="Imagen14"/>
                     <pic:cNvPicPr>
                       <a:picLocks noChangeAspect="1" noChangeArrowheads="1"/>
                     </pic:cNvPicPr>
                   </pic:nvPicPr>
                   <pic:blipFill>
-                    <a:blip r:embed="rId14"/>
+                    <a:blip r:embed="rId18"/>
                     <a:stretch>
                       <a:fillRect/>
                     </a:stretch>
@@ -1315,7 +2128,10 @@
         </w:rPr>
       </w:pPr>
       <w:r>
-        <w:rPr/>
+        <w:rPr>
+          <w:sz w:val="18"/>
+          <w:szCs w:val="18"/>
+        </w:rPr>
       </w:r>
     </w:p>
     <w:p>
@@ -1451,7 +2267,7 @@
           <wp:inline distT="0" distB="0" distL="0" distR="0">
             <wp:extent cx="2976245" cy="6624955"/>
             <wp:effectExtent l="0" t="0" r="0" b="0"/>
-            <wp:docPr id="14" name="Imagen15"/>
+            <wp:docPr id="18" name="Imagen15"/>
             <wp:cNvGraphicFramePr>
               <a:graphicFrameLocks xmlns:a="http://schemas.openxmlformats.org/drawingml/2006/main" noChangeAspect="1"/>
             </wp:cNvGraphicFramePr>
@@ -1459,13 +2275,13 @@
               <a:graphicData uri="http://schemas.openxmlformats.org/drawingml/2006/picture">
                 <pic:pic xmlns:pic="http://schemas.openxmlformats.org/drawingml/2006/picture">
                   <pic:nvPicPr>
-                    <pic:cNvPr id="14" name="Imagen15"/>
+                    <pic:cNvPr id="18" name="Imagen15"/>
                     <pic:cNvPicPr>
                       <a:picLocks noChangeAspect="1" noChangeArrowheads="1"/>
                     </pic:cNvPicPr>
                   </pic:nvPicPr>
                   <pic:blipFill>
-                    <a:blip r:embed="rId15"/>
+                    <a:blip r:embed="rId19"/>
                     <a:stretch>
                       <a:fillRect/>
                     </a:stretch>
@@ -1533,7 +2349,7 @@
           <wp:inline distT="0" distB="0" distL="0" distR="0">
             <wp:extent cx="3357245" cy="7473315"/>
             <wp:effectExtent l="0" t="0" r="0" b="0"/>
-            <wp:docPr id="15" name="Imagen16"/>
+            <wp:docPr id="19" name="Imagen16"/>
             <wp:cNvGraphicFramePr>
               <a:graphicFrameLocks xmlns:a="http://schemas.openxmlformats.org/drawingml/2006/main" noChangeAspect="1"/>
             </wp:cNvGraphicFramePr>
@@ -1541,13 +2357,13 @@
               <a:graphicData uri="http://schemas.openxmlformats.org/drawingml/2006/picture">
                 <pic:pic xmlns:pic="http://schemas.openxmlformats.org/drawingml/2006/picture">
                   <pic:nvPicPr>
-                    <pic:cNvPr id="15" name="Imagen16"/>
+                    <pic:cNvPr id="19" name="Imagen16"/>
                     <pic:cNvPicPr>
                       <a:picLocks noChangeAspect="1" noChangeArrowheads="1"/>
                     </pic:cNvPicPr>
                   </pic:nvPicPr>
                   <pic:blipFill>
-                    <a:blip r:embed="rId16"/>
+                    <a:blip r:embed="rId20"/>
                     <a:stretch>
                       <a:fillRect/>
                     </a:stretch>
@@ -1642,7 +2458,7 @@
           <wp:inline distT="0" distB="0" distL="0" distR="0">
             <wp:extent cx="2981325" cy="6636385"/>
             <wp:effectExtent l="0" t="0" r="0" b="0"/>
-            <wp:docPr id="16" name="Imagen17"/>
+            <wp:docPr id="20" name="Imagen17"/>
             <wp:cNvGraphicFramePr>
               <a:graphicFrameLocks xmlns:a="http://schemas.openxmlformats.org/drawingml/2006/main" noChangeAspect="1"/>
             </wp:cNvGraphicFramePr>
@@ -1650,13 +2466,13 @@
               <a:graphicData uri="http://schemas.openxmlformats.org/drawingml/2006/picture">
                 <pic:pic xmlns:pic="http://schemas.openxmlformats.org/drawingml/2006/picture">
                   <pic:nvPicPr>
-                    <pic:cNvPr id="16" name="Imagen17"/>
+                    <pic:cNvPr id="20" name="Imagen17"/>
                     <pic:cNvPicPr>
                       <a:picLocks noChangeAspect="1" noChangeArrowheads="1"/>
                     </pic:cNvPicPr>
                   </pic:nvPicPr>
                   <pic:blipFill>
-                    <a:blip r:embed="rId17"/>
+                    <a:blip r:embed="rId21"/>
                     <a:stretch>
                       <a:fillRect/>
                     </a:stretch>
@@ -1724,7 +2540,7 @@
           <wp:inline distT="0" distB="0" distL="0" distR="0">
             <wp:extent cx="3205480" cy="7135495"/>
             <wp:effectExtent l="0" t="0" r="0" b="0"/>
-            <wp:docPr id="17" name="Imagen18"/>
+            <wp:docPr id="21" name="Imagen18"/>
             <wp:cNvGraphicFramePr>
               <a:graphicFrameLocks xmlns:a="http://schemas.openxmlformats.org/drawingml/2006/main" noChangeAspect="1"/>
             </wp:cNvGraphicFramePr>
@@ -1732,13 +2548,13 @@
               <a:graphicData uri="http://schemas.openxmlformats.org/drawingml/2006/picture">
                 <pic:pic xmlns:pic="http://schemas.openxmlformats.org/drawingml/2006/picture">
                   <pic:nvPicPr>
-                    <pic:cNvPr id="17" name="Imagen18"/>
+                    <pic:cNvPr id="21" name="Imagen18"/>
                     <pic:cNvPicPr>
                       <a:picLocks noChangeAspect="1" noChangeArrowheads="1"/>
                     </pic:cNvPicPr>
                   </pic:nvPicPr>
                   <pic:blipFill>
-                    <a:blip r:embed="rId18"/>
+                    <a:blip r:embed="rId22"/>
                     <a:stretch>
                       <a:fillRect/>
                     </a:stretch>
@@ -1806,7 +2622,7 @@
           <wp:inline distT="0" distB="0" distL="0" distR="0">
             <wp:extent cx="3778885" cy="8412480"/>
             <wp:effectExtent l="0" t="0" r="0" b="0"/>
-            <wp:docPr id="18" name="Imagen19"/>
+            <wp:docPr id="22" name="Imagen19"/>
             <wp:cNvGraphicFramePr>
               <a:graphicFrameLocks xmlns:a="http://schemas.openxmlformats.org/drawingml/2006/main" noChangeAspect="1"/>
             </wp:cNvGraphicFramePr>
@@ -1814,13 +2630,13 @@
               <a:graphicData uri="http://schemas.openxmlformats.org/drawingml/2006/picture">
                 <pic:pic xmlns:pic="http://schemas.openxmlformats.org/drawingml/2006/picture">
                   <pic:nvPicPr>
-                    <pic:cNvPr id="18" name="Imagen19"/>
+                    <pic:cNvPr id="22" name="Imagen19"/>
                     <pic:cNvPicPr>
                       <a:picLocks noChangeAspect="1" noChangeArrowheads="1"/>
                     </pic:cNvPicPr>
                   </pic:nvPicPr>
                   <pic:blipFill>
-                    <a:blip r:embed="rId19"/>
+                    <a:blip r:embed="rId23"/>
                     <a:stretch>
                       <a:fillRect/>
                     </a:stretch>
@@ -1888,7 +2704,7 @@
           <wp:inline distT="0" distB="0" distL="0" distR="0">
             <wp:extent cx="3632835" cy="8087995"/>
             <wp:effectExtent l="0" t="0" r="0" b="0"/>
-            <wp:docPr id="19" name="Imagen20"/>
+            <wp:docPr id="23" name="Imagen20"/>
             <wp:cNvGraphicFramePr>
               <a:graphicFrameLocks xmlns:a="http://schemas.openxmlformats.org/drawingml/2006/main" noChangeAspect="1"/>
             </wp:cNvGraphicFramePr>
@@ -1896,13 +2712,13 @@
               <a:graphicData uri="http://schemas.openxmlformats.org/drawingml/2006/picture">
                 <pic:pic xmlns:pic="http://schemas.openxmlformats.org/drawingml/2006/picture">
                   <pic:nvPicPr>
-                    <pic:cNvPr id="19" name="Imagen20"/>
+                    <pic:cNvPr id="23" name="Imagen20"/>
                     <pic:cNvPicPr>
                       <a:picLocks noChangeAspect="1" noChangeArrowheads="1"/>
                     </pic:cNvPicPr>
                   </pic:nvPicPr>
                   <pic:blipFill>
-                    <a:blip r:embed="rId20"/>
+                    <a:blip r:embed="rId24"/>
                     <a:stretch>
                       <a:fillRect/>
                     </a:stretch>
@@ -1970,7 +2786,7 @@
           <wp:inline distT="0" distB="0" distL="0" distR="0">
             <wp:extent cx="3493135" cy="7776210"/>
             <wp:effectExtent l="0" t="0" r="0" b="0"/>
-            <wp:docPr id="20" name="Imagen21"/>
+            <wp:docPr id="24" name="Imagen21"/>
             <wp:cNvGraphicFramePr>
               <a:graphicFrameLocks xmlns:a="http://schemas.openxmlformats.org/drawingml/2006/main" noChangeAspect="1"/>
             </wp:cNvGraphicFramePr>
@@ -1978,13 +2794,13 @@
               <a:graphicData uri="http://schemas.openxmlformats.org/drawingml/2006/picture">
                 <pic:pic xmlns:pic="http://schemas.openxmlformats.org/drawingml/2006/picture">
                   <pic:nvPicPr>
-                    <pic:cNvPr id="20" name="Imagen21"/>
+                    <pic:cNvPr id="24" name="Imagen21"/>
                     <pic:cNvPicPr>
                       <a:picLocks noChangeAspect="1" noChangeArrowheads="1"/>
                     </pic:cNvPicPr>
                   </pic:nvPicPr>
                   <pic:blipFill>
-                    <a:blip r:embed="rId21"/>
+                    <a:blip r:embed="rId25"/>
                     <a:stretch>
                       <a:fillRect/>
                     </a:stretch>
@@ -2052,7 +2868,7 @@
           <wp:inline distT="0" distB="0" distL="0" distR="0">
             <wp:extent cx="3316605" cy="7372350"/>
             <wp:effectExtent l="0" t="0" r="0" b="0"/>
-            <wp:docPr id="21" name="Imagen22"/>
+            <wp:docPr id="25" name="Imagen22"/>
             <wp:cNvGraphicFramePr>
               <a:graphicFrameLocks xmlns:a="http://schemas.openxmlformats.org/drawingml/2006/main" noChangeAspect="1"/>
             </wp:cNvGraphicFramePr>
@@ -2060,13 +2876,13 @@
               <a:graphicData uri="http://schemas.openxmlformats.org/drawingml/2006/picture">
                 <pic:pic xmlns:pic="http://schemas.openxmlformats.org/drawingml/2006/picture">
                   <pic:nvPicPr>
-                    <pic:cNvPr id="21" name="Imagen22"/>
+                    <pic:cNvPr id="25" name="Imagen22"/>
                     <pic:cNvPicPr>
                       <a:picLocks noChangeAspect="1" noChangeArrowheads="1"/>
                     </pic:cNvPicPr>
                   </pic:nvPicPr>
                   <pic:blipFill>
-                    <a:blip r:embed="rId22"/>
+                    <a:blip r:embed="rId26"/>
                     <a:stretch>
                       <a:fillRect/>
                     </a:stretch>
@@ -2162,7 +2978,7 @@
           <wp:inline distT="0" distB="0" distL="0" distR="0">
             <wp:extent cx="5940425" cy="1232535"/>
             <wp:effectExtent l="0" t="0" r="0" b="0"/>
-            <wp:docPr id="22" name="Imagen23"/>
+            <wp:docPr id="26" name="Imagen23"/>
             <wp:cNvGraphicFramePr>
               <a:graphicFrameLocks xmlns:a="http://schemas.openxmlformats.org/drawingml/2006/main" noChangeAspect="1"/>
             </wp:cNvGraphicFramePr>
@@ -2170,13 +2986,13 @@
               <a:graphicData uri="http://schemas.openxmlformats.org/drawingml/2006/picture">
                 <pic:pic xmlns:pic="http://schemas.openxmlformats.org/drawingml/2006/picture">
                   <pic:nvPicPr>
-                    <pic:cNvPr id="22" name="Imagen23"/>
+                    <pic:cNvPr id="26" name="Imagen23"/>
                     <pic:cNvPicPr>
                       <a:picLocks noChangeAspect="1" noChangeArrowheads="1"/>
                     </pic:cNvPicPr>
                   </pic:nvPicPr>
                   <pic:blipFill>
-                    <a:blip r:embed="rId23"/>
+                    <a:blip r:embed="rId27"/>
                     <a:stretch>
                       <a:fillRect/>
                     </a:stretch>
@@ -2234,7 +3050,7 @@
           <wp:inline distT="0" distB="0" distL="0" distR="0">
             <wp:extent cx="5562600" cy="762000"/>
             <wp:effectExtent l="0" t="0" r="0" b="0"/>
-            <wp:docPr id="23" name="Imagen24"/>
+            <wp:docPr id="27" name="Imagen24"/>
             <wp:cNvGraphicFramePr>
               <a:graphicFrameLocks xmlns:a="http://schemas.openxmlformats.org/drawingml/2006/main" noChangeAspect="1"/>
             </wp:cNvGraphicFramePr>
@@ -2242,13 +3058,13 @@
               <a:graphicData uri="http://schemas.openxmlformats.org/drawingml/2006/picture">
                 <pic:pic xmlns:pic="http://schemas.openxmlformats.org/drawingml/2006/picture">
                   <pic:nvPicPr>
-                    <pic:cNvPr id="23" name="Imagen24"/>
+                    <pic:cNvPr id="27" name="Imagen24"/>
                     <pic:cNvPicPr>
                       <a:picLocks noChangeAspect="1" noChangeArrowheads="1"/>
                     </pic:cNvPicPr>
                   </pic:nvPicPr>
                   <pic:blipFill>
-                    <a:blip r:embed="rId24"/>
+                    <a:blip r:embed="rId28"/>
                     <a:stretch>
                       <a:fillRect/>
                     </a:stretch>
@@ -2306,7 +3122,7 @@
           <wp:inline distT="0" distB="0" distL="0" distR="0">
             <wp:extent cx="5848350" cy="2447925"/>
             <wp:effectExtent l="0" t="0" r="0" b="0"/>
-            <wp:docPr id="24" name="Imagen25"/>
+            <wp:docPr id="28" name="Imagen25"/>
             <wp:cNvGraphicFramePr>
               <a:graphicFrameLocks xmlns:a="http://schemas.openxmlformats.org/drawingml/2006/main" noChangeAspect="1"/>
             </wp:cNvGraphicFramePr>
@@ -2314,13 +3130,13 @@
               <a:graphicData uri="http://schemas.openxmlformats.org/drawingml/2006/picture">
                 <pic:pic xmlns:pic="http://schemas.openxmlformats.org/drawingml/2006/picture">
                   <pic:nvPicPr>
-                    <pic:cNvPr id="24" name="Imagen25"/>
+                    <pic:cNvPr id="28" name="Imagen25"/>
                     <pic:cNvPicPr>
                       <a:picLocks noChangeAspect="1" noChangeArrowheads="1"/>
                     </pic:cNvPicPr>
                   </pic:nvPicPr>
                   <pic:blipFill>
-                    <a:blip r:embed="rId25"/>
+                    <a:blip r:embed="rId29"/>
                     <a:stretch>
                       <a:fillRect/>
                     </a:stretch>
@@ -2371,7 +3187,7 @@
           <wp:inline distT="0" distB="0" distL="0" distR="0">
             <wp:extent cx="2438400" cy="2057400"/>
             <wp:effectExtent l="0" t="0" r="0" b="0"/>
-            <wp:docPr id="25" name="Imagen26"/>
+            <wp:docPr id="29" name="Imagen26"/>
             <wp:cNvGraphicFramePr>
               <a:graphicFrameLocks xmlns:a="http://schemas.openxmlformats.org/drawingml/2006/main" noChangeAspect="1"/>
             </wp:cNvGraphicFramePr>
@@ -2379,13 +3195,13 @@
               <a:graphicData uri="http://schemas.openxmlformats.org/drawingml/2006/picture">
                 <pic:pic xmlns:pic="http://schemas.openxmlformats.org/drawingml/2006/picture">
                   <pic:nvPicPr>
-                    <pic:cNvPr id="25" name="Imagen26"/>
+                    <pic:cNvPr id="29" name="Imagen26"/>
                     <pic:cNvPicPr>
                       <a:picLocks noChangeAspect="1" noChangeArrowheads="1"/>
                     </pic:cNvPicPr>
                   </pic:nvPicPr>
                   <pic:blipFill>
-                    <a:blip r:embed="rId26"/>
+                    <a:blip r:embed="rId30"/>
                     <a:stretch>
                       <a:fillRect/>
                     </a:stretch>
@@ -2435,7 +3251,7 @@
           <wp:inline distT="0" distB="0" distL="0" distR="0">
             <wp:extent cx="5940425" cy="666750"/>
             <wp:effectExtent l="0" t="0" r="0" b="0"/>
-            <wp:docPr id="26" name="Imagen27"/>
+            <wp:docPr id="30" name="Imagen27"/>
             <wp:cNvGraphicFramePr>
               <a:graphicFrameLocks xmlns:a="http://schemas.openxmlformats.org/drawingml/2006/main" noChangeAspect="1"/>
             </wp:cNvGraphicFramePr>
@@ -2443,13 +3259,13 @@
               <a:graphicData uri="http://schemas.openxmlformats.org/drawingml/2006/picture">
                 <pic:pic xmlns:pic="http://schemas.openxmlformats.org/drawingml/2006/picture">
                   <pic:nvPicPr>
-                    <pic:cNvPr id="26" name="Imagen27"/>
+                    <pic:cNvPr id="30" name="Imagen27"/>
                     <pic:cNvPicPr>
                       <a:picLocks noChangeAspect="1" noChangeArrowheads="1"/>
                     </pic:cNvPicPr>
                   </pic:nvPicPr>
                   <pic:blipFill>
-                    <a:blip r:embed="rId27"/>
+                    <a:blip r:embed="rId31"/>
                     <a:stretch>
                       <a:fillRect/>
                     </a:stretch>
@@ -2499,7 +3315,7 @@
           <wp:inline distT="0" distB="0" distL="0" distR="0">
             <wp:extent cx="5940425" cy="431165"/>
             <wp:effectExtent l="0" t="0" r="0" b="0"/>
-            <wp:docPr id="27" name="Imagen28"/>
+            <wp:docPr id="31" name="Imagen28"/>
             <wp:cNvGraphicFramePr>
               <a:graphicFrameLocks xmlns:a="http://schemas.openxmlformats.org/drawingml/2006/main" noChangeAspect="1"/>
             </wp:cNvGraphicFramePr>
@@ -2507,13 +3323,13 @@
               <a:graphicData uri="http://schemas.openxmlformats.org/drawingml/2006/picture">
                 <pic:pic xmlns:pic="http://schemas.openxmlformats.org/drawingml/2006/picture">
                   <pic:nvPicPr>
-                    <pic:cNvPr id="27" name="Imagen28"/>
+                    <pic:cNvPr id="31" name="Imagen28"/>
                     <pic:cNvPicPr>
                       <a:picLocks noChangeAspect="1" noChangeArrowheads="1"/>
                     </pic:cNvPicPr>
                   </pic:nvPicPr>
                   <pic:blipFill>
-                    <a:blip r:embed="rId28"/>
+                    <a:blip r:embed="rId32"/>
                     <a:stretch>
                       <a:fillRect/>
                     </a:stretch>
@@ -2648,7 +3464,7 @@
           <wp:inline distT="0" distB="0" distL="0" distR="0">
             <wp:extent cx="5940425" cy="751205"/>
             <wp:effectExtent l="0" t="0" r="0" b="0"/>
-            <wp:docPr id="28" name="Imagen29"/>
+            <wp:docPr id="32" name="Imagen29"/>
             <wp:cNvGraphicFramePr>
               <a:graphicFrameLocks xmlns:a="http://schemas.openxmlformats.org/drawingml/2006/main" noChangeAspect="1"/>
             </wp:cNvGraphicFramePr>
@@ -2656,13 +3472,13 @@
               <a:graphicData uri="http://schemas.openxmlformats.org/drawingml/2006/picture">
                 <pic:pic xmlns:pic="http://schemas.openxmlformats.org/drawingml/2006/picture">
                   <pic:nvPicPr>
-                    <pic:cNvPr id="28" name="Imagen29"/>
+                    <pic:cNvPr id="32" name="Imagen29"/>
                     <pic:cNvPicPr>
                       <a:picLocks noChangeAspect="1" noChangeArrowheads="1"/>
                     </pic:cNvPicPr>
                   </pic:nvPicPr>
                   <pic:blipFill>
-                    <a:blip r:embed="rId29"/>
+                    <a:blip r:embed="rId33"/>
                     <a:stretch>
                       <a:fillRect/>
                     </a:stretch>
@@ -2712,7 +3528,7 @@
           <wp:inline distT="0" distB="0" distL="0" distR="0">
             <wp:extent cx="5940425" cy="1558290"/>
             <wp:effectExtent l="0" t="0" r="0" b="0"/>
-            <wp:docPr id="29" name="Imagen30"/>
+            <wp:docPr id="33" name="Imagen30"/>
             <wp:cNvGraphicFramePr>
               <a:graphicFrameLocks xmlns:a="http://schemas.openxmlformats.org/drawingml/2006/main" noChangeAspect="1"/>
             </wp:cNvGraphicFramePr>
@@ -2720,13 +3536,13 @@
               <a:graphicData uri="http://schemas.openxmlformats.org/drawingml/2006/picture">
                 <pic:pic xmlns:pic="http://schemas.openxmlformats.org/drawingml/2006/picture">
                   <pic:nvPicPr>
-                    <pic:cNvPr id="29" name="Imagen30"/>
+                    <pic:cNvPr id="33" name="Imagen30"/>
                     <pic:cNvPicPr>
                       <a:picLocks noChangeAspect="1" noChangeArrowheads="1"/>
                     </pic:cNvPicPr>
                   </pic:nvPicPr>
                   <pic:blipFill>
-                    <a:blip r:embed="rId30"/>
+                    <a:blip r:embed="rId34"/>
                     <a:stretch>
                       <a:fillRect/>
                     </a:stretch>
@@ -2777,7 +3593,7 @@
           <wp:inline distT="0" distB="0" distL="0" distR="0">
             <wp:extent cx="4933950" cy="4229100"/>
             <wp:effectExtent l="0" t="0" r="0" b="0"/>
-            <wp:docPr id="30" name="Imagen31"/>
+            <wp:docPr id="34" name="Imagen31"/>
             <wp:cNvGraphicFramePr>
               <a:graphicFrameLocks xmlns:a="http://schemas.openxmlformats.org/drawingml/2006/main" noChangeAspect="1"/>
             </wp:cNvGraphicFramePr>
@@ -2785,13 +3601,13 @@
               <a:graphicData uri="http://schemas.openxmlformats.org/drawingml/2006/picture">
                 <pic:pic xmlns:pic="http://schemas.openxmlformats.org/drawingml/2006/picture">
                   <pic:nvPicPr>
-                    <pic:cNvPr id="30" name="Imagen31"/>
+                    <pic:cNvPr id="34" name="Imagen31"/>
                     <pic:cNvPicPr>
                       <a:picLocks noChangeAspect="1" noChangeArrowheads="1"/>
                     </pic:cNvPicPr>
                   </pic:nvPicPr>
                   <pic:blipFill>
-                    <a:blip r:embed="rId31"/>
+                    <a:blip r:embed="rId35"/>
                     <a:stretch>
                       <a:fillRect/>
                     </a:stretch>
@@ -2841,7 +3657,7 @@
           <wp:inline distT="0" distB="0" distL="0" distR="0">
             <wp:extent cx="1809750" cy="1876425"/>
             <wp:effectExtent l="0" t="0" r="0" b="0"/>
-            <wp:docPr id="31" name="Imagen32"/>
+            <wp:docPr id="35" name="Imagen32"/>
             <wp:cNvGraphicFramePr>
               <a:graphicFrameLocks xmlns:a="http://schemas.openxmlformats.org/drawingml/2006/main" noChangeAspect="1"/>
             </wp:cNvGraphicFramePr>
@@ -2849,13 +3665,13 @@
               <a:graphicData uri="http://schemas.openxmlformats.org/drawingml/2006/picture">
                 <pic:pic xmlns:pic="http://schemas.openxmlformats.org/drawingml/2006/picture">
                   <pic:nvPicPr>
-                    <pic:cNvPr id="31" name="Imagen32"/>
+                    <pic:cNvPr id="35" name="Imagen32"/>
                     <pic:cNvPicPr>
                       <a:picLocks noChangeAspect="1" noChangeArrowheads="1"/>
                     </pic:cNvPicPr>
                   </pic:nvPicPr>
                   <pic:blipFill>
-                    <a:blip r:embed="rId32"/>
+                    <a:blip r:embed="rId36"/>
                     <a:stretch>
                       <a:fillRect/>
                     </a:stretch>
@@ -2905,7 +3721,7 @@
           <wp:inline distT="0" distB="0" distL="0" distR="0">
             <wp:extent cx="5940425" cy="1513205"/>
             <wp:effectExtent l="0" t="0" r="0" b="0"/>
-            <wp:docPr id="32" name="Imagen33"/>
+            <wp:docPr id="36" name="Imagen33"/>
             <wp:cNvGraphicFramePr>
               <a:graphicFrameLocks xmlns:a="http://schemas.openxmlformats.org/drawingml/2006/main" noChangeAspect="1"/>
             </wp:cNvGraphicFramePr>
@@ -2913,13 +3729,13 @@
               <a:graphicData uri="http://schemas.openxmlformats.org/drawingml/2006/picture">
                 <pic:pic xmlns:pic="http://schemas.openxmlformats.org/drawingml/2006/picture">
                   <pic:nvPicPr>
-                    <pic:cNvPr id="32" name="Imagen33"/>
+                    <pic:cNvPr id="36" name="Imagen33"/>
                     <pic:cNvPicPr>
                       <a:picLocks noChangeAspect="1" noChangeArrowheads="1"/>
                     </pic:cNvPicPr>
                   </pic:nvPicPr>
                   <pic:blipFill>
-                    <a:blip r:embed="rId33"/>
+                    <a:blip r:embed="rId37"/>
                     <a:stretch>
                       <a:fillRect/>
                     </a:stretch>
@@ -2955,7 +3771,7 @@
           <wp:inline distT="0" distB="0" distL="0" distR="0">
             <wp:extent cx="4438650" cy="657225"/>
             <wp:effectExtent l="0" t="0" r="0" b="0"/>
-            <wp:docPr id="33" name="Imagen34"/>
+            <wp:docPr id="37" name="Imagen34"/>
             <wp:cNvGraphicFramePr>
               <a:graphicFrameLocks xmlns:a="http://schemas.openxmlformats.org/drawingml/2006/main" noChangeAspect="1"/>
             </wp:cNvGraphicFramePr>
@@ -2963,13 +3779,13 @@
               <a:graphicData uri="http://schemas.openxmlformats.org/drawingml/2006/picture">
                 <pic:pic xmlns:pic="http://schemas.openxmlformats.org/drawingml/2006/picture">
                   <pic:nvPicPr>
-                    <pic:cNvPr id="33" name="Imagen34"/>
+                    <pic:cNvPr id="37" name="Imagen34"/>
                     <pic:cNvPicPr>
                       <a:picLocks noChangeAspect="1" noChangeArrowheads="1"/>
                     </pic:cNvPicPr>
                   </pic:nvPicPr>
                   <pic:blipFill>
-                    <a:blip r:embed="rId34"/>
+                    <a:blip r:embed="rId38"/>
                     <a:stretch>
                       <a:fillRect/>
                     </a:stretch>
@@ -3081,7 +3897,7 @@
           <wp:inline distT="0" distB="0" distL="0" distR="0">
             <wp:extent cx="5940425" cy="1103630"/>
             <wp:effectExtent l="0" t="0" r="0" b="0"/>
-            <wp:docPr id="34" name="Imagen35"/>
+            <wp:docPr id="38" name="Imagen35"/>
             <wp:cNvGraphicFramePr>
               <a:graphicFrameLocks xmlns:a="http://schemas.openxmlformats.org/drawingml/2006/main" noChangeAspect="1"/>
             </wp:cNvGraphicFramePr>
@@ -3089,13 +3905,13 @@
               <a:graphicData uri="http://schemas.openxmlformats.org/drawingml/2006/picture">
                 <pic:pic xmlns:pic="http://schemas.openxmlformats.org/drawingml/2006/picture">
                   <pic:nvPicPr>
-                    <pic:cNvPr id="34" name="Imagen35"/>
+                    <pic:cNvPr id="38" name="Imagen35"/>
                     <pic:cNvPicPr>
                       <a:picLocks noChangeAspect="1" noChangeArrowheads="1"/>
                     </pic:cNvPicPr>
                   </pic:nvPicPr>
                   <pic:blipFill>
-                    <a:blip r:embed="rId35"/>
+                    <a:blip r:embed="rId39"/>
                     <a:stretch>
                       <a:fillRect/>
                     </a:stretch>
@@ -3146,7 +3962,7 @@
           <wp:inline distT="0" distB="0" distL="0" distR="0">
             <wp:extent cx="5940425" cy="1762760"/>
             <wp:effectExtent l="0" t="0" r="0" b="0"/>
-            <wp:docPr id="35" name="Imagen36"/>
+            <wp:docPr id="39" name="Imagen36"/>
             <wp:cNvGraphicFramePr>
               <a:graphicFrameLocks xmlns:a="http://schemas.openxmlformats.org/drawingml/2006/main" noChangeAspect="1"/>
             </wp:cNvGraphicFramePr>
@@ -3154,13 +3970,13 @@
               <a:graphicData uri="http://schemas.openxmlformats.org/drawingml/2006/picture">
                 <pic:pic xmlns:pic="http://schemas.openxmlformats.org/drawingml/2006/picture">
                   <pic:nvPicPr>
-                    <pic:cNvPr id="35" name="Imagen36"/>
+                    <pic:cNvPr id="39" name="Imagen36"/>
                     <pic:cNvPicPr>
                       <a:picLocks noChangeAspect="1" noChangeArrowheads="1"/>
                     </pic:cNvPicPr>
                   </pic:nvPicPr>
                   <pic:blipFill>
-                    <a:blip r:embed="rId36"/>
+                    <a:blip r:embed="rId40"/>
                     <a:stretch>
                       <a:fillRect/>
                     </a:stretch>
@@ -3268,7 +4084,7 @@
           <wp:inline distT="0" distB="0" distL="0" distR="0">
             <wp:extent cx="2291080" cy="5110480"/>
             <wp:effectExtent l="0" t="0" r="0" b="0"/>
-            <wp:docPr id="36" name="Imagen37"/>
+            <wp:docPr id="40" name="Imagen37"/>
             <wp:cNvGraphicFramePr>
               <a:graphicFrameLocks xmlns:a="http://schemas.openxmlformats.org/drawingml/2006/main" noChangeAspect="1"/>
             </wp:cNvGraphicFramePr>
@@ -3276,13 +4092,13 @@
               <a:graphicData uri="http://schemas.openxmlformats.org/drawingml/2006/picture">
                 <pic:pic xmlns:pic="http://schemas.openxmlformats.org/drawingml/2006/picture">
                   <pic:nvPicPr>
-                    <pic:cNvPr id="36" name="Imagen37"/>
+                    <pic:cNvPr id="40" name="Imagen37"/>
                     <pic:cNvPicPr>
                       <a:picLocks noChangeAspect="1" noChangeArrowheads="1"/>
                     </pic:cNvPicPr>
                   </pic:nvPicPr>
                   <pic:blipFill>
-                    <a:blip r:embed="rId37"/>
+                    <a:blip r:embed="rId41"/>
                     <a:stretch>
                       <a:fillRect/>
                     </a:stretch>
@@ -3332,7 +4148,7 @@
           <wp:inline distT="0" distB="0" distL="0" distR="0">
             <wp:extent cx="3429000" cy="752475"/>
             <wp:effectExtent l="0" t="0" r="0" b="0"/>
-            <wp:docPr id="37" name="Imagen38"/>
+            <wp:docPr id="41" name="Imagen38"/>
             <wp:cNvGraphicFramePr>
               <a:graphicFrameLocks xmlns:a="http://schemas.openxmlformats.org/drawingml/2006/main" noChangeAspect="1"/>
             </wp:cNvGraphicFramePr>
@@ -3340,13 +4156,13 @@
               <a:graphicData uri="http://schemas.openxmlformats.org/drawingml/2006/picture">
                 <pic:pic xmlns:pic="http://schemas.openxmlformats.org/drawingml/2006/picture">
                   <pic:nvPicPr>
-                    <pic:cNvPr id="37" name="Imagen38"/>
+                    <pic:cNvPr id="41" name="Imagen38"/>
                     <pic:cNvPicPr>
                       <a:picLocks noChangeAspect="1" noChangeArrowheads="1"/>
                     </pic:cNvPicPr>
                   </pic:nvPicPr>
                   <pic:blipFill>
-                    <a:blip r:embed="rId38"/>
+                    <a:blip r:embed="rId42"/>
                     <a:stretch>
                       <a:fillRect/>
                     </a:stretch>
@@ -3444,7 +4260,7 @@
           <wp:inline distT="0" distB="0" distL="0" distR="0">
             <wp:extent cx="3114675" cy="857250"/>
             <wp:effectExtent l="0" t="0" r="0" b="0"/>
-            <wp:docPr id="38" name="Imagen39"/>
+            <wp:docPr id="42" name="Imagen39"/>
             <wp:cNvGraphicFramePr>
               <a:graphicFrameLocks xmlns:a="http://schemas.openxmlformats.org/drawingml/2006/main" noChangeAspect="1"/>
             </wp:cNvGraphicFramePr>
@@ -3452,13 +4268,13 @@
               <a:graphicData uri="http://schemas.openxmlformats.org/drawingml/2006/picture">
                 <pic:pic xmlns:pic="http://schemas.openxmlformats.org/drawingml/2006/picture">
                   <pic:nvPicPr>
-                    <pic:cNvPr id="38" name="Imagen39"/>
+                    <pic:cNvPr id="42" name="Imagen39"/>
                     <pic:cNvPicPr>
                       <a:picLocks noChangeAspect="1" noChangeArrowheads="1"/>
                     </pic:cNvPicPr>
                   </pic:nvPicPr>
                   <pic:blipFill>
-                    <a:blip r:embed="rId39"/>
+                    <a:blip r:embed="rId43"/>
                     <a:stretch>
                       <a:fillRect/>
                     </a:stretch>
@@ -3573,7 +4389,7 @@
           <wp:inline distT="0" distB="0" distL="0" distR="0">
             <wp:extent cx="5940425" cy="3081655"/>
             <wp:effectExtent l="0" t="0" r="0" b="0"/>
-            <wp:docPr id="39" name="Imagen40"/>
+            <wp:docPr id="43" name="Imagen40"/>
             <wp:cNvGraphicFramePr>
               <a:graphicFrameLocks xmlns:a="http://schemas.openxmlformats.org/drawingml/2006/main" noChangeAspect="1"/>
             </wp:cNvGraphicFramePr>
@@ -3581,13 +4397,13 @@
               <a:graphicData uri="http://schemas.openxmlformats.org/drawingml/2006/picture">
                 <pic:pic xmlns:pic="http://schemas.openxmlformats.org/drawingml/2006/picture">
                   <pic:nvPicPr>
-                    <pic:cNvPr id="39" name="Imagen40"/>
+                    <pic:cNvPr id="43" name="Imagen40"/>
                     <pic:cNvPicPr>
                       <a:picLocks noChangeAspect="1" noChangeArrowheads="1"/>
                     </pic:cNvPicPr>
                   </pic:nvPicPr>
                   <pic:blipFill>
-                    <a:blip r:embed="rId40"/>
+                    <a:blip r:embed="rId44"/>
                     <a:stretch>
                       <a:fillRect/>
                     </a:stretch>
@@ -3711,7 +4527,7 @@
           <wp:inline distT="0" distB="0" distL="0" distR="0">
             <wp:extent cx="5940425" cy="2182495"/>
             <wp:effectExtent l="0" t="0" r="0" b="0"/>
-            <wp:docPr id="40" name="Imagen41"/>
+            <wp:docPr id="44" name="Imagen41"/>
             <wp:cNvGraphicFramePr>
               <a:graphicFrameLocks xmlns:a="http://schemas.openxmlformats.org/drawingml/2006/main" noChangeAspect="1"/>
             </wp:cNvGraphicFramePr>
@@ -3719,13 +4535,13 @@
               <a:graphicData uri="http://schemas.openxmlformats.org/drawingml/2006/picture">
                 <pic:pic xmlns:pic="http://schemas.openxmlformats.org/drawingml/2006/picture">
                   <pic:nvPicPr>
-                    <pic:cNvPr id="40" name="Imagen41"/>
+                    <pic:cNvPr id="44" name="Imagen41"/>
                     <pic:cNvPicPr>
                       <a:picLocks noChangeAspect="1" noChangeArrowheads="1"/>
                     </pic:cNvPicPr>
                   </pic:nvPicPr>
                   <pic:blipFill>
-                    <a:blip r:embed="rId41"/>
+                    <a:blip r:embed="rId45"/>
                     <a:stretch>
                       <a:fillRect/>
                     </a:stretch>
@@ -3781,7 +4597,7 @@
           <wp:inline distT="0" distB="0" distL="0" distR="0">
             <wp:extent cx="5940425" cy="1213485"/>
             <wp:effectExtent l="0" t="0" r="0" b="0"/>
-            <wp:docPr id="41" name="Imagen42"/>
+            <wp:docPr id="45" name="Imagen42"/>
             <wp:cNvGraphicFramePr>
               <a:graphicFrameLocks xmlns:a="http://schemas.openxmlformats.org/drawingml/2006/main" noChangeAspect="1"/>
             </wp:cNvGraphicFramePr>
@@ -3789,13 +4605,13 @@
               <a:graphicData uri="http://schemas.openxmlformats.org/drawingml/2006/picture">
                 <pic:pic xmlns:pic="http://schemas.openxmlformats.org/drawingml/2006/picture">
                   <pic:nvPicPr>
-                    <pic:cNvPr id="41" name="Imagen42"/>
+                    <pic:cNvPr id="45" name="Imagen42"/>
                     <pic:cNvPicPr>
                       <a:picLocks noChangeAspect="1" noChangeArrowheads="1"/>
                     </pic:cNvPicPr>
                   </pic:nvPicPr>
                   <pic:blipFill>
-                    <a:blip r:embed="rId42"/>
+                    <a:blip r:embed="rId46"/>
                     <a:stretch>
                       <a:fillRect/>
                     </a:stretch>
@@ -3848,7 +4664,7 @@
           <wp:inline distT="0" distB="0" distL="0" distR="0">
             <wp:extent cx="5940425" cy="1494155"/>
             <wp:effectExtent l="0" t="0" r="0" b="0"/>
-            <wp:docPr id="42" name="Imagen43"/>
+            <wp:docPr id="46" name="Imagen43"/>
             <wp:cNvGraphicFramePr>
               <a:graphicFrameLocks xmlns:a="http://schemas.openxmlformats.org/drawingml/2006/main" noChangeAspect="1"/>
             </wp:cNvGraphicFramePr>
@@ -3856,13 +4672,13 @@
               <a:graphicData uri="http://schemas.openxmlformats.org/drawingml/2006/picture">
                 <pic:pic xmlns:pic="http://schemas.openxmlformats.org/drawingml/2006/picture">
                   <pic:nvPicPr>
-                    <pic:cNvPr id="42" name="Imagen43"/>
+                    <pic:cNvPr id="46" name="Imagen43"/>
                     <pic:cNvPicPr>
                       <a:picLocks noChangeAspect="1" noChangeArrowheads="1"/>
                     </pic:cNvPicPr>
                   </pic:nvPicPr>
                   <pic:blipFill>
-                    <a:blip r:embed="rId43"/>
+                    <a:blip r:embed="rId47"/>
                     <a:stretch>
                       <a:fillRect/>
                     </a:stretch>
@@ -3985,7 +4801,7 @@
           <wp:inline distT="0" distB="0" distL="0" distR="0">
             <wp:extent cx="3429000" cy="1019175"/>
             <wp:effectExtent l="0" t="0" r="0" b="0"/>
-            <wp:docPr id="43" name="Imagen44"/>
+            <wp:docPr id="47" name="Imagen44"/>
             <wp:cNvGraphicFramePr>
               <a:graphicFrameLocks xmlns:a="http://schemas.openxmlformats.org/drawingml/2006/main" noChangeAspect="1"/>
             </wp:cNvGraphicFramePr>
@@ -3993,13 +4809,13 @@
               <a:graphicData uri="http://schemas.openxmlformats.org/drawingml/2006/picture">
                 <pic:pic xmlns:pic="http://schemas.openxmlformats.org/drawingml/2006/picture">
                   <pic:nvPicPr>
-                    <pic:cNvPr id="43" name="Imagen44"/>
+                    <pic:cNvPr id="47" name="Imagen44"/>
                     <pic:cNvPicPr>
                       <a:picLocks noChangeAspect="1" noChangeArrowheads="1"/>
                     </pic:cNvPicPr>
                   </pic:nvPicPr>
                   <pic:blipFill>
-                    <a:blip r:embed="rId44"/>
+                    <a:blip r:embed="rId48"/>
                     <a:stretch>
                       <a:fillRect/>
                     </a:stretch>
@@ -4088,7 +4904,7 @@
           <wp:inline distT="0" distB="0" distL="0" distR="0">
             <wp:extent cx="4191000" cy="1323975"/>
             <wp:effectExtent l="0" t="0" r="0" b="0"/>
-            <wp:docPr id="44" name="Imagen45"/>
+            <wp:docPr id="48" name="Imagen45"/>
             <wp:cNvGraphicFramePr>
               <a:graphicFrameLocks xmlns:a="http://schemas.openxmlformats.org/drawingml/2006/main" noChangeAspect="1"/>
             </wp:cNvGraphicFramePr>
@@ -4096,13 +4912,13 @@
               <a:graphicData uri="http://schemas.openxmlformats.org/drawingml/2006/picture">
                 <pic:pic xmlns:pic="http://schemas.openxmlformats.org/drawingml/2006/picture">
                   <pic:nvPicPr>
-                    <pic:cNvPr id="44" name="Imagen45"/>
+                    <pic:cNvPr id="48" name="Imagen45"/>
                     <pic:cNvPicPr>
                       <a:picLocks noChangeAspect="1" noChangeArrowheads="1"/>
                     </pic:cNvPicPr>
                   </pic:nvPicPr>
                   <pic:blipFill>
-                    <a:blip r:embed="rId45"/>
+                    <a:blip r:embed="rId49"/>
                     <a:stretch>
                       <a:fillRect/>
                     </a:stretch>
@@ -4313,7 +5129,7 @@
           <wp:inline distT="0" distB="0" distL="0" distR="0">
             <wp:extent cx="2790825" cy="2494915"/>
             <wp:effectExtent l="0" t="0" r="0" b="0"/>
-            <wp:docPr id="45" name="Imagen46"/>
+            <wp:docPr id="49" name="Imagen46"/>
             <wp:cNvGraphicFramePr>
               <a:graphicFrameLocks xmlns:a="http://schemas.openxmlformats.org/drawingml/2006/main" noChangeAspect="1"/>
             </wp:cNvGraphicFramePr>
@@ -4321,13 +5137,13 @@
               <a:graphicData uri="http://schemas.openxmlformats.org/drawingml/2006/picture">
                 <pic:pic xmlns:pic="http://schemas.openxmlformats.org/drawingml/2006/picture">
                   <pic:nvPicPr>
-                    <pic:cNvPr id="45" name="Imagen46"/>
+                    <pic:cNvPr id="49" name="Imagen46"/>
                     <pic:cNvPicPr>
                       <a:picLocks noChangeAspect="1" noChangeArrowheads="1"/>
                     </pic:cNvPicPr>
                   </pic:nvPicPr>
                   <pic:blipFill>
-                    <a:blip r:embed="rId46"/>
+                    <a:blip r:embed="rId50"/>
                     <a:stretch>
                       <a:fillRect/>
                     </a:stretch>
@@ -4354,7 +5170,7 @@
           <wp:inline distT="0" distB="0" distL="0" distR="0">
             <wp:extent cx="2924175" cy="2231390"/>
             <wp:effectExtent l="0" t="0" r="0" b="0"/>
-            <wp:docPr id="46" name="Imagen47"/>
+            <wp:docPr id="50" name="Imagen47"/>
             <wp:cNvGraphicFramePr>
               <a:graphicFrameLocks xmlns:a="http://schemas.openxmlformats.org/drawingml/2006/main" noChangeAspect="1"/>
             </wp:cNvGraphicFramePr>
@@ -4362,13 +5178,13 @@
               <a:graphicData uri="http://schemas.openxmlformats.org/drawingml/2006/picture">
                 <pic:pic xmlns:pic="http://schemas.openxmlformats.org/drawingml/2006/picture">
                   <pic:nvPicPr>
-                    <pic:cNvPr id="46" name="Imagen47"/>
+                    <pic:cNvPr id="50" name="Imagen47"/>
                     <pic:cNvPicPr>
                       <a:picLocks noChangeAspect="1" noChangeArrowheads="1"/>
                     </pic:cNvPicPr>
                   </pic:nvPicPr>
                   <pic:blipFill>
-                    <a:blip r:embed="rId47"/>
+                    <a:blip r:embed="rId51"/>
                     <a:stretch>
                       <a:fillRect/>
                     </a:stretch>
@@ -4464,7 +5280,7 @@
           <wp:inline distT="0" distB="0" distL="0" distR="0">
             <wp:extent cx="5940425" cy="6378575"/>
             <wp:effectExtent l="0" t="0" r="0" b="0"/>
-            <wp:docPr id="47" name="Imagen48"/>
+            <wp:docPr id="51" name="Imagen48"/>
             <wp:cNvGraphicFramePr>
               <a:graphicFrameLocks xmlns:a="http://schemas.openxmlformats.org/drawingml/2006/main" noChangeAspect="1"/>
             </wp:cNvGraphicFramePr>
@@ -4472,13 +5288,13 @@
               <a:graphicData uri="http://schemas.openxmlformats.org/drawingml/2006/picture">
                 <pic:pic xmlns:pic="http://schemas.openxmlformats.org/drawingml/2006/picture">
                   <pic:nvPicPr>
-                    <pic:cNvPr id="47" name="Imagen48"/>
+                    <pic:cNvPr id="51" name="Imagen48"/>
                     <pic:cNvPicPr>
                       <a:picLocks noChangeAspect="1" noChangeArrowheads="1"/>
                     </pic:cNvPicPr>
                   </pic:nvPicPr>
                   <pic:blipFill>
-                    <a:blip r:embed="rId48"/>
+                    <a:blip r:embed="rId52"/>
                     <a:stretch>
                       <a:fillRect/>
                     </a:stretch>
@@ -4566,7 +5382,7 @@
           <wp:inline distT="0" distB="0" distL="0" distR="0">
             <wp:extent cx="5940425" cy="5986145"/>
             <wp:effectExtent l="0" t="0" r="0" b="0"/>
-            <wp:docPr id="48" name="Imagen49"/>
+            <wp:docPr id="52" name="Imagen49"/>
             <wp:cNvGraphicFramePr>
               <a:graphicFrameLocks xmlns:a="http://schemas.openxmlformats.org/drawingml/2006/main" noChangeAspect="1"/>
             </wp:cNvGraphicFramePr>
@@ -4574,13 +5390,13 @@
               <a:graphicData uri="http://schemas.openxmlformats.org/drawingml/2006/picture">
                 <pic:pic xmlns:pic="http://schemas.openxmlformats.org/drawingml/2006/picture">
                   <pic:nvPicPr>
-                    <pic:cNvPr id="48" name="Imagen49"/>
+                    <pic:cNvPr id="52" name="Imagen49"/>
                     <pic:cNvPicPr>
                       <a:picLocks noChangeAspect="1" noChangeArrowheads="1"/>
                     </pic:cNvPicPr>
                   </pic:nvPicPr>
                   <pic:blipFill>
-                    <a:blip r:embed="rId49"/>
+                    <a:blip r:embed="rId53"/>
                     <a:stretch>
                       <a:fillRect/>
                     </a:stretch>
@@ -4616,7 +5432,7 @@
           <wp:inline distT="0" distB="0" distL="0" distR="0">
             <wp:extent cx="5940425" cy="4947285"/>
             <wp:effectExtent l="0" t="0" r="0" b="0"/>
-            <wp:docPr id="49" name="Imagen50"/>
+            <wp:docPr id="53" name="Imagen50"/>
             <wp:cNvGraphicFramePr>
               <a:graphicFrameLocks xmlns:a="http://schemas.openxmlformats.org/drawingml/2006/main" noChangeAspect="1"/>
             </wp:cNvGraphicFramePr>
@@ -4624,13 +5440,13 @@
               <a:graphicData uri="http://schemas.openxmlformats.org/drawingml/2006/picture">
                 <pic:pic xmlns:pic="http://schemas.openxmlformats.org/drawingml/2006/picture">
                   <pic:nvPicPr>
-                    <pic:cNvPr id="49" name="Imagen50"/>
+                    <pic:cNvPr id="53" name="Imagen50"/>
                     <pic:cNvPicPr>
                       <a:picLocks noChangeAspect="1" noChangeArrowheads="1"/>
                     </pic:cNvPicPr>
                   </pic:nvPicPr>
                   <pic:blipFill>
-                    <a:blip r:embed="rId50"/>
+                    <a:blip r:embed="rId54"/>
                     <a:stretch>
                       <a:fillRect/>
                     </a:stretch>
@@ -4678,7 +5494,7 @@
           <wp:inline distT="0" distB="0" distL="0" distR="0">
             <wp:extent cx="5940425" cy="5809615"/>
             <wp:effectExtent l="0" t="0" r="0" b="0"/>
-            <wp:docPr id="50" name="Imagen51"/>
+            <wp:docPr id="54" name="Imagen51"/>
             <wp:cNvGraphicFramePr>
               <a:graphicFrameLocks xmlns:a="http://schemas.openxmlformats.org/drawingml/2006/main" noChangeAspect="1"/>
             </wp:cNvGraphicFramePr>
@@ -4686,13 +5502,13 @@
               <a:graphicData uri="http://schemas.openxmlformats.org/drawingml/2006/picture">
                 <pic:pic xmlns:pic="http://schemas.openxmlformats.org/drawingml/2006/picture">
                   <pic:nvPicPr>
-                    <pic:cNvPr id="50" name="Imagen51"/>
+                    <pic:cNvPr id="54" name="Imagen51"/>
                     <pic:cNvPicPr>
                       <a:picLocks noChangeAspect="1" noChangeArrowheads="1"/>
                     </pic:cNvPicPr>
                   </pic:nvPicPr>
                   <pic:blipFill>
-                    <a:blip r:embed="rId51"/>
+                    <a:blip r:embed="rId55"/>
                     <a:stretch>
                       <a:fillRect/>
                     </a:stretch>
@@ -4778,7 +5594,7 @@
           <wp:inline distT="0" distB="0" distL="0" distR="0">
             <wp:extent cx="5940425" cy="4757420"/>
             <wp:effectExtent l="0" t="0" r="0" b="0"/>
-            <wp:docPr id="51" name="Imagen52"/>
+            <wp:docPr id="55" name="Imagen52"/>
             <wp:cNvGraphicFramePr>
               <a:graphicFrameLocks xmlns:a="http://schemas.openxmlformats.org/drawingml/2006/main" noChangeAspect="1"/>
             </wp:cNvGraphicFramePr>
@@ -4786,13 +5602,13 @@
               <a:graphicData uri="http://schemas.openxmlformats.org/drawingml/2006/picture">
                 <pic:pic xmlns:pic="http://schemas.openxmlformats.org/drawingml/2006/picture">
                   <pic:nvPicPr>
-                    <pic:cNvPr id="51" name="Imagen52"/>
+                    <pic:cNvPr id="55" name="Imagen52"/>
                     <pic:cNvPicPr>
                       <a:picLocks noChangeAspect="1" noChangeArrowheads="1"/>
                     </pic:cNvPicPr>
                   </pic:nvPicPr>
                   <pic:blipFill>
-                    <a:blip r:embed="rId52"/>
+                    <a:blip r:embed="rId56"/>
                     <a:stretch>
                       <a:fillRect/>
                     </a:stretch>
@@ -4869,7 +5685,7 @@
           <wp:inline distT="0" distB="0" distL="0" distR="0">
             <wp:extent cx="5940425" cy="2241550"/>
             <wp:effectExtent l="0" t="0" r="0" b="0"/>
-            <wp:docPr id="52" name="Imagen53"/>
+            <wp:docPr id="56" name="Imagen53"/>
             <wp:cNvGraphicFramePr>
               <a:graphicFrameLocks xmlns:a="http://schemas.openxmlformats.org/drawingml/2006/main" noChangeAspect="1"/>
             </wp:cNvGraphicFramePr>
@@ -4877,13 +5693,13 @@
               <a:graphicData uri="http://schemas.openxmlformats.org/drawingml/2006/picture">
                 <pic:pic xmlns:pic="http://schemas.openxmlformats.org/drawingml/2006/picture">
                   <pic:nvPicPr>
-                    <pic:cNvPr id="52" name="Imagen53"/>
+                    <pic:cNvPr id="56" name="Imagen53"/>
                     <pic:cNvPicPr>
                       <a:picLocks noChangeAspect="1" noChangeArrowheads="1"/>
                     </pic:cNvPicPr>
                   </pic:nvPicPr>
                   <pic:blipFill>
-                    <a:blip r:embed="rId53"/>
+                    <a:blip r:embed="rId57"/>
                     <a:stretch>
                       <a:fillRect/>
                     </a:stretch>
@@ -5005,7 +5821,7 @@
           <wp:inline distT="0" distB="0" distL="0" distR="0">
             <wp:extent cx="5940425" cy="1259205"/>
             <wp:effectExtent l="0" t="0" r="0" b="0"/>
-            <wp:docPr id="53" name="Imagen54"/>
+            <wp:docPr id="57" name="Imagen54"/>
             <wp:cNvGraphicFramePr>
               <a:graphicFrameLocks xmlns:a="http://schemas.openxmlformats.org/drawingml/2006/main" noChangeAspect="1"/>
             </wp:cNvGraphicFramePr>
@@ -5013,13 +5829,13 @@
               <a:graphicData uri="http://schemas.openxmlformats.org/drawingml/2006/picture">
                 <pic:pic xmlns:pic="http://schemas.openxmlformats.org/drawingml/2006/picture">
                   <pic:nvPicPr>
-                    <pic:cNvPr id="53" name="Imagen54"/>
+                    <pic:cNvPr id="57" name="Imagen54"/>
                     <pic:cNvPicPr>
                       <a:picLocks noChangeAspect="1" noChangeArrowheads="1"/>
                     </pic:cNvPicPr>
                   </pic:nvPicPr>
                   <pic:blipFill>
-                    <a:blip r:embed="rId54"/>
+                    <a:blip r:embed="rId58"/>
                     <a:stretch>
                       <a:fillRect/>
                     </a:stretch>
@@ -5099,7 +5915,7 @@
           <wp:inline distT="0" distB="0" distL="0" distR="0">
             <wp:extent cx="5219700" cy="2409825"/>
             <wp:effectExtent l="0" t="0" r="0" b="0"/>
-            <wp:docPr id="54" name="Imagen55"/>
+            <wp:docPr id="58" name="Imagen55"/>
             <wp:cNvGraphicFramePr>
               <a:graphicFrameLocks xmlns:a="http://schemas.openxmlformats.org/drawingml/2006/main" noChangeAspect="1"/>
             </wp:cNvGraphicFramePr>
@@ -5107,13 +5923,13 @@
               <a:graphicData uri="http://schemas.openxmlformats.org/drawingml/2006/picture">
                 <pic:pic xmlns:pic="http://schemas.openxmlformats.org/drawingml/2006/picture">
                   <pic:nvPicPr>
-                    <pic:cNvPr id="54" name="Imagen55"/>
+                    <pic:cNvPr id="58" name="Imagen55"/>
                     <pic:cNvPicPr>
                       <a:picLocks noChangeAspect="1" noChangeArrowheads="1"/>
                     </pic:cNvPicPr>
                   </pic:nvPicPr>
                   <pic:blipFill>
-                    <a:blip r:embed="rId55"/>
+                    <a:blip r:embed="rId59"/>
                     <a:stretch>
                       <a:fillRect/>
                     </a:stretch>
@@ -5176,7 +5992,7 @@
           <wp:inline distT="0" distB="0" distL="0" distR="0">
             <wp:extent cx="5940425" cy="1922780"/>
             <wp:effectExtent l="0" t="0" r="0" b="0"/>
-            <wp:docPr id="55" name="Imagen56"/>
+            <wp:docPr id="59" name="Imagen56"/>
             <wp:cNvGraphicFramePr>
               <a:graphicFrameLocks xmlns:a="http://schemas.openxmlformats.org/drawingml/2006/main" noChangeAspect="1"/>
             </wp:cNvGraphicFramePr>
@@ -5184,13 +6000,13 @@
               <a:graphicData uri="http://schemas.openxmlformats.org/drawingml/2006/picture">
                 <pic:pic xmlns:pic="http://schemas.openxmlformats.org/drawingml/2006/picture">
                   <pic:nvPicPr>
-                    <pic:cNvPr id="55" name="Imagen56"/>
+                    <pic:cNvPr id="59" name="Imagen56"/>
                     <pic:cNvPicPr>
                       <a:picLocks noChangeAspect="1" noChangeArrowheads="1"/>
                     </pic:cNvPicPr>
                   </pic:nvPicPr>
                   <pic:blipFill>
-                    <a:blip r:embed="rId56"/>
+                    <a:blip r:embed="rId60"/>
                     <a:stretch>
                       <a:fillRect/>
                     </a:stretch>
@@ -5242,7 +6058,7 @@
           <wp:inline distT="0" distB="0" distL="0" distR="0">
             <wp:extent cx="2750185" cy="6112510"/>
             <wp:effectExtent l="0" t="0" r="0" b="0"/>
-            <wp:docPr id="56" name="Imagen57"/>
+            <wp:docPr id="60" name="Imagen57"/>
             <wp:cNvGraphicFramePr>
               <a:graphicFrameLocks xmlns:a="http://schemas.openxmlformats.org/drawingml/2006/main" noChangeAspect="1"/>
             </wp:cNvGraphicFramePr>
@@ -5250,13 +6066,13 @@
               <a:graphicData uri="http://schemas.openxmlformats.org/drawingml/2006/picture">
                 <pic:pic xmlns:pic="http://schemas.openxmlformats.org/drawingml/2006/picture">
                   <pic:nvPicPr>
-                    <pic:cNvPr id="56" name="Imagen57"/>
+                    <pic:cNvPr id="60" name="Imagen57"/>
                     <pic:cNvPicPr>
                       <a:picLocks noChangeAspect="1" noChangeArrowheads="1"/>
                     </pic:cNvPicPr>
                   </pic:nvPicPr>
                   <pic:blipFill>
-                    <a:blip r:embed="rId57"/>
+                    <a:blip r:embed="rId61"/>
                     <a:stretch>
                       <a:fillRect/>
                     </a:stretch>
@@ -5319,7 +6135,7 @@
           <wp:inline distT="0" distB="0" distL="0" distR="0">
             <wp:extent cx="2708275" cy="6028690"/>
             <wp:effectExtent l="0" t="0" r="0" b="0"/>
-            <wp:docPr id="57" name="Imagen58"/>
+            <wp:docPr id="61" name="Imagen58"/>
             <wp:cNvGraphicFramePr>
               <a:graphicFrameLocks xmlns:a="http://schemas.openxmlformats.org/drawingml/2006/main" noChangeAspect="1"/>
             </wp:cNvGraphicFramePr>
@@ -5327,13 +6143,13 @@
               <a:graphicData uri="http://schemas.openxmlformats.org/drawingml/2006/picture">
                 <pic:pic xmlns:pic="http://schemas.openxmlformats.org/drawingml/2006/picture">
                   <pic:nvPicPr>
-                    <pic:cNvPr id="57" name="Imagen58"/>
+                    <pic:cNvPr id="61" name="Imagen58"/>
                     <pic:cNvPicPr>
                       <a:picLocks noChangeAspect="1" noChangeArrowheads="1"/>
                     </pic:cNvPicPr>
                   </pic:nvPicPr>
                   <pic:blipFill>
-                    <a:blip r:embed="rId58"/>
+                    <a:blip r:embed="rId62"/>
                     <a:stretch>
                       <a:fillRect/>
                     </a:stretch>
@@ -5385,7 +6201,7 @@
           <wp:inline distT="0" distB="0" distL="0" distR="0">
             <wp:extent cx="2580005" cy="5743575"/>
             <wp:effectExtent l="0" t="0" r="0" b="0"/>
-            <wp:docPr id="58" name="Imagen59"/>
+            <wp:docPr id="62" name="Imagen59"/>
             <wp:cNvGraphicFramePr>
               <a:graphicFrameLocks xmlns:a="http://schemas.openxmlformats.org/drawingml/2006/main" noChangeAspect="1"/>
             </wp:cNvGraphicFramePr>
@@ -5393,13 +6209,13 @@
               <a:graphicData uri="http://schemas.openxmlformats.org/drawingml/2006/picture">
                 <pic:pic xmlns:pic="http://schemas.openxmlformats.org/drawingml/2006/picture">
                   <pic:nvPicPr>
-                    <pic:cNvPr id="58" name="Imagen59"/>
+                    <pic:cNvPr id="62" name="Imagen59"/>
                     <pic:cNvPicPr>
                       <a:picLocks noChangeAspect="1" noChangeArrowheads="1"/>
                     </pic:cNvPicPr>
                   </pic:nvPicPr>
                   <pic:blipFill>
-                    <a:blip r:embed="rId59"/>
+                    <a:blip r:embed="rId63"/>
                     <a:stretch>
                       <a:fillRect/>
                     </a:stretch>
@@ -5452,7 +6268,7 @@
           <wp:inline distT="0" distB="0" distL="0" distR="0">
             <wp:extent cx="3303270" cy="7353935"/>
             <wp:effectExtent l="0" t="0" r="0" b="0"/>
-            <wp:docPr id="59" name="Imagen60"/>
+            <wp:docPr id="63" name="Imagen60"/>
             <wp:cNvGraphicFramePr>
               <a:graphicFrameLocks xmlns:a="http://schemas.openxmlformats.org/drawingml/2006/main" noChangeAspect="1"/>
             </wp:cNvGraphicFramePr>
@@ -5460,13 +6276,13 @@
               <a:graphicData uri="http://schemas.openxmlformats.org/drawingml/2006/picture">
                 <pic:pic xmlns:pic="http://schemas.openxmlformats.org/drawingml/2006/picture">
                   <pic:nvPicPr>
-                    <pic:cNvPr id="59" name="Imagen60"/>
+                    <pic:cNvPr id="63" name="Imagen60"/>
                     <pic:cNvPicPr>
                       <a:picLocks noChangeAspect="1" noChangeArrowheads="1"/>
                     </pic:cNvPicPr>
                   </pic:nvPicPr>
                   <pic:blipFill>
-                    <a:blip r:embed="rId60"/>
+                    <a:blip r:embed="rId64"/>
                     <a:stretch>
                       <a:fillRect/>
                     </a:stretch>
@@ -5505,12 +6321,12 @@
       </w:r>
     </w:p>
     <w:sectPr>
-      <w:headerReference w:type="even" r:id="rId61"/>
-      <w:headerReference w:type="default" r:id="rId62"/>
-      <w:headerReference w:type="first" r:id="rId63"/>
-      <w:footerReference w:type="even" r:id="rId64"/>
-      <w:footerReference w:type="default" r:id="rId65"/>
-      <w:footerReference w:type="first" r:id="rId66"/>
+      <w:headerReference w:type="even" r:id="rId65"/>
+      <w:headerReference w:type="default" r:id="rId66"/>
+      <w:headerReference w:type="first" r:id="rId67"/>
+      <w:footerReference w:type="even" r:id="rId68"/>
+      <w:footerReference w:type="default" r:id="rId69"/>
+      <w:footerReference w:type="first" r:id="rId70"/>
       <w:type w:val="nextPage"/>
       <w:pgSz w:w="11906" w:h="16838"/>
       <w:pgMar w:left="1701" w:right="850" w:gutter="0" w:header="709" w:top="1134" w:footer="709" w:bottom="822"/>
@@ -5627,7 +6443,7 @@
     </w:r>
     <w:r>
       <w:rPr/>
-      <w:t>37</w:t>
+      <w:t>39</w:t>
     </w:r>
     <w:r>
       <w:rPr/>
@@ -6845,8 +7661,8 @@
       <w:szCs w:val="20"/>
     </w:rPr>
   </w:style>
-  <w:style w:type="character" w:styleId="Caracteresdenotaalpie">
-    <w:name w:val="Caracteres de nota al pie"/>
+  <w:style w:type="character" w:styleId="Caracteresdenotaalpieuser">
+    <w:name w:val="Caracteres de nota al pie (user)"/>
     <w:uiPriority w:val="99"/>
     <w:semiHidden/>
     <w:unhideWhenUsed/>
@@ -6855,8 +7671,8 @@
       <w:vertAlign w:val="superscript"/>
     </w:rPr>
   </w:style>
-  <w:style w:type="character" w:styleId="Caracteresdenotaalpieuser">
-    <w:name w:val="Caracteres de nota al pie (user)"/>
+  <w:style w:type="character" w:styleId="Caracteresdenotaalpie">
+    <w:name w:val="Caracteres de nota al pie"/>
     <w:qFormat/>
     <w:rPr>
       <w:vertAlign w:val="superscript"/>
@@ -6879,8 +7695,8 @@
       <w:szCs w:val="20"/>
     </w:rPr>
   </w:style>
-  <w:style w:type="character" w:styleId="Caracteresdenotafinal">
-    <w:name w:val="Caracteres de nota final"/>
+  <w:style w:type="character" w:styleId="Caracteresdenotafinaluser">
+    <w:name w:val="Caracteres de nota final (user)"/>
     <w:uiPriority w:val="99"/>
     <w:semiHidden/>
     <w:unhideWhenUsed/>
@@ -6889,8 +7705,8 @@
       <w:vertAlign w:val="superscript"/>
     </w:rPr>
   </w:style>
-  <w:style w:type="character" w:styleId="Caracteresdenotafinaluser">
-    <w:name w:val="Caracteres de nota final (user)"/>
+  <w:style w:type="character" w:styleId="Caracteresdenotafinal">
+    <w:name w:val="Caracteres de nota final"/>
     <w:qFormat/>
     <w:rPr>
       <w:vertAlign w:val="superscript"/>
@@ -7091,15 +7907,15 @@
       <w:color w:themeColor="accent1" w:themeShade="bf" w:val="0F4761"/>
     </w:rPr>
   </w:style>
-  <w:style w:type="paragraph" w:styleId="Cabeceraypie">
-    <w:name w:val="Cabecera y pie"/>
+  <w:style w:type="paragraph" w:styleId="Cabeceraypieuser">
+    <w:name w:val="Cabecera y pie (user)"/>
     <w:basedOn w:val="Normal"/>
     <w:qFormat/>
     <w:pPr/>
     <w:rPr/>
   </w:style>
-  <w:style w:type="paragraph" w:styleId="Cabeceraypieuser">
-    <w:name w:val="Cabecera y pie (user)"/>
+  <w:style w:type="paragraph" w:styleId="Cabeceraypie">
+    <w:name w:val="Cabecera y pie"/>
     <w:basedOn w:val="Normal"/>
     <w:qFormat/>
     <w:pPr/>
@@ -7276,7 +8092,7 @@
   </w:style>
   <w:style w:type="paragraph" w:styleId="IndexHeading">
     <w:name w:val="index heading"/>
-    <w:basedOn w:val="Ttulo"/>
+    <w:basedOn w:val="Ttulouser"/>
     <w:pPr/>
     <w:rPr/>
   </w:style>
@@ -7334,8 +8150,8 @@
     </w:pPr>
     <w:rPr/>
   </w:style>
-  <w:style w:type="numbering" w:styleId="Ningunalista" w:default="1">
-    <w:name w:val="Ninguna lista"/>
+  <w:style w:type="numbering" w:styleId="Ningunalistauser" w:default="1">
+    <w:name w:val="Ninguna lista (user)"/>
     <w:uiPriority w:val="99"/>
     <w:semiHidden/>
     <w:unhideWhenUsed/>

</xml_diff>

<commit_message>
Descarga el paquete al armar la huella y actualiza el manual de uso.
El operador recibe el zip en el momento de generarlo, y el manual incorpora el registro provisorio y el alcance de la cadena de custodia.

Co-authored-by: Cursor <cursoragent@cursor.com>
</commit_message>
<xml_diff>
--- a/docs/Manual-de-uso-SIGEVED.docx
+++ b/docs/Manual-de-uso-SIGEVED.docx
@@ -258,19 +258,7 @@
         <w:rPr>
           <w:lang w:val="es-AR" w:bidi="es-AR"/>
         </w:rPr>
-        <w:t>Dicho sistema se instala localmente en cada PC que se designe por dependencia, la cual establecerá una comunicación mediante servicios a los sistemas de gestión de expedientes judiciales. Esto hace que no exista error en la cargar, permitiendo al operador del sistema extraer evidencia únicamente en los expedientes y las dependencias ha</w:t>
-      </w:r>
-      <w:r>
-        <w:rPr>
-          <w:lang w:val="es-AR" w:bidi="es-AR"/>
-        </w:rPr>
-        <w:t>b</w:t>
-      </w:r>
-      <w:r>
-        <w:rPr>
-          <w:lang w:val="es-AR" w:bidi="es-AR"/>
-        </w:rPr>
-        <w:t>ilitadas.</w:t>
+        <w:t>Dicho sistema se instala localmente en cada PC que se designe por dependencia, la cual establecerá una comunicación mediante servicios a los sistemas de gestión de expedientes judiciales. Esto hace que no exista error en la cargar, permitiendo al operador del sistema extraer evidencia únicamente en los expedientes y las dependencias habilitadas.</w:t>
       </w:r>
     </w:p>
     <w:p>
@@ -468,43 +456,7 @@
         <w:rPr>
           <w:lang w:val="es-AR"/>
         </w:rPr>
-        <w:t xml:space="preserve">Luego se observan las dependencias habilitadas por </w:t>
-      </w:r>
-      <w:r>
-        <w:rPr>
-          <w:lang w:val="es-AR"/>
-        </w:rPr>
-        <w:t>los</w:t>
-      </w:r>
-      <w:r>
-        <w:rPr>
-          <w:lang w:val="es-AR"/>
-        </w:rPr>
-        <w:t xml:space="preserve"> </w:t>
-      </w:r>
-      <w:r>
-        <w:rPr>
-          <w:lang w:val="es-AR"/>
-        </w:rPr>
-        <w:t>S</w:t>
-      </w:r>
-      <w:r>
-        <w:rPr>
-          <w:lang w:val="es-AR"/>
-        </w:rPr>
-        <w:t>istema</w:t>
-      </w:r>
-      <w:r>
-        <w:rPr>
-          <w:lang w:val="es-AR"/>
-        </w:rPr>
-        <w:t>s de Gestión de Expedientes Digitales (SIGI / IURE)</w:t>
-      </w:r>
-      <w:r>
-        <w:rPr>
-          <w:lang w:val="es-AR"/>
-        </w:rPr>
-        <w:t>, en este caso, al ser una causa penal, el Sistema Integral de Gestión e Información -SIGI-  es el que habilitará las dependencias. Una vez habilitadas dichas dependencias, si son más de una, estarán en una lista desplegable, la cual el operador deberá seleccionar para comenzar a trabajar en ella.</w:t>
+        <w:t>Luego se observan las dependencias habilitadas por los Sistemas de Gestión de Expedientes Digitales (SIGI / IURE), en este caso, al ser una causa penal, el Sistema Integral de Gestión e Información -SIGI- es el que habilitará las dependencias. Una vez habilitadas dichas dependencias, si son más de una, estarán en una lista desplegable, la cual el operador deberá seleccionar para comenzar a trabajar en ella.</w:t>
       </w:r>
     </w:p>
     <w:p>
@@ -877,31 +829,7 @@
         <w:rPr>
           <w:lang w:val="es-AR"/>
         </w:rPr>
-        <w:t>Una vez presionado es</w:t>
-      </w:r>
-      <w:r>
-        <w:rPr>
-          <w:lang w:val="es-AR"/>
-        </w:rPr>
-        <w:t>a</w:t>
-      </w:r>
-      <w:r>
-        <w:rPr>
-          <w:lang w:val="es-AR"/>
-        </w:rPr>
-        <w:t xml:space="preserve"> </w:t>
-      </w:r>
-      <w:r>
-        <w:rPr>
-          <w:lang w:val="es-AR"/>
-        </w:rPr>
-        <w:t xml:space="preserve">opción, </w:t>
-      </w:r>
-      <w:r>
-        <w:rPr>
-          <w:lang w:val="es-AR"/>
-        </w:rPr>
-        <w:t>se abre un panel con los datos de la causa nueva:</w:t>
+        <w:t>Una vez presionado esa opción, se abre un panel con los datos de la causa nueva:</w:t>
       </w:r>
     </w:p>
     <w:p>
@@ -969,7 +897,7 @@
         <w:rPr>
           <w:lang w:val="es-AR"/>
         </w:rPr>
-        <w:t>Allí deberá ser cargados el número de expediente, respetando la numeración que utilizan los sistema de gestión de expedientes (numero/año-circunscripcion, Ej.:18317/2021-1), una vez cargado deberá presionar Consultar expediente. Esto inicia la consulta a los sistemas de gestión judicial, y si esta bien cargado el número de expediente, y éste existe en dichos sistemas, arrojará los datos pertinentes de la misma, como ser carátula y dependencia.</w:t>
+        <w:t>Allí deberá ser cargados el número de expediente, respetando la numeración que utilizan los sistema de gestión de expedientes (numero/año-circunscripción, Ej.:18317/2021-1), una vez cargado deberá presionar Consultar expediente. Esto inicia la consulta a los sistemas de gestión judicial, y si esta bien cargado el número de expediente, y éste existe en dichos sistemas, arrojará los datos pertinentes de la misma, como ser carátula y dependencia.</w:t>
       </w:r>
     </w:p>
     <w:p>
@@ -1155,19 +1083,7 @@
         <w:rPr>
           <w:lang w:val="es-AR"/>
         </w:rPr>
-        <w:t>Una vez creada la causa, pasamos a la pantalla donde se cargarán los datos del aportante</w:t>
-      </w:r>
-      <w:r>
-        <w:rPr>
-          <w:lang w:val="es-AR"/>
-        </w:rPr>
-        <w:t xml:space="preserve">. </w:t>
-      </w:r>
-      <w:r>
-        <w:rPr>
-          <w:lang w:val="es-AR"/>
-        </w:rPr>
-        <w:t>Si se hace clic en la opción “</w:t>
+        <w:t>Una vez creada la causa, pasamos a la pantalla donde se cargarán los datos del aportante. Si se hace clic en la opción “</w:t>
       </w:r>
       <w:r>
         <w:rPr>
@@ -1184,11 +1100,7 @@
       </w:r>
       <w:r>
         <w:rPr/>
-        <w:t xml:space="preserve">“, </w:t>
-      </w:r>
-      <w:r>
-        <w:rPr/>
-        <w:t>esto permitirá generar actas con datos anonimizados del aportante, en razón de haber éste solicitado expresamente que se traten sus datos personales con privacidad y evitar así su divulgación, quedando los mismos reservados bajo llave en caja fuerte de la dependencia judicial.</w:t>
+        <w:t>“, esto permitirá generar actas con datos anonimizados del aportante, en razón de haber éste solicitado expresamente que se traten sus datos personales con privacidad y evitar así su divulgación, quedando los mismos reservados bajo llave en caja fuerte de la dependencia judicial.</w:t>
       </w:r>
     </w:p>
     <w:p>
@@ -1308,55 +1220,7 @@
         <w:rPr>
           <w:lang w:val="es-AR"/>
         </w:rPr>
-        <w:t xml:space="preserve">Allí </w:t>
-      </w:r>
-      <w:r>
-        <w:rPr>
-          <w:lang w:val="es-AR"/>
-        </w:rPr>
-        <w:t>se deberán cargar</w:t>
-      </w:r>
-      <w:r>
-        <w:rPr>
-          <w:lang w:val="es-AR"/>
-        </w:rPr>
-        <w:t xml:space="preserve"> los datos </w:t>
-      </w:r>
-      <w:r>
-        <w:rPr>
-          <w:lang w:val="es-AR"/>
-        </w:rPr>
-        <w:t>de la persona aportante, solo son obligatorios el</w:t>
-      </w:r>
-      <w:r>
-        <w:rPr>
-          <w:lang w:val="es-AR"/>
-        </w:rPr>
-        <w:t xml:space="preserve"> nombre y apellido completo, </w:t>
-      </w:r>
-      <w:r>
-        <w:rPr>
-          <w:lang w:val="es-AR"/>
-        </w:rPr>
-        <w:t xml:space="preserve">número de </w:t>
-      </w:r>
-      <w:r>
-        <w:rPr>
-          <w:lang w:val="es-AR"/>
-        </w:rPr>
-        <w:t>DNI y carácter (</w:t>
-      </w:r>
-      <w:r>
-        <w:rPr>
-          <w:lang w:val="es-AR"/>
-        </w:rPr>
-        <w:t>aportante-testigo, aportante-imputado, aportante-menor</w:t>
-      </w:r>
-      <w:r>
-        <w:rPr>
-          <w:lang w:val="es-AR"/>
-        </w:rPr>
-        <w:t>).</w:t>
+        <w:t>Allí se deberán cargar los datos de la persona aportante, solo son obligatorios el nombre y apellido completo, número de DNI y carácter (aportante-testigo, aportante-imputado, aportante-menor).</w:t>
       </w:r>
     </w:p>
     <w:p>
@@ -1391,31 +1255,7 @@
         <w:rPr>
           <w:lang w:val="es-AR"/>
         </w:rPr>
-        <w:t>L</w:t>
-      </w:r>
-      <w:r>
-        <w:rPr>
-          <w:lang w:val="es-AR"/>
-        </w:rPr>
-        <w:t xml:space="preserve">uego el sistema prevé la carga de la foto del aportante, </w:t>
-      </w:r>
-      <w:r>
-        <w:rPr>
-          <w:lang w:val="es-AR"/>
-        </w:rPr>
-        <w:t>esto es opcional, si se tiene el documento a mano</w:t>
-      </w:r>
-      <w:r>
-        <w:rPr>
-          <w:lang w:val="es-AR"/>
-        </w:rPr>
-        <w:t xml:space="preserve">. </w:t>
-      </w:r>
-      <w:r>
-        <w:rPr>
-          <w:lang w:val="es-AR"/>
-        </w:rPr>
-        <w:t>En caso de que no se tenga el DNI, se debe tildar la opción “Continuar sin la foto del aportante”, se continua con el guardado de los datos del aportante, donde se deberá justificar porque no se tiene el documento consigo (por pérdida, robo, incendio, etc.).</w:t>
+        <w:t>Luego el sistema prevé la carga de la foto del aportante, esto es opcional, si se tiene el documento a mano. En caso de que no se tenga el DNI, se debe tildar la opción “Continuar sin la foto del aportante”, se continua con el guardado de los datos del aportante, donde se deberá justificar porque no se tiene el documento consigo (por pérdida, robo, incendio, etc.).</w:t>
       </w:r>
     </w:p>
     <w:p>
@@ -1506,13 +1346,7 @@
         <w:rPr>
           <w:lang w:val="es-AR"/>
         </w:rPr>
-        <w:t>E</w:t>
-      </w:r>
-      <w:r>
-        <w:rPr>
-          <w:lang w:val="es-AR"/>
-        </w:rPr>
-        <w:t>n la PC operadora se cuente con la foto del frente del documento nacional de identidad, o en su defecto, al presionar “Sacar foto”, active la cámara del dispositivo móvil conectado a la PC, donde luego de capturar la foto del frente del documento, el cual debe estar bien centrado y nítido, esta es enviada a la aplicación:</w:t>
+        <w:t>En la PC operadora se cuente con la foto del frente del documento nacional de identidad, o en su defecto, al presionar “Sacar foto”, active la cámara del dispositivo móvil conectado a la PC, donde luego de capturar la foto del frente del documento, el cual debe estar bien centrado y nítido, esta es enviada a la aplicación:</w:t>
       </w:r>
     </w:p>
     <w:p>
@@ -1849,7 +1683,6 @@
         <w:rPr>
           <w:sz w:val="18"/>
           <w:szCs w:val="18"/>
-          <w:lang w:val="es-AR"/>
         </w:rPr>
       </w:r>
     </w:p>
@@ -1866,7 +1699,6 @@
         <w:rPr>
           <w:sz w:val="18"/>
           <w:szCs w:val="18"/>
-          <w:lang w:val="es-AR"/>
         </w:rPr>
       </w:r>
     </w:p>
@@ -1883,7 +1715,6 @@
         <w:rPr>
           <w:sz w:val="18"/>
           <w:szCs w:val="18"/>
-          <w:lang w:val="es-AR"/>
         </w:rPr>
       </w:r>
     </w:p>
@@ -1900,7 +1731,6 @@
         <w:rPr>
           <w:sz w:val="18"/>
           <w:szCs w:val="18"/>
-          <w:lang w:val="es-AR"/>
         </w:rPr>
       </w:r>
     </w:p>
@@ -1917,7 +1747,6 @@
         <w:rPr>
           <w:sz w:val="18"/>
           <w:szCs w:val="18"/>
-          <w:lang w:val="es-AR"/>
         </w:rPr>
       </w:r>
     </w:p>
@@ -1934,7 +1763,6 @@
         <w:rPr>
           <w:sz w:val="18"/>
           <w:szCs w:val="18"/>
-          <w:lang w:val="es-AR"/>
         </w:rPr>
       </w:r>
     </w:p>
@@ -1951,7 +1779,6 @@
         <w:rPr>
           <w:sz w:val="18"/>
           <w:szCs w:val="18"/>
-          <w:lang w:val="es-AR"/>
         </w:rPr>
       </w:r>
     </w:p>
@@ -1968,7 +1795,6 @@
         <w:rPr>
           <w:sz w:val="18"/>
           <w:szCs w:val="18"/>
-          <w:lang w:val="es-AR"/>
         </w:rPr>
       </w:r>
     </w:p>
@@ -1985,7 +1811,6 @@
         <w:rPr>
           <w:sz w:val="18"/>
           <w:szCs w:val="18"/>
-          <w:lang w:val="es-AR"/>
         </w:rPr>
       </w:r>
     </w:p>
@@ -2002,7 +1827,6 @@
         <w:rPr>
           <w:sz w:val="18"/>
           <w:szCs w:val="18"/>
-          <w:lang w:val="es-AR"/>
         </w:rPr>
       </w:r>
     </w:p>
@@ -7661,8 +7485,8 @@
       <w:szCs w:val="20"/>
     </w:rPr>
   </w:style>
-  <w:style w:type="character" w:styleId="Caracteresdenotaalpieuser">
-    <w:name w:val="Caracteres de nota al pie (user)"/>
+  <w:style w:type="character" w:styleId="Caracteresdenotaalpie">
+    <w:name w:val="Caracteres de nota al pie"/>
     <w:uiPriority w:val="99"/>
     <w:semiHidden/>
     <w:unhideWhenUsed/>
@@ -7671,8 +7495,8 @@
       <w:vertAlign w:val="superscript"/>
     </w:rPr>
   </w:style>
-  <w:style w:type="character" w:styleId="Caracteresdenotaalpie">
-    <w:name w:val="Caracteres de nota al pie"/>
+  <w:style w:type="character" w:styleId="Caracteresdenotaalpieuser">
+    <w:name w:val="Caracteres de nota al pie (user)"/>
     <w:qFormat/>
     <w:rPr>
       <w:vertAlign w:val="superscript"/>
@@ -7695,8 +7519,8 @@
       <w:szCs w:val="20"/>
     </w:rPr>
   </w:style>
-  <w:style w:type="character" w:styleId="Caracteresdenotafinaluser">
-    <w:name w:val="Caracteres de nota final (user)"/>
+  <w:style w:type="character" w:styleId="Caracteresdenotafinal">
+    <w:name w:val="Caracteres de nota final"/>
     <w:uiPriority w:val="99"/>
     <w:semiHidden/>
     <w:unhideWhenUsed/>
@@ -7705,8 +7529,8 @@
       <w:vertAlign w:val="superscript"/>
     </w:rPr>
   </w:style>
-  <w:style w:type="character" w:styleId="Caracteresdenotafinal">
-    <w:name w:val="Caracteres de nota final"/>
+  <w:style w:type="character" w:styleId="Caracteresdenotafinaluser">
+    <w:name w:val="Caracteres de nota final (user)"/>
     <w:qFormat/>
     <w:rPr>
       <w:vertAlign w:val="superscript"/>
@@ -7907,15 +7731,15 @@
       <w:color w:themeColor="accent1" w:themeShade="bf" w:val="0F4761"/>
     </w:rPr>
   </w:style>
-  <w:style w:type="paragraph" w:styleId="Cabeceraypieuser">
-    <w:name w:val="Cabecera y pie (user)"/>
+  <w:style w:type="paragraph" w:styleId="Cabeceraypie">
+    <w:name w:val="Cabecera y pie"/>
     <w:basedOn w:val="Normal"/>
     <w:qFormat/>
     <w:pPr/>
     <w:rPr/>
   </w:style>
-  <w:style w:type="paragraph" w:styleId="Cabeceraypie">
-    <w:name w:val="Cabecera y pie"/>
+  <w:style w:type="paragraph" w:styleId="Cabeceraypieuser">
+    <w:name w:val="Cabecera y pie (user)"/>
     <w:basedOn w:val="Normal"/>
     <w:qFormat/>
     <w:pPr/>
@@ -8092,7 +7916,7 @@
   </w:style>
   <w:style w:type="paragraph" w:styleId="IndexHeading">
     <w:name w:val="index heading"/>
-    <w:basedOn w:val="Ttulouser"/>
+    <w:basedOn w:val="Ttulo"/>
     <w:pPr/>
     <w:rPr/>
   </w:style>
@@ -8150,8 +7974,8 @@
     </w:pPr>
     <w:rPr/>
   </w:style>
-  <w:style w:type="numbering" w:styleId="Ningunalistauser" w:default="1">
-    <w:name w:val="Ninguna lista (user)"/>
+  <w:style w:type="numbering" w:styleId="Ningunalista" w:default="1">
+    <w:name w:val="Ninguna lista"/>
     <w:uiPriority w:val="99"/>
     <w:semiHidden/>
     <w:unhideWhenUsed/>

</xml_diff>